<commit_message>
acoustic space figure and results updates
Updated figure, rewrote figure caption and results section,
</commit_message>
<xml_diff>
--- a/paRsynth_methods_draft_BAC_SGE.docx
+++ b/paRsynth_methods_draft_BAC_SGE.docx
@@ -5104,17 +5104,15 @@
         </w:rPr>
       </w:pPr>
       <w:commentRangeStart w:id="45"/>
-      <w:commentRangeStart w:id="46"/>
-      <w:r>
-        <w:rPr>
-          <w:rFonts w:ascii="Arial" w:hAnsi="Arial" w:cs="Arial"/>
+      <w:r>
+        <w:rPr>
           <w:noProof/>
         </w:rPr>
         <w:drawing>
-          <wp:inline distT="0" distB="0" distL="0" distR="0" wp14:anchorId="13AC1462" wp14:editId="4C503ECC">
-            <wp:extent cx="6512913" cy="3663950"/>
-            <wp:effectExtent l="0" t="0" r="2540" b="0"/>
-            <wp:docPr id="1410616909" name="Picture 2"/>
+          <wp:inline distT="0" distB="0" distL="0" distR="0" wp14:anchorId="5A2BE49C" wp14:editId="4E07313E">
+            <wp:extent cx="5943600" cy="3343275"/>
+            <wp:effectExtent l="0" t="0" r="0" b="9525"/>
+            <wp:docPr id="156697742" name="Picture 1" descr="A collage of multiple images of data&#10;&#10;Description automatically generated"/>
             <wp:cNvGraphicFramePr>
               <a:graphicFrameLocks xmlns:a="http://schemas.openxmlformats.org/drawingml/2006/main" noChangeAspect="1"/>
             </wp:cNvGraphicFramePr>
@@ -5122,7 +5120,7 @@
               <a:graphicData uri="http://schemas.openxmlformats.org/drawingml/2006/picture">
                 <pic:pic xmlns:pic="http://schemas.openxmlformats.org/drawingml/2006/picture">
                   <pic:nvPicPr>
-                    <pic:cNvPr id="0" name="Picture 2"/>
+                    <pic:cNvPr id="156697742" name="Picture 1" descr="A collage of multiple images of data&#10;&#10;Description automatically generated"/>
                     <pic:cNvPicPr>
                       <a:picLocks noChangeAspect="1" noChangeArrowheads="1"/>
                     </pic:cNvPicPr>
@@ -5143,7 +5141,7 @@
                   <pic:spPr bwMode="auto">
                     <a:xfrm>
                       <a:off x="0" y="0"/>
-                      <a:ext cx="6522883" cy="3669559"/>
+                      <a:ext cx="5943600" cy="3343275"/>
                     </a:xfrm>
                     <a:prstGeom prst="rect">
                       <a:avLst/>
@@ -5166,13 +5164,6 @@
         </w:rPr>
         <w:commentReference w:id="45"/>
       </w:r>
-      <w:commentRangeEnd w:id="46"/>
-      <w:r>
-        <w:rPr>
-          <w:rStyle w:val="CommentReference"/>
-        </w:rPr>
-        <w:commentReference w:id="46"/>
-      </w:r>
     </w:p>
     <w:p>
       <w:pPr>
@@ -5183,7 +5174,7 @@
           <w:szCs w:val="20"/>
         </w:rPr>
       </w:pPr>
-      <w:commentRangeStart w:id="47"/>
+      <w:commentRangeStart w:id="46"/>
       <w:r>
         <w:rPr>
           <w:rFonts w:ascii="Arial" w:hAnsi="Arial" w:cs="Arial"/>
@@ -5202,12 +5193,12 @@
         </w:rPr>
         <w:t xml:space="preserve"> </w:t>
       </w:r>
-      <w:commentRangeEnd w:id="47"/>
+      <w:commentRangeEnd w:id="46"/>
       <w:r>
         <w:rPr>
           <w:rStyle w:val="CommentReference"/>
         </w:rPr>
-        <w:commentReference w:id="47"/>
+        <w:commentReference w:id="46"/>
       </w:r>
       <w:r>
         <w:rPr>
@@ -5240,47 +5231,6 @@
           <w:szCs w:val="20"/>
         </w:rPr>
         <w:t xml:space="preserve">different levels of encoded information: </w:t>
-      </w:r>
-      <w:r>
-        <w:rPr>
-          <w:rFonts w:ascii="Arial" w:hAnsi="Arial" w:cs="Arial"/>
-          <w:sz w:val="20"/>
-          <w:szCs w:val="20"/>
-        </w:rPr>
-        <w:t>more group membership information encoded in the calls</w:t>
-      </w:r>
-      <w:r>
-        <w:rPr>
-          <w:rFonts w:ascii="Arial" w:hAnsi="Arial" w:cs="Arial"/>
-          <w:sz w:val="20"/>
-          <w:szCs w:val="20"/>
-        </w:rPr>
-        <w:t xml:space="preserve"> with polygons </w:t>
-      </w:r>
-      <w:r>
-        <w:rPr>
-          <w:rFonts w:ascii="Arial" w:hAnsi="Arial" w:cs="Arial"/>
-          <w:sz w:val="20"/>
-          <w:szCs w:val="20"/>
-        </w:rPr>
-        <w:t>drawn</w:t>
-      </w:r>
-      <w:r>
-        <w:rPr>
-          <w:rFonts w:ascii="Arial" w:hAnsi="Arial" w:cs="Arial"/>
-          <w:sz w:val="20"/>
-          <w:szCs w:val="20"/>
-        </w:rPr>
-        <w:t xml:space="preserve"> by group </w:t>
-      </w:r>
-      <w:r>
-        <w:rPr>
-          <w:rFonts w:ascii="Arial" w:hAnsi="Arial" w:cs="Arial"/>
-          <w:sz w:val="20"/>
-          <w:szCs w:val="20"/>
-        </w:rPr>
-        <w:lastRenderedPageBreak/>
-        <w:t xml:space="preserve">identity </w:t>
       </w:r>
       <w:r>
         <w:rPr>
@@ -5295,76 +5245,12 @@
       <w:r>
         <w:rPr>
           <w:rFonts w:ascii="Arial" w:hAnsi="Arial" w:cs="Arial"/>
-          <w:sz w:val="20"/>
-          <w:szCs w:val="20"/>
-        </w:rPr>
-        <w:t xml:space="preserve">, </w:t>
-      </w:r>
-      <w:r>
-        <w:rPr>
-          <w:rFonts w:ascii="Arial" w:hAnsi="Arial" w:cs="Arial"/>
-          <w:sz w:val="20"/>
-          <w:szCs w:val="20"/>
-        </w:rPr>
-        <w:t xml:space="preserve">more group membership information </w:t>
-      </w:r>
-      <w:r>
-        <w:rPr>
-          <w:rFonts w:ascii="Arial" w:hAnsi="Arial" w:cs="Arial"/>
-          <w:sz w:val="20"/>
-          <w:szCs w:val="20"/>
-        </w:rPr>
-        <w:t xml:space="preserve">encoded in the calls </w:t>
-      </w:r>
-      <w:r>
-        <w:rPr>
-          <w:rFonts w:ascii="Arial" w:hAnsi="Arial" w:cs="Arial"/>
-          <w:sz w:val="20"/>
-          <w:szCs w:val="20"/>
-        </w:rPr>
-        <w:t xml:space="preserve">with polygons </w:t>
-      </w:r>
-      <w:r>
-        <w:rPr>
-          <w:rFonts w:ascii="Arial" w:hAnsi="Arial" w:cs="Arial"/>
-          <w:sz w:val="20"/>
-          <w:szCs w:val="20"/>
-        </w:rPr>
-        <w:t>drawn</w:t>
-      </w:r>
-      <w:r>
-        <w:rPr>
-          <w:rFonts w:ascii="Arial" w:hAnsi="Arial" w:cs="Arial"/>
-          <w:sz w:val="20"/>
-          <w:szCs w:val="20"/>
-        </w:rPr>
-        <w:t xml:space="preserve"> by individual</w:t>
-      </w:r>
-      <w:r>
-        <w:rPr>
-          <w:rFonts w:ascii="Arial" w:hAnsi="Arial" w:cs="Arial"/>
-          <w:sz w:val="20"/>
-          <w:szCs w:val="20"/>
-        </w:rPr>
-        <w:t xml:space="preserve"> identity</w:t>
-      </w:r>
-      <w:r>
-        <w:rPr>
-          <w:rFonts w:ascii="Arial" w:hAnsi="Arial" w:cs="Arial"/>
-          <w:sz w:val="20"/>
-          <w:szCs w:val="20"/>
-        </w:rPr>
-        <w:t xml:space="preserve"> </w:t>
-      </w:r>
-      <w:r>
-        <w:rPr>
-          <w:rFonts w:ascii="Arial" w:hAnsi="Arial" w:cs="Arial"/>
           <w:b/>
           <w:bCs/>
           <w:sz w:val="20"/>
           <w:szCs w:val="20"/>
         </w:rPr>
-        <w:t>(B)</w:t>
+        <w:t xml:space="preserve"> </w:t>
       </w:r>
       <w:r>
         <w:rPr>
@@ -5372,7 +5258,7 @@
           <w:sz w:val="20"/>
           <w:szCs w:val="20"/>
         </w:rPr>
-        <w:t>,</w:t>
+        <w:t>more group membership information encoded in the calls</w:t>
       </w:r>
       <w:r>
         <w:rPr>
@@ -5380,7 +5266,7 @@
           <w:sz w:val="20"/>
           <w:szCs w:val="20"/>
         </w:rPr>
-        <w:t xml:space="preserve"> more individual information encoded in the calls with polygons </w:t>
+        <w:t xml:space="preserve"> with polygons </w:t>
       </w:r>
       <w:r>
         <w:rPr>
@@ -5396,7 +5282,7 @@
           <w:sz w:val="20"/>
           <w:szCs w:val="20"/>
         </w:rPr>
-        <w:t xml:space="preserve"> by group</w:t>
+        <w:t xml:space="preserve"> by group </w:t>
       </w:r>
       <w:r>
         <w:rPr>
@@ -5404,7 +5290,15 @@
           <w:sz w:val="20"/>
           <w:szCs w:val="20"/>
         </w:rPr>
-        <w:t xml:space="preserve"> identity </w:t>
+        <w:t>identity</w:t>
+      </w:r>
+      <w:r>
+        <w:rPr>
+          <w:rFonts w:ascii="Arial" w:hAnsi="Arial" w:cs="Arial"/>
+          <w:sz w:val="20"/>
+          <w:szCs w:val="20"/>
+        </w:rPr>
+        <w:t xml:space="preserve">, </w:t>
       </w:r>
       <w:r>
         <w:rPr>
@@ -5414,31 +5308,7 @@
           <w:sz w:val="20"/>
           <w:szCs w:val="20"/>
         </w:rPr>
-        <w:t>(C)</w:t>
-      </w:r>
-      <w:r>
-        <w:rPr>
-          <w:rFonts w:ascii="Arial" w:hAnsi="Arial" w:cs="Arial"/>
-          <w:sz w:val="20"/>
-          <w:szCs w:val="20"/>
-        </w:rPr>
-        <w:t xml:space="preserve">, and more individual information encoded in the calls with polygons </w:t>
-      </w:r>
-      <w:r>
-        <w:rPr>
-          <w:rFonts w:ascii="Arial" w:hAnsi="Arial" w:cs="Arial"/>
-          <w:sz w:val="20"/>
-          <w:szCs w:val="20"/>
-        </w:rPr>
-        <w:t>drawn</w:t>
-      </w:r>
-      <w:r>
-        <w:rPr>
-          <w:rFonts w:ascii="Arial" w:hAnsi="Arial" w:cs="Arial"/>
-          <w:sz w:val="20"/>
-          <w:szCs w:val="20"/>
-        </w:rPr>
-        <w:t xml:space="preserve"> by individual identity </w:t>
+        <w:t>(B)</w:t>
       </w:r>
       <w:r>
         <w:rPr>
@@ -5448,7 +5318,7 @@
           <w:sz w:val="20"/>
           <w:szCs w:val="20"/>
         </w:rPr>
-        <w:t>(D)</w:t>
+        <w:t xml:space="preserve"> </w:t>
       </w:r>
       <w:r>
         <w:rPr>
@@ -5456,17 +5326,204 @@
           <w:sz w:val="20"/>
           <w:szCs w:val="20"/>
         </w:rPr>
-        <w:t xml:space="preserve">. </w:t>
-      </w:r>
-    </w:p>
-    <w:p>
-      <w:pPr>
-        <w:spacing w:line="360" w:lineRule="auto"/>
+        <w:t xml:space="preserve">more group membership information </w:t>
+      </w:r>
+      <w:r>
         <w:rPr>
           <w:rFonts w:ascii="Arial" w:hAnsi="Arial" w:cs="Arial"/>
           <w:sz w:val="20"/>
           <w:szCs w:val="20"/>
         </w:rPr>
+        <w:t xml:space="preserve">encoded in the calls </w:t>
+      </w:r>
+      <w:r>
+        <w:rPr>
+          <w:rFonts w:ascii="Arial" w:hAnsi="Arial" w:cs="Arial"/>
+          <w:sz w:val="20"/>
+          <w:szCs w:val="20"/>
+        </w:rPr>
+        <w:t xml:space="preserve">with polygons </w:t>
+      </w:r>
+      <w:r>
+        <w:rPr>
+          <w:rFonts w:ascii="Arial" w:hAnsi="Arial" w:cs="Arial"/>
+          <w:sz w:val="20"/>
+          <w:szCs w:val="20"/>
+        </w:rPr>
+        <w:t>drawn</w:t>
+      </w:r>
+      <w:r>
+        <w:rPr>
+          <w:rFonts w:ascii="Arial" w:hAnsi="Arial" w:cs="Arial"/>
+          <w:sz w:val="20"/>
+          <w:szCs w:val="20"/>
+        </w:rPr>
+        <w:t xml:space="preserve"> by individual</w:t>
+      </w:r>
+      <w:r>
+        <w:rPr>
+          <w:rFonts w:ascii="Arial" w:hAnsi="Arial" w:cs="Arial"/>
+          <w:sz w:val="20"/>
+          <w:szCs w:val="20"/>
+        </w:rPr>
+        <w:t xml:space="preserve"> identity</w:t>
+      </w:r>
+      <w:r>
+        <w:rPr>
+          <w:rFonts w:ascii="Arial" w:hAnsi="Arial" w:cs="Arial"/>
+          <w:sz w:val="20"/>
+          <w:szCs w:val="20"/>
+        </w:rPr>
+        <w:t>,</w:t>
+      </w:r>
+      <w:r>
+        <w:rPr>
+          <w:rFonts w:ascii="Arial" w:hAnsi="Arial" w:cs="Arial"/>
+          <w:sz w:val="20"/>
+          <w:szCs w:val="20"/>
+        </w:rPr>
+        <w:t xml:space="preserve"> </w:t>
+      </w:r>
+      <w:r>
+        <w:rPr>
+          <w:rFonts w:ascii="Arial" w:hAnsi="Arial" w:cs="Arial"/>
+          <w:b/>
+          <w:bCs/>
+          <w:sz w:val="20"/>
+          <w:szCs w:val="20"/>
+        </w:rPr>
+        <w:t>(C)</w:t>
+      </w:r>
+      <w:r>
+        <w:rPr>
+          <w:rFonts w:ascii="Arial" w:hAnsi="Arial" w:cs="Arial"/>
+          <w:b/>
+          <w:bCs/>
+          <w:sz w:val="20"/>
+          <w:szCs w:val="20"/>
+        </w:rPr>
+        <w:t xml:space="preserve"> </w:t>
+      </w:r>
+      <w:r>
+        <w:rPr>
+          <w:rFonts w:ascii="Arial" w:hAnsi="Arial" w:cs="Arial"/>
+          <w:sz w:val="20"/>
+          <w:szCs w:val="20"/>
+        </w:rPr>
+        <w:t xml:space="preserve">more individual information encoded in the calls with polygons </w:t>
+      </w:r>
+      <w:r>
+        <w:rPr>
+          <w:rFonts w:ascii="Arial" w:hAnsi="Arial" w:cs="Arial"/>
+          <w:sz w:val="20"/>
+          <w:szCs w:val="20"/>
+        </w:rPr>
+        <w:t>drawn</w:t>
+      </w:r>
+      <w:r>
+        <w:rPr>
+          <w:rFonts w:ascii="Arial" w:hAnsi="Arial" w:cs="Arial"/>
+          <w:sz w:val="20"/>
+          <w:szCs w:val="20"/>
+        </w:rPr>
+        <w:t xml:space="preserve"> by group</w:t>
+      </w:r>
+      <w:r>
+        <w:rPr>
+          <w:rFonts w:ascii="Arial" w:hAnsi="Arial" w:cs="Arial"/>
+          <w:sz w:val="20"/>
+          <w:szCs w:val="20"/>
+        </w:rPr>
+        <w:t xml:space="preserve"> identity, and </w:t>
+      </w:r>
+      <w:r>
+        <w:rPr>
+          <w:rFonts w:ascii="Arial" w:hAnsi="Arial" w:cs="Arial"/>
+          <w:b/>
+          <w:bCs/>
+          <w:sz w:val="20"/>
+          <w:szCs w:val="20"/>
+        </w:rPr>
+        <w:lastRenderedPageBreak/>
+        <w:t>(D)</w:t>
+      </w:r>
+      <w:r>
+        <w:rPr>
+          <w:rFonts w:ascii="Arial" w:hAnsi="Arial" w:cs="Arial"/>
+          <w:b/>
+          <w:bCs/>
+          <w:sz w:val="20"/>
+          <w:szCs w:val="20"/>
+        </w:rPr>
+        <w:t xml:space="preserve"> </w:t>
+      </w:r>
+      <w:r>
+        <w:rPr>
+          <w:rFonts w:ascii="Arial" w:hAnsi="Arial" w:cs="Arial"/>
+          <w:sz w:val="20"/>
+          <w:szCs w:val="20"/>
+        </w:rPr>
+        <w:t xml:space="preserve">more individual information encoded in the calls with polygons </w:t>
+      </w:r>
+      <w:r>
+        <w:rPr>
+          <w:rFonts w:ascii="Arial" w:hAnsi="Arial" w:cs="Arial"/>
+          <w:sz w:val="20"/>
+          <w:szCs w:val="20"/>
+        </w:rPr>
+        <w:t>drawn</w:t>
+      </w:r>
+      <w:r>
+        <w:rPr>
+          <w:rFonts w:ascii="Arial" w:hAnsi="Arial" w:cs="Arial"/>
+          <w:sz w:val="20"/>
+          <w:szCs w:val="20"/>
+        </w:rPr>
+        <w:t xml:space="preserve"> by individual identity.</w:t>
+      </w:r>
+      <w:r>
+        <w:rPr>
+          <w:rFonts w:ascii="Arial" w:hAnsi="Arial" w:cs="Arial"/>
+          <w:sz w:val="20"/>
+          <w:szCs w:val="20"/>
+        </w:rPr>
+        <w:t xml:space="preserve"> Colors represent original group </w:t>
+      </w:r>
+      <w:proofErr w:type="gramStart"/>
+      <w:r>
+        <w:rPr>
+          <w:rFonts w:ascii="Arial" w:hAnsi="Arial" w:cs="Arial"/>
+          <w:sz w:val="20"/>
+          <w:szCs w:val="20"/>
+        </w:rPr>
+        <w:t>identity,</w:t>
+      </w:r>
+      <w:proofErr w:type="gramEnd"/>
+      <w:r>
+        <w:rPr>
+          <w:rFonts w:ascii="Arial" w:hAnsi="Arial" w:cs="Arial"/>
+          <w:sz w:val="20"/>
+          <w:szCs w:val="20"/>
+        </w:rPr>
+        <w:t xml:space="preserve"> shapes represent </w:t>
+      </w:r>
+      <w:r>
+        <w:rPr>
+          <w:rFonts w:ascii="Arial" w:hAnsi="Arial" w:cs="Arial"/>
+          <w:sz w:val="20"/>
+          <w:szCs w:val="20"/>
+        </w:rPr>
+        <w:t>different individuals.</w:t>
+      </w:r>
+    </w:p>
+    <w:p>
+      <w:pPr>
+        <w:spacing w:line="360" w:lineRule="auto"/>
+        <w:rPr>
+          <w:rFonts w:ascii="Arial" w:hAnsi="Arial" w:cs="Arial"/>
+          <w:sz w:val="20"/>
+          <w:szCs w:val="20"/>
+        </w:rPr>
       </w:pPr>
     </w:p>
     <w:p>
@@ -5506,91 +5563,19 @@
         <w:rPr>
           <w:rFonts w:ascii="Arial" w:hAnsi="Arial" w:cs="Arial"/>
         </w:rPr>
-        <w:t>Two datasets were created: one with individuals</w:t>
-      </w:r>
-      <w:r>
-        <w:rPr>
-          <w:rFonts w:ascii="Arial" w:hAnsi="Arial" w:cs="Arial"/>
-        </w:rPr>
-        <w:t>’ signals</w:t>
-      </w:r>
-      <w:r>
-        <w:rPr>
-          <w:rFonts w:ascii="Arial" w:hAnsi="Arial" w:cs="Arial"/>
-        </w:rPr>
-        <w:t xml:space="preserve"> containing more </w:t>
-      </w:r>
-      <w:r>
-        <w:rPr>
-          <w:rFonts w:ascii="Arial" w:hAnsi="Arial" w:cs="Arial"/>
-        </w:rPr>
-        <w:t>group membership information than i</w:t>
-      </w:r>
-      <w:r>
-        <w:rPr>
-          <w:rFonts w:ascii="Arial" w:hAnsi="Arial" w:cs="Arial"/>
-        </w:rPr>
-        <w:t xml:space="preserve">ndividual identity information, and the other with </w:t>
-      </w:r>
-      <w:r>
-        <w:rPr>
-          <w:rFonts w:ascii="Arial" w:hAnsi="Arial" w:cs="Arial"/>
-        </w:rPr>
-        <w:t>individual</w:t>
-      </w:r>
-      <w:r>
-        <w:rPr>
-          <w:rFonts w:ascii="Arial" w:hAnsi="Arial" w:cs="Arial"/>
-        </w:rPr>
-        <w:t>s</w:t>
-      </w:r>
-      <w:r>
-        <w:rPr>
-          <w:rFonts w:ascii="Arial" w:hAnsi="Arial" w:cs="Arial"/>
-        </w:rPr>
-        <w:t>’ signals</w:t>
-      </w:r>
-      <w:r>
-        <w:rPr>
-          <w:rFonts w:ascii="Arial" w:hAnsi="Arial" w:cs="Arial"/>
-        </w:rPr>
-        <w:t xml:space="preserve"> containing </w:t>
-      </w:r>
-      <w:r>
-        <w:rPr>
-          <w:rFonts w:ascii="Arial" w:hAnsi="Arial" w:cs="Arial"/>
-        </w:rPr>
-        <w:t>more individual identity information than group membership information.</w:t>
-      </w:r>
-      <w:r>
-        <w:rPr>
-          <w:rFonts w:ascii="Arial" w:hAnsi="Arial" w:cs="Arial"/>
-        </w:rPr>
-        <w:t xml:space="preserve"> </w:t>
-      </w:r>
-      <w:r>
-        <w:rPr>
-          <w:rFonts w:ascii="Arial" w:hAnsi="Arial" w:cs="Arial"/>
-        </w:rPr>
-        <w:t xml:space="preserve">Acoustic space plots </w:t>
-      </w:r>
-      <w:r>
-        <w:rPr>
-          <w:rFonts w:ascii="Arial" w:hAnsi="Arial" w:cs="Arial"/>
-        </w:rPr>
-        <w:t xml:space="preserve">were </w:t>
-      </w:r>
-      <w:r>
-        <w:rPr>
-          <w:rFonts w:ascii="Arial" w:hAnsi="Arial" w:cs="Arial"/>
-        </w:rPr>
-        <w:t>generated</w:t>
-      </w:r>
-      <w:r>
-        <w:rPr>
-          <w:rFonts w:ascii="Arial" w:hAnsi="Arial" w:cs="Arial"/>
-        </w:rPr>
-        <w:t xml:space="preserve"> using multidimensional </w:t>
+        <w:t>We generated a</w:t>
+      </w:r>
+      <w:r>
+        <w:rPr>
+          <w:rFonts w:ascii="Arial" w:hAnsi="Arial" w:cs="Arial"/>
+        </w:rPr>
+        <w:t xml:space="preserve">coustic space plots </w:t>
+      </w:r>
+      <w:r>
+        <w:rPr>
+          <w:rFonts w:ascii="Arial" w:hAnsi="Arial" w:cs="Arial"/>
+        </w:rPr>
+        <w:t xml:space="preserve">using multidimensional </w:t>
       </w:r>
       <w:r>
         <w:rPr>
@@ -5682,27 +5667,55 @@
         <w:rPr>
           <w:rFonts w:ascii="Arial" w:hAnsi="Arial" w:cs="Arial"/>
         </w:rPr>
-        <w:t xml:space="preserve">, </w:t>
-      </w:r>
-      <w:commentRangeStart w:id="48"/>
-      <w:r>
-        <w:rPr>
-          <w:rFonts w:ascii="Arial" w:hAnsi="Arial" w:cs="Arial"/>
-        </w:rPr>
-        <w:t>suggesting acoustic convergence within groups</w:t>
-      </w:r>
-      <w:commentRangeEnd w:id="48"/>
-      <w:r>
-        <w:rPr>
-          <w:rStyle w:val="CommentReference"/>
-        </w:rPr>
-        <w:commentReference w:id="48"/>
-      </w:r>
-      <w:r>
-        <w:rPr>
-          <w:rFonts w:ascii="Arial" w:hAnsi="Arial" w:cs="Arial"/>
-        </w:rPr>
-        <w:t xml:space="preserve">. </w:t>
+        <w:t>.</w:t>
+      </w:r>
+      <w:r>
+        <w:rPr>
+          <w:rFonts w:ascii="Arial" w:hAnsi="Arial" w:cs="Arial"/>
+        </w:rPr>
+        <w:t xml:space="preserve"> </w:t>
+      </w:r>
+      <w:r>
+        <w:rPr>
+          <w:rFonts w:ascii="Arial" w:hAnsi="Arial" w:cs="Arial"/>
+        </w:rPr>
+        <w:t>This suggests</w:t>
+      </w:r>
+      <w:r>
+        <w:rPr>
+          <w:rFonts w:ascii="Arial" w:hAnsi="Arial" w:cs="Arial"/>
+        </w:rPr>
+        <w:t xml:space="preserve"> </w:t>
+      </w:r>
+      <w:r>
+        <w:rPr>
+          <w:rFonts w:ascii="Arial" w:hAnsi="Arial" w:cs="Arial"/>
+        </w:rPr>
+        <w:t xml:space="preserve">that individuals </w:t>
+      </w:r>
+      <w:r>
+        <w:rPr>
+          <w:rFonts w:ascii="Arial" w:hAnsi="Arial" w:cs="Arial"/>
+        </w:rPr>
+        <w:t>are being</w:t>
+      </w:r>
+      <w:r>
+        <w:rPr>
+          <w:rFonts w:ascii="Arial" w:hAnsi="Arial" w:cs="Arial"/>
+        </w:rPr>
+        <w:t xml:space="preserve"> categorized back to their group identity when </w:t>
+      </w:r>
+      <w:r>
+        <w:rPr>
+          <w:rFonts w:ascii="Arial" w:hAnsi="Arial" w:cs="Arial"/>
+        </w:rPr>
+        <w:t>running traditional bioacoustics analyses on our synthetically generated calls.</w:t>
+      </w:r>
+      <w:r>
+        <w:rPr>
+          <w:rFonts w:ascii="Arial" w:hAnsi="Arial" w:cs="Arial"/>
+        </w:rPr>
+        <w:t xml:space="preserve"> </w:t>
       </w:r>
       <w:r>
         <w:rPr>
@@ -5760,27 +5773,45 @@
         <w:rPr>
           <w:rFonts w:ascii="Arial" w:hAnsi="Arial" w:cs="Arial"/>
         </w:rPr>
-        <w:t xml:space="preserve">, </w:t>
-      </w:r>
-      <w:commentRangeStart w:id="49"/>
-      <w:r>
-        <w:rPr>
-          <w:rFonts w:ascii="Arial" w:hAnsi="Arial" w:cs="Arial"/>
-        </w:rPr>
-        <w:t>suggesting acoustic convergence within individuals</w:t>
-      </w:r>
-      <w:commentRangeEnd w:id="49"/>
+        <w:t xml:space="preserve">. </w:t>
+      </w:r>
+      <w:commentRangeStart w:id="47"/>
+      <w:r>
+        <w:rPr>
+          <w:rFonts w:ascii="Arial" w:hAnsi="Arial" w:cs="Arial"/>
+        </w:rPr>
+        <w:t xml:space="preserve">This suggests that individuals </w:t>
+      </w:r>
+      <w:r>
+        <w:rPr>
+          <w:rFonts w:ascii="Arial" w:hAnsi="Arial" w:cs="Arial"/>
+        </w:rPr>
+        <w:t>are being</w:t>
+      </w:r>
+      <w:r>
+        <w:rPr>
+          <w:rFonts w:ascii="Arial" w:hAnsi="Arial" w:cs="Arial"/>
+        </w:rPr>
+        <w:t xml:space="preserve"> categorized </w:t>
+      </w:r>
+      <w:r>
+        <w:rPr>
+          <w:rFonts w:ascii="Arial" w:hAnsi="Arial" w:cs="Arial"/>
+        </w:rPr>
+        <w:t>in distinct individual clusters</w:t>
+      </w:r>
+      <w:r>
+        <w:rPr>
+          <w:rFonts w:ascii="Arial" w:hAnsi="Arial" w:cs="Arial"/>
+        </w:rPr>
+        <w:t xml:space="preserve"> when running traditional bioacoustics analyses on our synthetically generated calls.</w:t>
+      </w:r>
+      <w:commentRangeEnd w:id="47"/>
       <w:r>
         <w:rPr>
           <w:rStyle w:val="CommentReference"/>
         </w:rPr>
-        <w:commentReference w:id="49"/>
-      </w:r>
-      <w:r>
-        <w:rPr>
-          <w:rFonts w:ascii="Arial" w:hAnsi="Arial" w:cs="Arial"/>
-        </w:rPr>
-        <w:t xml:space="preserve">. </w:t>
+        <w:commentReference w:id="47"/>
       </w:r>
     </w:p>
     <w:p>
@@ -5802,7 +5833,7 @@
           <w:szCs w:val="18"/>
         </w:rPr>
       </w:pPr>
-      <w:commentRangeStart w:id="50"/>
+      <w:commentRangeStart w:id="48"/>
       <w:r>
         <w:rPr>
           <w:rFonts w:ascii="Arial" w:hAnsi="Arial" w:cs="Arial"/>
@@ -5813,24 +5844,17 @@
         </w:rPr>
         <w:t>Discussion points:</w:t>
       </w:r>
-      <w:commentRangeEnd w:id="50"/>
+      <w:commentRangeEnd w:id="48"/>
       <w:r>
         <w:rPr>
           <w:rStyle w:val="CommentReference"/>
         </w:rPr>
-        <w:commentReference w:id="50"/>
+        <w:commentReference w:id="48"/>
       </w:r>
     </w:p>
     <w:p>
       <w:pPr>
         <w:spacing w:line="360" w:lineRule="auto"/>
-        <w:rPr>
-          <w:rFonts w:ascii="Arial" w:hAnsi="Arial" w:cs="Arial"/>
-          <w:sz w:val="18"/>
-          <w:szCs w:val="18"/>
-        </w:rPr>
-      </w:pPr>
-      <w:r>
         <w:rPr>
           <w:rFonts w:ascii="Arial" w:hAnsi="Arial" w:cs="Arial"/>
           <w:b/>
@@ -5838,48 +5862,7 @@
           <w:sz w:val="18"/>
           <w:szCs w:val="18"/>
         </w:rPr>
-        <w:t>2A:</w:t>
-      </w:r>
-      <w:r>
-        <w:rPr>
-          <w:rFonts w:ascii="Arial" w:hAnsi="Arial" w:cs="Arial"/>
-          <w:sz w:val="18"/>
-          <w:szCs w:val="18"/>
-        </w:rPr>
-        <w:t xml:space="preserve"> more group membership info encoded. </w:t>
-      </w:r>
-      <w:r>
-        <w:rPr>
-          <w:rFonts w:ascii="Arial" w:hAnsi="Arial" w:cs="Arial"/>
-          <w:sz w:val="18"/>
-          <w:szCs w:val="18"/>
-        </w:rPr>
-        <w:t>Clustering by group / polygons separated by group.</w:t>
-      </w:r>
-      <w:r>
-        <w:rPr>
-          <w:rFonts w:ascii="Arial" w:hAnsi="Arial" w:cs="Arial"/>
-          <w:sz w:val="18"/>
-          <w:szCs w:val="18"/>
-        </w:rPr>
-        <w:t xml:space="preserve"> Here we see that when more group membership is encoded than individual identity information,</w:t>
-      </w:r>
-      <w:r>
-        <w:rPr>
-          <w:rFonts w:ascii="Arial" w:hAnsi="Arial" w:cs="Arial"/>
-          <w:sz w:val="18"/>
-          <w:szCs w:val="18"/>
-        </w:rPr>
-        <w:t xml:space="preserve"> there are clear/separate groups in acoustic space</w:t>
-      </w:r>
-      <w:r>
-        <w:rPr>
-          <w:rFonts w:ascii="Arial" w:hAnsi="Arial" w:cs="Arial"/>
-          <w:sz w:val="18"/>
-          <w:szCs w:val="18"/>
-        </w:rPr>
-        <w:t xml:space="preserve"> – acoustic convergence </w:t>
-      </w:r>
+      </w:pPr>
       <w:r>
         <w:rPr>
           <w:rFonts w:ascii="Arial" w:hAnsi="Arial" w:cs="Arial"/>
@@ -5888,7 +5871,7 @@
           <w:sz w:val="18"/>
           <w:szCs w:val="18"/>
         </w:rPr>
-        <w:t>within</w:t>
+        <w:t>2A:</w:t>
       </w:r>
       <w:r>
         <w:rPr>
@@ -5896,18 +5879,40 @@
           <w:sz w:val="18"/>
           <w:szCs w:val="18"/>
         </w:rPr>
-        <w:t xml:space="preserve"> groups</w:t>
-      </w:r>
-    </w:p>
-    <w:p>
-      <w:pPr>
-        <w:spacing w:line="360" w:lineRule="auto"/>
+        <w:t xml:space="preserve"> more group membership info encoded. </w:t>
+      </w:r>
+      <w:r>
         <w:rPr>
           <w:rFonts w:ascii="Arial" w:hAnsi="Arial" w:cs="Arial"/>
           <w:sz w:val="18"/>
           <w:szCs w:val="18"/>
         </w:rPr>
-      </w:pPr>
+        <w:t>Clustering by group / polygons separated by group.</w:t>
+      </w:r>
+      <w:r>
+        <w:rPr>
+          <w:rFonts w:ascii="Arial" w:hAnsi="Arial" w:cs="Arial"/>
+          <w:sz w:val="18"/>
+          <w:szCs w:val="18"/>
+        </w:rPr>
+        <w:t xml:space="preserve"> Here we see that when more group membership is encoded than individual identity information,</w:t>
+      </w:r>
+      <w:r>
+        <w:rPr>
+          <w:rFonts w:ascii="Arial" w:hAnsi="Arial" w:cs="Arial"/>
+          <w:sz w:val="18"/>
+          <w:szCs w:val="18"/>
+        </w:rPr>
+        <w:t xml:space="preserve"> there are clear/separate groups in acoustic space</w:t>
+      </w:r>
+      <w:r>
+        <w:rPr>
+          <w:rFonts w:ascii="Arial" w:hAnsi="Arial" w:cs="Arial"/>
+          <w:sz w:val="18"/>
+          <w:szCs w:val="18"/>
+        </w:rPr>
+        <w:t xml:space="preserve"> – </w:t>
+      </w:r>
       <w:r>
         <w:rPr>
           <w:rFonts w:ascii="Arial" w:hAnsi="Arial" w:cs="Arial"/>
@@ -5916,111 +5921,7 @@
           <w:sz w:val="18"/>
           <w:szCs w:val="18"/>
         </w:rPr>
-        <w:t>2B</w:t>
-      </w:r>
-      <w:r>
-        <w:rPr>
-          <w:rFonts w:ascii="Arial" w:hAnsi="Arial" w:cs="Arial"/>
-          <w:sz w:val="18"/>
-          <w:szCs w:val="18"/>
-        </w:rPr>
-        <w:t>: here we</w:t>
-      </w:r>
-      <w:r>
-        <w:rPr>
-          <w:rFonts w:ascii="Arial" w:hAnsi="Arial" w:cs="Arial"/>
-          <w:sz w:val="18"/>
-          <w:szCs w:val="18"/>
-        </w:rPr>
-        <w:t xml:space="preserve"> still</w:t>
-      </w:r>
-      <w:r>
-        <w:rPr>
-          <w:rFonts w:ascii="Arial" w:hAnsi="Arial" w:cs="Arial"/>
-          <w:sz w:val="18"/>
-          <w:szCs w:val="18"/>
-        </w:rPr>
-        <w:t xml:space="preserve"> have individuals with more group information encoded within the call, but </w:t>
-      </w:r>
-      <w:r>
-        <w:rPr>
-          <w:rFonts w:ascii="Arial" w:hAnsi="Arial" w:cs="Arial"/>
-          <w:sz w:val="18"/>
-          <w:szCs w:val="18"/>
-        </w:rPr>
-        <w:t xml:space="preserve">we try to </w:t>
-      </w:r>
-      <w:r>
-        <w:rPr>
-          <w:rFonts w:ascii="Arial" w:hAnsi="Arial" w:cs="Arial"/>
-          <w:sz w:val="18"/>
-          <w:szCs w:val="18"/>
-        </w:rPr>
-        <w:t>cluster/group</w:t>
-      </w:r>
-      <w:r>
-        <w:rPr>
-          <w:rFonts w:ascii="Arial" w:hAnsi="Arial" w:cs="Arial"/>
-          <w:sz w:val="18"/>
-          <w:szCs w:val="18"/>
-        </w:rPr>
-        <w:t xml:space="preserve"> them by individual identity</w:t>
-      </w:r>
-      <w:r>
-        <w:rPr>
-          <w:rFonts w:ascii="Arial" w:hAnsi="Arial" w:cs="Arial"/>
-          <w:sz w:val="18"/>
-          <w:szCs w:val="18"/>
-        </w:rPr>
-        <w:t>.</w:t>
-      </w:r>
-      <w:r>
-        <w:rPr>
-          <w:rFonts w:ascii="Arial" w:hAnsi="Arial" w:cs="Arial"/>
-          <w:sz w:val="18"/>
-          <w:szCs w:val="18"/>
-        </w:rPr>
-        <w:t xml:space="preserve"> Even when trying to </w:t>
-      </w:r>
-      <w:r>
-        <w:rPr>
-          <w:rFonts w:ascii="Arial" w:hAnsi="Arial" w:cs="Arial"/>
-          <w:sz w:val="18"/>
-          <w:szCs w:val="18"/>
-        </w:rPr>
-        <w:t>group</w:t>
-      </w:r>
-      <w:r>
-        <w:rPr>
-          <w:rFonts w:ascii="Arial" w:hAnsi="Arial" w:cs="Arial"/>
-          <w:sz w:val="18"/>
-          <w:szCs w:val="18"/>
-        </w:rPr>
-        <w:t xml:space="preserve"> polygons by individual, we </w:t>
-      </w:r>
-      <w:r>
-        <w:rPr>
-          <w:rFonts w:ascii="Arial" w:hAnsi="Arial" w:cs="Arial"/>
-          <w:sz w:val="18"/>
-          <w:szCs w:val="18"/>
-        </w:rPr>
-        <w:t>can still</w:t>
-      </w:r>
-      <w:r>
-        <w:rPr>
-          <w:rFonts w:ascii="Arial" w:hAnsi="Arial" w:cs="Arial"/>
-          <w:sz w:val="18"/>
-          <w:szCs w:val="18"/>
-        </w:rPr>
-        <w:t xml:space="preserve"> see clear group delineations in </w:t>
-      </w:r>
-      <w:r>
-        <w:rPr>
-          <w:rFonts w:ascii="Arial" w:hAnsi="Arial" w:cs="Arial"/>
-          <w:sz w:val="18"/>
-          <w:szCs w:val="18"/>
-        </w:rPr>
-        <w:t>how individuals are taking up their acoustic space</w:t>
+        <w:t>this means</w:t>
       </w:r>
     </w:p>
     <w:p>
@@ -6040,7 +5941,7 @@
           <w:sz w:val="18"/>
           <w:szCs w:val="18"/>
         </w:rPr>
-        <w:t>2C</w:t>
+        <w:t>2B</w:t>
       </w:r>
       <w:r>
         <w:rPr>
@@ -6048,7 +5949,7 @@
           <w:sz w:val="18"/>
           <w:szCs w:val="18"/>
         </w:rPr>
-        <w:t xml:space="preserve">: here we have individuals with more individual identity </w:t>
+        <w:t>: here we</w:t>
       </w:r>
       <w:r>
         <w:rPr>
@@ -6056,25 +5957,23 @@
           <w:sz w:val="18"/>
           <w:szCs w:val="18"/>
         </w:rPr>
-        <w:t xml:space="preserve">encoded within </w:t>
-      </w:r>
-      <w:proofErr w:type="gramStart"/>
+        <w:t xml:space="preserve"> still</w:t>
+      </w:r>
       <w:r>
         <w:rPr>
           <w:rFonts w:ascii="Arial" w:hAnsi="Arial" w:cs="Arial"/>
           <w:sz w:val="18"/>
           <w:szCs w:val="18"/>
         </w:rPr>
-        <w:t>call, but</w:t>
-      </w:r>
-      <w:proofErr w:type="gramEnd"/>
+        <w:t xml:space="preserve"> have individuals with more group information encoded within the call, but </w:t>
+      </w:r>
       <w:r>
         <w:rPr>
           <w:rFonts w:ascii="Arial" w:hAnsi="Arial" w:cs="Arial"/>
           <w:sz w:val="18"/>
           <w:szCs w:val="18"/>
         </w:rPr>
-        <w:t xml:space="preserve"> try to cluster/group them by </w:t>
+        <w:t xml:space="preserve">we try to </w:t>
       </w:r>
       <w:r>
         <w:rPr>
@@ -6082,7 +5981,7 @@
           <w:sz w:val="18"/>
           <w:szCs w:val="18"/>
         </w:rPr>
-        <w:t>group membership. W</w:t>
+        <w:t>cluster/group</w:t>
       </w:r>
       <w:r>
         <w:rPr>
@@ -6090,7 +5989,7 @@
           <w:sz w:val="18"/>
           <w:szCs w:val="18"/>
         </w:rPr>
-        <w:t xml:space="preserve">ith more </w:t>
+        <w:t xml:space="preserve"> them by individual identity</w:t>
       </w:r>
       <w:r>
         <w:rPr>
@@ -6098,7 +5997,7 @@
           <w:sz w:val="18"/>
           <w:szCs w:val="18"/>
         </w:rPr>
-        <w:t xml:space="preserve">identity information encoded within a call than group membership, </w:t>
+        <w:t>.</w:t>
       </w:r>
       <w:r>
         <w:rPr>
@@ -6106,7 +6005,7 @@
           <w:sz w:val="18"/>
           <w:szCs w:val="18"/>
         </w:rPr>
-        <w:t xml:space="preserve">individuals in the same group </w:t>
+        <w:t xml:space="preserve"> Even when trying to </w:t>
       </w:r>
       <w:r>
         <w:rPr>
@@ -6114,7 +6013,7 @@
           <w:sz w:val="18"/>
           <w:szCs w:val="18"/>
         </w:rPr>
-        <w:t xml:space="preserve">“actively work” / </w:t>
+        <w:t>group</w:t>
       </w:r>
       <w:r>
         <w:rPr>
@@ -6122,7 +6021,7 @@
           <w:sz w:val="18"/>
           <w:szCs w:val="18"/>
         </w:rPr>
-        <w:t xml:space="preserve">“try” to be as different as they can from each other, so </w:t>
+        <w:t xml:space="preserve"> polygons by individual, we </w:t>
       </w:r>
       <w:r>
         <w:rPr>
@@ -6130,7 +6029,7 @@
           <w:sz w:val="18"/>
           <w:szCs w:val="18"/>
         </w:rPr>
-        <w:t>they all take up very different parts of the acoustic space. This results in a lot of overlap between these group polygon</w:t>
+        <w:t>can still</w:t>
       </w:r>
       <w:r>
         <w:rPr>
@@ -6138,65 +6037,15 @@
           <w:sz w:val="18"/>
           <w:szCs w:val="18"/>
         </w:rPr>
-        <w:t xml:space="preserve">s – by trying to remain very different from individuals within their group, they may be quite </w:t>
-      </w:r>
-      <w:proofErr w:type="gramStart"/>
+        <w:t xml:space="preserve"> see clear group delineations in </w:t>
+      </w:r>
       <w:r>
         <w:rPr>
           <w:rFonts w:ascii="Arial" w:hAnsi="Arial" w:cs="Arial"/>
           <w:sz w:val="18"/>
           <w:szCs w:val="18"/>
         </w:rPr>
-        <w:t>similar to</w:t>
-      </w:r>
-      <w:proofErr w:type="gramEnd"/>
-      <w:r>
-        <w:rPr>
-          <w:rFonts w:ascii="Arial" w:hAnsi="Arial" w:cs="Arial"/>
-          <w:sz w:val="18"/>
-          <w:szCs w:val="18"/>
-        </w:rPr>
-        <w:t xml:space="preserve"> other individuals from other groups by random chance</w:t>
-      </w:r>
-      <w:r>
-        <w:rPr>
-          <w:rFonts w:ascii="Arial" w:hAnsi="Arial" w:cs="Arial"/>
-          <w:sz w:val="18"/>
-          <w:szCs w:val="18"/>
-        </w:rPr>
-        <w:t>. W</w:t>
-      </w:r>
-      <w:r>
-        <w:rPr>
-          <w:rFonts w:ascii="Arial" w:hAnsi="Arial" w:cs="Arial"/>
-          <w:sz w:val="18"/>
-          <w:szCs w:val="18"/>
-        </w:rPr>
-        <w:t xml:space="preserve">e see low </w:t>
-      </w:r>
-      <w:r>
-        <w:rPr>
-          <w:rFonts w:ascii="Arial" w:hAnsi="Arial" w:cs="Arial"/>
-          <w:sz w:val="18"/>
-          <w:szCs w:val="18"/>
-        </w:rPr>
-        <w:t>convergence within groups</w:t>
-      </w:r>
-      <w:r>
-        <w:rPr>
-          <w:rFonts w:ascii="Arial" w:hAnsi="Arial" w:cs="Arial"/>
-          <w:sz w:val="18"/>
-          <w:szCs w:val="18"/>
-        </w:rPr>
-        <w:t>.</w:t>
-      </w:r>
-      <w:r>
-        <w:rPr>
-          <w:rFonts w:ascii="Arial" w:hAnsi="Arial" w:cs="Arial"/>
-          <w:sz w:val="18"/>
-          <w:szCs w:val="18"/>
-        </w:rPr>
-        <w:t xml:space="preserve"> </w:t>
+        <w:t>how individuals are taking up their acoustic space</w:t>
       </w:r>
     </w:p>
     <w:p>
@@ -6216,7 +6065,131 @@
           <w:sz w:val="18"/>
           <w:szCs w:val="18"/>
         </w:rPr>
-        <w:t>2D:</w:t>
+        <w:t>2C</w:t>
+      </w:r>
+      <w:r>
+        <w:rPr>
+          <w:rFonts w:ascii="Arial" w:hAnsi="Arial" w:cs="Arial"/>
+          <w:sz w:val="18"/>
+          <w:szCs w:val="18"/>
+        </w:rPr>
+        <w:t xml:space="preserve">: here we have individuals with more individual identity </w:t>
+      </w:r>
+      <w:r>
+        <w:rPr>
+          <w:rFonts w:ascii="Arial" w:hAnsi="Arial" w:cs="Arial"/>
+          <w:sz w:val="18"/>
+          <w:szCs w:val="18"/>
+        </w:rPr>
+        <w:t xml:space="preserve">encoded within </w:t>
+      </w:r>
+      <w:proofErr w:type="gramStart"/>
+      <w:r>
+        <w:rPr>
+          <w:rFonts w:ascii="Arial" w:hAnsi="Arial" w:cs="Arial"/>
+          <w:sz w:val="18"/>
+          <w:szCs w:val="18"/>
+        </w:rPr>
+        <w:t>call, but</w:t>
+      </w:r>
+      <w:proofErr w:type="gramEnd"/>
+      <w:r>
+        <w:rPr>
+          <w:rFonts w:ascii="Arial" w:hAnsi="Arial" w:cs="Arial"/>
+          <w:sz w:val="18"/>
+          <w:szCs w:val="18"/>
+        </w:rPr>
+        <w:t xml:space="preserve"> try to cluster/group them by </w:t>
+      </w:r>
+      <w:r>
+        <w:rPr>
+          <w:rFonts w:ascii="Arial" w:hAnsi="Arial" w:cs="Arial"/>
+          <w:sz w:val="18"/>
+          <w:szCs w:val="18"/>
+        </w:rPr>
+        <w:t>group membership. W</w:t>
+      </w:r>
+      <w:r>
+        <w:rPr>
+          <w:rFonts w:ascii="Arial" w:hAnsi="Arial" w:cs="Arial"/>
+          <w:sz w:val="18"/>
+          <w:szCs w:val="18"/>
+        </w:rPr>
+        <w:t xml:space="preserve">ith more </w:t>
+      </w:r>
+      <w:r>
+        <w:rPr>
+          <w:rFonts w:ascii="Arial" w:hAnsi="Arial" w:cs="Arial"/>
+          <w:sz w:val="18"/>
+          <w:szCs w:val="18"/>
+        </w:rPr>
+        <w:t xml:space="preserve">identity information encoded within a call than group membership, </w:t>
+      </w:r>
+      <w:r>
+        <w:rPr>
+          <w:rFonts w:ascii="Arial" w:hAnsi="Arial" w:cs="Arial"/>
+          <w:sz w:val="18"/>
+          <w:szCs w:val="18"/>
+        </w:rPr>
+        <w:t xml:space="preserve">individuals in the same group </w:t>
+      </w:r>
+      <w:r>
+        <w:rPr>
+          <w:rFonts w:ascii="Arial" w:hAnsi="Arial" w:cs="Arial"/>
+          <w:sz w:val="18"/>
+          <w:szCs w:val="18"/>
+        </w:rPr>
+        <w:t xml:space="preserve">“actively work” / </w:t>
+      </w:r>
+      <w:r>
+        <w:rPr>
+          <w:rFonts w:ascii="Arial" w:hAnsi="Arial" w:cs="Arial"/>
+          <w:sz w:val="18"/>
+          <w:szCs w:val="18"/>
+        </w:rPr>
+        <w:t xml:space="preserve">“try” to be as different as they can from each other, so </w:t>
+      </w:r>
+      <w:r>
+        <w:rPr>
+          <w:rFonts w:ascii="Arial" w:hAnsi="Arial" w:cs="Arial"/>
+          <w:sz w:val="18"/>
+          <w:szCs w:val="18"/>
+        </w:rPr>
+        <w:t>they all take up very different parts of the acoustic space. This results in a lot of overlap between these group polygon</w:t>
+      </w:r>
+      <w:r>
+        <w:rPr>
+          <w:rFonts w:ascii="Arial" w:hAnsi="Arial" w:cs="Arial"/>
+          <w:sz w:val="18"/>
+          <w:szCs w:val="18"/>
+        </w:rPr>
+        <w:t xml:space="preserve">s – by trying to remain very different from individuals within their group, they may be quite </w:t>
+      </w:r>
+      <w:proofErr w:type="gramStart"/>
+      <w:r>
+        <w:rPr>
+          <w:rFonts w:ascii="Arial" w:hAnsi="Arial" w:cs="Arial"/>
+          <w:sz w:val="18"/>
+          <w:szCs w:val="18"/>
+        </w:rPr>
+        <w:t>similar to</w:t>
+      </w:r>
+      <w:proofErr w:type="gramEnd"/>
+      <w:r>
+        <w:rPr>
+          <w:rFonts w:ascii="Arial" w:hAnsi="Arial" w:cs="Arial"/>
+          <w:sz w:val="18"/>
+          <w:szCs w:val="18"/>
+        </w:rPr>
+        <w:t xml:space="preserve"> other individuals from other groups by random chance</w:t>
+      </w:r>
+      <w:r>
+        <w:rPr>
+          <w:rFonts w:ascii="Arial" w:hAnsi="Arial" w:cs="Arial"/>
+          <w:sz w:val="18"/>
+          <w:szCs w:val="18"/>
+        </w:rPr>
+        <w:t xml:space="preserve">. </w:t>
       </w:r>
       <w:r>
         <w:rPr>
@@ -6226,7 +6199,7 @@
           <w:sz w:val="18"/>
           <w:szCs w:val="18"/>
         </w:rPr>
-        <w:t xml:space="preserve"> </w:t>
+        <w:t>This means</w:t>
       </w:r>
       <w:r>
         <w:rPr>
@@ -6234,31 +6207,37 @@
           <w:sz w:val="18"/>
           <w:szCs w:val="18"/>
         </w:rPr>
-        <w:t>more individual i</w:t>
-      </w:r>
-      <w:r>
+        <w:t xml:space="preserve"> </w:t>
+      </w:r>
+    </w:p>
+    <w:p>
+      <w:pPr>
+        <w:spacing w:line="360" w:lineRule="auto"/>
         <w:rPr>
           <w:rFonts w:ascii="Arial" w:hAnsi="Arial" w:cs="Arial"/>
           <w:sz w:val="18"/>
           <w:szCs w:val="18"/>
         </w:rPr>
-        <w:t xml:space="preserve">dentity information encoded than group membership information. </w:t>
-      </w:r>
-      <w:r>
-        <w:rPr>
-          <w:rFonts w:ascii="Arial" w:hAnsi="Arial" w:cs="Arial"/>
+      </w:pPr>
+      <w:r>
+        <w:rPr>
+          <w:rFonts w:ascii="Arial" w:hAnsi="Arial" w:cs="Arial"/>
+          <w:b/>
+          <w:bCs/>
           <w:sz w:val="18"/>
           <w:szCs w:val="18"/>
         </w:rPr>
-        <w:t>Individuals within the same group will have low convergence (maintaining individuality) with</w:t>
-      </w:r>
-      <w:r>
-        <w:rPr>
-          <w:rFonts w:ascii="Arial" w:hAnsi="Arial" w:cs="Arial"/>
+        <w:t>2D:</w:t>
+      </w:r>
+      <w:r>
+        <w:rPr>
+          <w:rFonts w:ascii="Arial" w:hAnsi="Arial" w:cs="Arial"/>
+          <w:b/>
+          <w:bCs/>
           <w:sz w:val="18"/>
           <w:szCs w:val="18"/>
         </w:rPr>
-        <w:t xml:space="preserve"> others in</w:t>
+        <w:t xml:space="preserve"> </w:t>
       </w:r>
       <w:r>
         <w:rPr>
@@ -6266,16 +6245,15 @@
           <w:sz w:val="18"/>
           <w:szCs w:val="18"/>
         </w:rPr>
-        <w:t xml:space="preserve"> the </w:t>
-      </w:r>
-      <w:proofErr w:type="gramStart"/>
+        <w:t>more individual i</w:t>
+      </w:r>
       <w:r>
         <w:rPr>
           <w:rFonts w:ascii="Arial" w:hAnsi="Arial" w:cs="Arial"/>
           <w:sz w:val="18"/>
           <w:szCs w:val="18"/>
         </w:rPr>
-        <w:t xml:space="preserve">group, </w:t>
+        <w:t xml:space="preserve">dentity information encoded than group membership information. </w:t>
       </w:r>
       <w:r>
         <w:rPr>
@@ -6283,16 +6261,15 @@
           <w:sz w:val="18"/>
           <w:szCs w:val="18"/>
         </w:rPr>
-        <w:t>and</w:t>
-      </w:r>
-      <w:proofErr w:type="gramEnd"/>
+        <w:t>Individuals within the same group will have low convergence (maintaining individuality) with</w:t>
+      </w:r>
       <w:r>
         <w:rPr>
           <w:rFonts w:ascii="Arial" w:hAnsi="Arial" w:cs="Arial"/>
           <w:sz w:val="18"/>
           <w:szCs w:val="18"/>
         </w:rPr>
-        <w:t xml:space="preserve"> </w:t>
+        <w:t xml:space="preserve"> others in</w:t>
       </w:r>
       <w:r>
         <w:rPr>
@@ -6300,15 +6277,16 @@
           <w:sz w:val="18"/>
           <w:szCs w:val="18"/>
         </w:rPr>
-        <w:t>will all take up separate acoustic space and therefore cluster individually rather than in group clusters.</w:t>
-      </w:r>
+        <w:t xml:space="preserve"> the </w:t>
+      </w:r>
+      <w:proofErr w:type="gramStart"/>
       <w:r>
         <w:rPr>
           <w:rFonts w:ascii="Arial" w:hAnsi="Arial" w:cs="Arial"/>
           <w:sz w:val="18"/>
           <w:szCs w:val="18"/>
         </w:rPr>
-        <w:t xml:space="preserve"> More convergence within the individual than the group.</w:t>
+        <w:t xml:space="preserve">group, </w:t>
       </w:r>
       <w:r>
         <w:rPr>
@@ -6316,6 +6294,39 @@
           <w:sz w:val="18"/>
           <w:szCs w:val="18"/>
         </w:rPr>
+        <w:t>and</w:t>
+      </w:r>
+      <w:proofErr w:type="gramEnd"/>
+      <w:r>
+        <w:rPr>
+          <w:rFonts w:ascii="Arial" w:hAnsi="Arial" w:cs="Arial"/>
+          <w:sz w:val="18"/>
+          <w:szCs w:val="18"/>
+        </w:rPr>
+        <w:t xml:space="preserve"> </w:t>
+      </w:r>
+      <w:r>
+        <w:rPr>
+          <w:rFonts w:ascii="Arial" w:hAnsi="Arial" w:cs="Arial"/>
+          <w:sz w:val="18"/>
+          <w:szCs w:val="18"/>
+        </w:rPr>
+        <w:t>will all take up separate acoustic space and therefore cluster individually rather than in group clusters.</w:t>
+      </w:r>
+      <w:r>
+        <w:rPr>
+          <w:rFonts w:ascii="Arial" w:hAnsi="Arial" w:cs="Arial"/>
+          <w:sz w:val="18"/>
+          <w:szCs w:val="18"/>
+        </w:rPr>
+        <w:t xml:space="preserve"> More convergence within the individual than the group.</w:t>
+      </w:r>
+      <w:r>
+        <w:rPr>
+          <w:rFonts w:ascii="Arial" w:hAnsi="Arial" w:cs="Arial"/>
+          <w:sz w:val="18"/>
+          <w:szCs w:val="18"/>
+        </w:rPr>
         <w:t xml:space="preserve"> Individuals in the same group “actively work” / “try” to be as different as they can from each other, so they all take up very different parts of the acoustic space.</w:t>
       </w:r>
     </w:p>
@@ -6348,7 +6359,7 @@
           <w:bCs/>
         </w:rPr>
       </w:pPr>
-      <w:commentRangeStart w:id="51"/>
+      <w:commentRangeStart w:id="49"/>
       <w:r>
         <w:rPr>
           <w:rFonts w:ascii="Arial" w:hAnsi="Arial" w:cs="Arial"/>
@@ -6357,12 +6368,12 @@
         </w:rPr>
         <w:t>Discussion</w:t>
       </w:r>
-      <w:commentRangeEnd w:id="51"/>
+      <w:commentRangeEnd w:id="49"/>
       <w:r>
         <w:rPr>
           <w:rStyle w:val="CommentReference"/>
         </w:rPr>
-        <w:commentReference w:id="51"/>
+        <w:commentReference w:id="49"/>
       </w:r>
       <w:r>
         <w:rPr>
@@ -6396,19 +6407,19 @@
         </w:rPr>
         <w:t xml:space="preserve">Synthetic tools offer a practical solution, by allowing us to control </w:t>
       </w:r>
-      <w:commentRangeStart w:id="52"/>
+      <w:commentRangeStart w:id="50"/>
       <w:r>
         <w:rPr>
           <w:rFonts w:ascii="Arial" w:hAnsi="Arial" w:cs="Arial"/>
         </w:rPr>
         <w:t>these</w:t>
       </w:r>
-      <w:commentRangeEnd w:id="52"/>
+      <w:commentRangeEnd w:id="50"/>
       <w:r>
         <w:rPr>
           <w:rStyle w:val="CommentReference"/>
         </w:rPr>
-        <w:commentReference w:id="52"/>
+        <w:commentReference w:id="50"/>
       </w:r>
       <w:r>
         <w:rPr>
@@ -6416,7 +6427,7 @@
         </w:rPr>
         <w:t xml:space="preserve"> variables, while still providing datasets that mimic biologic</w:t>
       </w:r>
-      <w:ins w:id="53" w:author="Summer Eckhardt" w:date="2025-01-24T10:16:00Z" w16du:dateUtc="2025-01-24T15:16:00Z">
+      <w:ins w:id="51" w:author="Summer Eckhardt" w:date="2025-01-24T10:16:00Z" w16du:dateUtc="2025-01-24T15:16:00Z">
         <w:r>
           <w:rPr>
             <w:rFonts w:ascii="Arial" w:hAnsi="Arial" w:cs="Arial"/>
@@ -6430,7 +6441,7 @@
         </w:rPr>
         <w:t xml:space="preserve"> ones. Currently</w:t>
       </w:r>
-      <w:ins w:id="54" w:author="Summer Eckhardt" w:date="2025-01-24T10:16:00Z" w16du:dateUtc="2025-01-24T15:16:00Z">
+      <w:ins w:id="52" w:author="Summer Eckhardt" w:date="2025-01-24T10:16:00Z" w16du:dateUtc="2025-01-24T15:16:00Z">
         <w:r>
           <w:rPr>
             <w:rFonts w:ascii="Arial" w:hAnsi="Arial" w:cs="Arial"/>
@@ -6444,7 +6455,7 @@
         </w:rPr>
         <w:t xml:space="preserve"> there are calls for vocal communication research to take advantage </w:t>
       </w:r>
-      <w:ins w:id="55" w:author="Summer Eckhardt" w:date="2025-01-24T10:16:00Z" w16du:dateUtc="2025-01-24T15:16:00Z">
+      <w:ins w:id="53" w:author="Summer Eckhardt" w:date="2025-01-24T10:16:00Z" w16du:dateUtc="2025-01-24T15:16:00Z">
         <w:r>
           <w:rPr>
             <w:rFonts w:ascii="Arial" w:hAnsi="Arial" w:cs="Arial"/>
@@ -8348,7 +8359,7 @@
           <w:bCs/>
         </w:rPr>
       </w:pPr>
-      <w:commentRangeStart w:id="56"/>
+      <w:commentRangeStart w:id="54"/>
       <w:r>
         <w:rPr>
           <w:rFonts w:ascii="Arial" w:hAnsi="Arial" w:cs="Arial"/>
@@ -8399,12 +8410,12 @@
         </w:rPr>
         <w:t xml:space="preserve"> therefore may not be assessing the full scope of how information can be encoded across a range of species.</w:t>
       </w:r>
-      <w:commentRangeEnd w:id="56"/>
+      <w:commentRangeEnd w:id="54"/>
       <w:r>
         <w:rPr>
           <w:rStyle w:val="CommentReference"/>
         </w:rPr>
-        <w:commentReference w:id="56"/>
+        <w:commentReference w:id="54"/>
       </w:r>
     </w:p>
     <w:p>
@@ -8429,35 +8440,35 @@
         </w:rPr>
         <w:t xml:space="preserve">Several computationally intensive tools have emerged to assess the degree or types of information encoded in </w:t>
       </w:r>
+      <w:commentRangeStart w:id="55"/>
+      <w:commentRangeStart w:id="56"/>
       <w:commentRangeStart w:id="57"/>
-      <w:commentRangeStart w:id="58"/>
-      <w:commentRangeStart w:id="59"/>
       <w:r>
         <w:rPr>
           <w:rFonts w:ascii="Arial" w:hAnsi="Arial" w:cs="Arial"/>
         </w:rPr>
         <w:t>signals</w:t>
       </w:r>
+      <w:commentRangeEnd w:id="55"/>
+      <w:r>
+        <w:rPr>
+          <w:rStyle w:val="CommentReference"/>
+        </w:rPr>
+        <w:commentReference w:id="55"/>
+      </w:r>
+      <w:commentRangeEnd w:id="56"/>
+      <w:r>
+        <w:rPr>
+          <w:rStyle w:val="CommentReference"/>
+        </w:rPr>
+        <w:commentReference w:id="56"/>
+      </w:r>
       <w:commentRangeEnd w:id="57"/>
       <w:r>
         <w:rPr>
           <w:rStyle w:val="CommentReference"/>
         </w:rPr>
         <w:commentReference w:id="57"/>
-      </w:r>
-      <w:commentRangeEnd w:id="58"/>
-      <w:r>
-        <w:rPr>
-          <w:rStyle w:val="CommentReference"/>
-        </w:rPr>
-        <w:commentReference w:id="58"/>
-      </w:r>
-      <w:commentRangeEnd w:id="59"/>
-      <w:r>
-        <w:rPr>
-          <w:rStyle w:val="CommentReference"/>
-        </w:rPr>
-        <w:commentReference w:id="59"/>
       </w:r>
       <w:r>
         <w:rPr>
@@ -9710,7 +9721,7 @@
       </w:r>
     </w:p>
   </w:comment>
-  <w:comment w:id="45" w:author="Summer Eckhardt" w:date="2025-01-28T15:17:00Z" w:initials="SE">
+  <w:comment w:id="45" w:author="Summer Eckhardt" w:date="2025-02-04T18:49:00Z" w:initials="SE">
     <w:p>
       <w:pPr>
         <w:pStyle w:val="CommentText"/>
@@ -9722,11 +9733,11 @@
         <w:annotationRef/>
       </w:r>
       <w:r>
-        <w:t>This is a placeholder Title - I think it needs work</w:t>
+        <w:t>Need to add legend</w:t>
       </w:r>
     </w:p>
   </w:comment>
-  <w:comment w:id="46" w:author="Summer Eckhardt" w:date="2025-01-28T15:20:00Z" w:initials="SE">
+  <w:comment w:id="46" w:author="Summer Eckhardt" w:date="2025-01-28T15:32:00Z" w:initials="SE">
     <w:p>
       <w:pPr>
         <w:pStyle w:val="CommentText"/>
@@ -9738,11 +9749,11 @@
         <w:annotationRef/>
       </w:r>
       <w:r>
-        <w:t>Also will deal with centering figure after getting everything written</w:t>
+        <w:t>Made this figure 2 to follow paragraph above</w:t>
       </w:r>
     </w:p>
   </w:comment>
-  <w:comment w:id="47" w:author="Summer Eckhardt" w:date="2025-01-28T15:32:00Z" w:initials="SE">
+  <w:comment w:id="47" w:author="Summer Eckhardt" w:date="2025-02-04T19:02:00Z" w:initials="SE">
     <w:p>
       <w:pPr>
         <w:pStyle w:val="CommentText"/>
@@ -9754,11 +9765,11 @@
         <w:annotationRef/>
       </w:r>
       <w:r>
-        <w:t>Made this figure 2 to follow paragraph above</w:t>
+        <w:t>Are these last few sentences repetitive?</w:t>
       </w:r>
     </w:p>
   </w:comment>
-  <w:comment w:id="48" w:author="Summer Eckhardt" w:date="2025-01-29T09:42:00Z" w:initials="SE">
+  <w:comment w:id="48" w:author="Summer Eckhardt" w:date="2025-01-29T09:35:00Z" w:initials="SE">
     <w:p>
       <w:pPr>
         <w:pStyle w:val="CommentText"/>
@@ -9770,11 +9781,11 @@
         <w:annotationRef/>
       </w:r>
       <w:r>
-        <w:t>Keep?</w:t>
+        <w:t>These are some potential points for discussion - should any of these be included in results section?</w:t>
       </w:r>
     </w:p>
   </w:comment>
-  <w:comment w:id="49" w:author="Summer Eckhardt" w:date="2025-01-29T09:43:00Z" w:initials="SE">
+  <w:comment w:id="49" w:author="Coppinger, Brittany" w:date="2025-01-09T10:23:00Z" w:initials="BC">
     <w:p>
       <w:pPr>
         <w:pStyle w:val="CommentText"/>
@@ -9786,11 +9797,63 @@
         <w:annotationRef/>
       </w:r>
       <w:r>
-        <w:t>Keep?</w:t>
-      </w:r>
+        <w:t xml:space="preserve">Make reference to the fact that we are using a very simple generative model to encode diversity of information in signals. </w:t>
+      </w:r>
+    </w:p>
+    <w:p>
+      <w:pPr>
+        <w:pStyle w:val="CommentText"/>
+      </w:pPr>
+    </w:p>
+    <w:p>
+      <w:pPr>
+        <w:pStyle w:val="CommentText"/>
+      </w:pPr>
+      <w:r>
+        <w:t xml:space="preserve">Currently, model has no link to the receiver side, so we are looking at information encoding, and information recovery pipeline simulates process of decoding information by receivers. </w:t>
+      </w:r>
+    </w:p>
+    <w:p>
+      <w:pPr>
+        <w:pStyle w:val="CommentText"/>
+      </w:pPr>
+    </w:p>
+    <w:p>
+      <w:pPr>
+        <w:pStyle w:val="CommentText"/>
+      </w:pPr>
+      <w:r>
+        <w:t>End:</w:t>
+      </w:r>
+    </w:p>
+    <w:p>
+      <w:pPr>
+        <w:pStyle w:val="CommentText"/>
+      </w:pPr>
+      <w:r>
+        <w:t>“Given the way we have constructed the pipeline, out methods are set up nicely to integrate with computation efficient simulations (ABM) of social interactions and/or communication exchanges between signalers and receivers. “</w:t>
+      </w:r>
+    </w:p>
+    <w:p>
+      <w:pPr>
+        <w:pStyle w:val="CommentText"/>
+      </w:pPr>
+    </w:p>
+    <w:p>
+      <w:pPr>
+        <w:pStyle w:val="CommentText"/>
+      </w:pPr>
+      <w:r>
+        <w:t>“Future research in this area would link pipelines to generative models capable of synthetic evolutionary change of the system. This pipeline makes it possible to create synthetic vocal represented as character strings (2) makes it possible to sonify those strings, such that they can be used in traditional bioacoustics pipelines. “</w:t>
+      </w:r>
+    </w:p>
+    <w:p>
+      <w:pPr>
+        <w:pStyle w:val="CommentText"/>
+      </w:pPr>
     </w:p>
   </w:comment>
-  <w:comment w:id="50" w:author="Summer Eckhardt" w:date="2025-01-29T09:35:00Z" w:initials="SE">
+  <w:comment w:id="50" w:author="Summer Eckhardt" w:date="2025-01-24T10:16:00Z" w:initials="SE">
     <w:p>
       <w:pPr>
         <w:pStyle w:val="CommentText"/>
@@ -9802,95 +9865,11 @@
         <w:annotationRef/>
       </w:r>
       <w:r>
-        <w:t>These are some potential points for discussion - should any of these be included in results section?</w:t>
+        <w:t>explain</w:t>
       </w:r>
     </w:p>
   </w:comment>
-  <w:comment w:id="51" w:author="Coppinger, Brittany" w:date="2025-01-09T10:23:00Z" w:initials="BC">
-    <w:p>
-      <w:pPr>
-        <w:pStyle w:val="CommentText"/>
-      </w:pPr>
-      <w:r>
-        <w:rPr>
-          <w:rStyle w:val="CommentReference"/>
-        </w:rPr>
-        <w:annotationRef/>
-      </w:r>
-      <w:r>
-        <w:t xml:space="preserve">Make reference to the fact that we are using a very simple generative model to encode diversity of information in signals. </w:t>
-      </w:r>
-    </w:p>
-    <w:p>
-      <w:pPr>
-        <w:pStyle w:val="CommentText"/>
-      </w:pPr>
-    </w:p>
-    <w:p>
-      <w:pPr>
-        <w:pStyle w:val="CommentText"/>
-      </w:pPr>
-      <w:r>
-        <w:t xml:space="preserve">Currently, model has no link to the receiver side, so we are looking at information encoding, and information recovery pipeline simulates process of decoding information by receivers. </w:t>
-      </w:r>
-    </w:p>
-    <w:p>
-      <w:pPr>
-        <w:pStyle w:val="CommentText"/>
-      </w:pPr>
-    </w:p>
-    <w:p>
-      <w:pPr>
-        <w:pStyle w:val="CommentText"/>
-      </w:pPr>
-      <w:r>
-        <w:t>End:</w:t>
-      </w:r>
-    </w:p>
-    <w:p>
-      <w:pPr>
-        <w:pStyle w:val="CommentText"/>
-      </w:pPr>
-      <w:r>
-        <w:t>“Given the way we have constructed the pipeline, out methods are set up nicely to integrate with computation efficient simulations (ABM) of social interactions and/or communication exchanges between signalers and receivers. “</w:t>
-      </w:r>
-    </w:p>
-    <w:p>
-      <w:pPr>
-        <w:pStyle w:val="CommentText"/>
-      </w:pPr>
-    </w:p>
-    <w:p>
-      <w:pPr>
-        <w:pStyle w:val="CommentText"/>
-      </w:pPr>
-      <w:r>
-        <w:t>“Future research in this area would link pipelines to generative models capable of synthetic evolutionary change of the system. This pipeline makes it possible to create synthetic vocal represented as character strings (2) makes it possible to sonify those strings, such that they can be used in traditional bioacoustics pipelines. “</w:t>
-      </w:r>
-    </w:p>
-    <w:p>
-      <w:pPr>
-        <w:pStyle w:val="CommentText"/>
-      </w:pPr>
-    </w:p>
-  </w:comment>
-  <w:comment w:id="52" w:author="Summer Eckhardt" w:date="2025-01-24T10:16:00Z" w:initials="SE">
-    <w:p>
-      <w:pPr>
-        <w:pStyle w:val="CommentText"/>
-      </w:pPr>
-      <w:r>
-        <w:rPr>
-          <w:rStyle w:val="CommentReference"/>
-        </w:rPr>
-        <w:annotationRef/>
-      </w:r>
-      <w:r>
-        <w:t>explain</w:t>
-      </w:r>
-    </w:p>
-  </w:comment>
-  <w:comment w:id="56" w:author="Smith Vidaurre, Grace" w:date="2024-12-18T15:30:00Z" w:initials="GSV">
+  <w:comment w:id="54" w:author="Smith Vidaurre, Grace" w:date="2024-12-18T15:30:00Z" w:initials="GSV">
     <w:p>
       <w:r>
         <w:rPr>
@@ -9907,7 +9886,7 @@
       </w:r>
     </w:p>
   </w:comment>
-  <w:comment w:id="57" w:author="Smith Vidaurre, Grace" w:date="2024-12-16T09:35:00Z" w:initials="GSV">
+  <w:comment w:id="55" w:author="Smith Vidaurre, Grace" w:date="2024-12-16T09:35:00Z" w:initials="GSV">
     <w:p>
       <w:r>
         <w:rPr>
@@ -9924,7 +9903,7 @@
       </w:r>
     </w:p>
   </w:comment>
-  <w:comment w:id="58" w:author="Smith Vidaurre, Grace" w:date="2024-12-16T09:41:00Z" w:initials="GSV">
+  <w:comment w:id="56" w:author="Smith Vidaurre, Grace" w:date="2024-12-16T09:41:00Z" w:initials="GSV">
     <w:p>
       <w:r>
         <w:rPr>
@@ -9941,7 +9920,7 @@
       </w:r>
     </w:p>
   </w:comment>
-  <w:comment w:id="59" w:author="Coppinger, Brittany" w:date="2024-12-16T14:51:00Z" w:initials="BC">
+  <w:comment w:id="57" w:author="Coppinger, Brittany" w:date="2024-12-16T14:51:00Z" w:initials="BC">
     <w:p>
       <w:pPr>
         <w:pStyle w:val="CommentText"/>
@@ -10040,11 +10019,9 @@
   <w15:commentEx w15:paraId="11E16C30" w15:done="0"/>
   <w15:commentEx w15:paraId="27843223" w15:done="0"/>
   <w15:commentEx w15:paraId="68CB36A9" w15:done="0"/>
-  <w15:commentEx w15:paraId="0B3856C1" w15:done="0"/>
-  <w15:commentEx w15:paraId="5D809409" w15:paraIdParent="0B3856C1" w15:done="0"/>
+  <w15:commentEx w15:paraId="50120D7C" w15:done="0"/>
   <w15:commentEx w15:paraId="5EEC8C99" w15:done="0"/>
-  <w15:commentEx w15:paraId="2BA388A6" w15:done="0"/>
-  <w15:commentEx w15:paraId="10ACB9B8" w15:done="0"/>
+  <w15:commentEx w15:paraId="19892EE0" w15:done="0"/>
   <w15:commentEx w15:paraId="5501CF3B" w15:done="0"/>
   <w15:commentEx w15:paraId="5D37FF45" w15:done="0"/>
   <w15:commentEx w15:paraId="738EB2C9" w15:done="0"/>
@@ -10093,11 +10070,9 @@
   <w16cex:commentExtensible w16cex:durableId="288D6FB4" w16cex:dateUtc="2025-01-13T16:32:00Z"/>
   <w16cex:commentExtensible w16cex:durableId="6DF04BDB" w16cex:dateUtc="2025-01-13T16:51:00Z"/>
   <w16cex:commentExtensible w16cex:durableId="787E58E8" w16cex:dateUtc="2024-12-09T17:03:00Z"/>
-  <w16cex:commentExtensible w16cex:durableId="02CD3FBE" w16cex:dateUtc="2025-01-28T20:17:00Z"/>
-  <w16cex:commentExtensible w16cex:durableId="46AD663F" w16cex:dateUtc="2025-01-28T20:20:00Z"/>
+  <w16cex:commentExtensible w16cex:durableId="0AEE83D3" w16cex:dateUtc="2025-02-04T23:49:00Z"/>
   <w16cex:commentExtensible w16cex:durableId="6A338624" w16cex:dateUtc="2025-01-28T20:32:00Z"/>
-  <w16cex:commentExtensible w16cex:durableId="55946375" w16cex:dateUtc="2025-01-29T14:42:00Z"/>
-  <w16cex:commentExtensible w16cex:durableId="37108E34" w16cex:dateUtc="2025-01-29T14:43:00Z"/>
+  <w16cex:commentExtensible w16cex:durableId="76A36B67" w16cex:dateUtc="2025-02-05T00:02:00Z"/>
   <w16cex:commentExtensible w16cex:durableId="1DA9A76F" w16cex:dateUtc="2025-01-29T14:35:00Z"/>
   <w16cex:commentExtensible w16cex:durableId="73EE58F5" w16cex:dateUtc="2025-01-09T15:23:00Z"/>
   <w16cex:commentExtensible w16cex:durableId="37A2E34E" w16cex:dateUtc="2025-01-24T15:16:00Z"/>
@@ -10146,11 +10121,9 @@
   <w16cid:commentId w16cid:paraId="11E16C30" w16cid:durableId="288D6FB4"/>
   <w16cid:commentId w16cid:paraId="27843223" w16cid:durableId="6DF04BDB"/>
   <w16cid:commentId w16cid:paraId="68CB36A9" w16cid:durableId="787E58E8"/>
-  <w16cid:commentId w16cid:paraId="0B3856C1" w16cid:durableId="02CD3FBE"/>
-  <w16cid:commentId w16cid:paraId="5D809409" w16cid:durableId="46AD663F"/>
+  <w16cid:commentId w16cid:paraId="50120D7C" w16cid:durableId="0AEE83D3"/>
   <w16cid:commentId w16cid:paraId="5EEC8C99" w16cid:durableId="6A338624"/>
-  <w16cid:commentId w16cid:paraId="2BA388A6" w16cid:durableId="55946375"/>
-  <w16cid:commentId w16cid:paraId="10ACB9B8" w16cid:durableId="37108E34"/>
+  <w16cid:commentId w16cid:paraId="19892EE0" w16cid:durableId="76A36B67"/>
   <w16cid:commentId w16cid:paraId="5501CF3B" w16cid:durableId="1DA9A76F"/>
   <w16cid:commentId w16cid:paraId="5D37FF45" w16cid:durableId="73EE58F5"/>
   <w16cid:commentId w16cid:paraId="738EB2C9" w16cid:durableId="37A2E34E"/>

</xml_diff>

<commit_message>
created legend and updated manuscript draft
</commit_message>
<xml_diff>
--- a/paRsynth_methods_draft_BAC_SGE.docx
+++ b/paRsynth_methods_draft_BAC_SGE.docx
@@ -458,19 +458,11 @@
           <w:rFonts w:ascii="Arial" w:hAnsi="Arial" w:cs="Arial"/>
         </w:rPr>
       </w:pPr>
-      <w:proofErr w:type="spellStart"/>
-      <w:r>
-        <w:rPr>
-          <w:rFonts w:ascii="Arial" w:hAnsi="Arial" w:cs="Arial"/>
-        </w:rPr>
-        <w:t>Tktk</w:t>
-      </w:r>
-      <w:proofErr w:type="spellEnd"/>
-      <w:r>
-        <w:rPr>
-          <w:rFonts w:ascii="Arial" w:hAnsi="Arial" w:cs="Arial"/>
-        </w:rPr>
-        <w:t xml:space="preserve"> need name address and email address for Methods in Ecology and Evolution</w:t>
+      <w:r>
+        <w:rPr>
+          <w:rFonts w:ascii="Arial" w:hAnsi="Arial" w:cs="Arial"/>
+        </w:rPr>
+        <w:t>Tktk need name address and email address for Methods in Ecology and Evolution</w:t>
       </w:r>
     </w:p>
     <w:p>
@@ -906,7 +898,6 @@
         </w:rPr>
         <w:t xml:space="preserve">: </w:t>
       </w:r>
-      <w:proofErr w:type="gramStart"/>
       <w:r>
         <w:rPr>
           <w:rFonts w:ascii="Arial" w:hAnsi="Arial" w:cs="Arial"/>
@@ -923,14 +914,7 @@
         <w:rPr>
           <w:rFonts w:ascii="Arial" w:hAnsi="Arial" w:cs="Arial"/>
         </w:rPr>
-        <w:t>word</w:t>
-      </w:r>
-      <w:proofErr w:type="gramEnd"/>
-      <w:r>
-        <w:rPr>
-          <w:rFonts w:ascii="Arial" w:hAnsi="Arial" w:cs="Arial"/>
-        </w:rPr>
-        <w:t xml:space="preserve"> </w:t>
+        <w:t xml:space="preserve">word </w:t>
       </w:r>
       <w:r>
         <w:rPr>
@@ -2052,23 +2036,7 @@
           <w:rFonts w:ascii="Arial" w:hAnsi="Arial" w:cs="Arial"/>
           <w:highlight w:val="yellow"/>
         </w:rPr>
-        <w:t>MacDougall-</w:t>
-      </w:r>
-      <w:proofErr w:type="spellStart"/>
-      <w:r>
-        <w:rPr>
-          <w:rFonts w:ascii="Arial" w:hAnsi="Arial" w:cs="Arial"/>
-          <w:highlight w:val="yellow"/>
-        </w:rPr>
-        <w:t>Shackletons</w:t>
-      </w:r>
-      <w:proofErr w:type="spellEnd"/>
-      <w:r>
-        <w:rPr>
-          <w:rFonts w:ascii="Arial" w:hAnsi="Arial" w:cs="Arial"/>
-          <w:highlight w:val="yellow"/>
-        </w:rPr>
-        <w:t>?</w:t>
+        <w:t>MacDougall-Shackletons?</w:t>
       </w:r>
       <w:r>
         <w:rPr>
@@ -2953,609 +2921,599 @@
         </w:rPr>
         <w:t>onk parakeets (</w:t>
       </w:r>
-      <w:proofErr w:type="spellStart"/>
       <w:r>
         <w:rPr>
           <w:rFonts w:ascii="Arial" w:hAnsi="Arial" w:cs="Arial"/>
           <w:i/>
           <w:iCs/>
         </w:rPr>
-        <w:t>Myiopsitta</w:t>
-      </w:r>
-      <w:proofErr w:type="spellEnd"/>
-      <w:r>
+        <w:t>Myiopsitta monachus</w:t>
+      </w:r>
+      <w:r>
+        <w:rPr>
+          <w:rFonts w:ascii="Arial" w:hAnsi="Arial" w:cs="Arial"/>
+        </w:rPr>
+        <w:t>)</w:t>
+      </w:r>
+      <w:r>
+        <w:rPr>
+          <w:rFonts w:ascii="Arial" w:hAnsi="Arial" w:cs="Arial"/>
+        </w:rPr>
+        <w:t xml:space="preserve"> </w:t>
+      </w:r>
+      <w:r>
+        <w:rPr>
+          <w:rFonts w:ascii="Arial" w:hAnsi="Arial" w:cs="Arial"/>
+        </w:rPr>
+        <w:t>in</w:t>
+      </w:r>
+      <w:r>
+        <w:rPr>
+          <w:rFonts w:ascii="Arial" w:hAnsi="Arial" w:cs="Arial"/>
+        </w:rPr>
+        <w:t xml:space="preserve"> their native and introduced ranges </w:t>
+      </w:r>
+      <w:r>
+        <w:rPr>
+          <w:rFonts w:ascii="Arial" w:hAnsi="Arial" w:cs="Arial"/>
+        </w:rPr>
+        <w:t>produce</w:t>
+      </w:r>
+      <w:r>
+        <w:rPr>
+          <w:rFonts w:ascii="Arial" w:hAnsi="Arial" w:cs="Arial"/>
+        </w:rPr>
+        <w:t xml:space="preserve"> </w:t>
+      </w:r>
+      <w:r>
+        <w:rPr>
+          <w:rFonts w:ascii="Arial" w:hAnsi="Arial" w:cs="Arial"/>
+        </w:rPr>
+        <w:t>social calls</w:t>
+      </w:r>
+      <w:r>
+        <w:rPr>
+          <w:rFonts w:ascii="Arial" w:hAnsi="Arial" w:cs="Arial"/>
+        </w:rPr>
+        <w:t xml:space="preserve"> </w:t>
+      </w:r>
+      <w:r>
+        <w:rPr>
+          <w:rFonts w:ascii="Arial" w:hAnsi="Arial" w:cs="Arial"/>
+        </w:rPr>
+        <w:t xml:space="preserve">that are individually distinctive but still display statistically significant </w:t>
+      </w:r>
+      <w:r>
+        <w:rPr>
+          <w:rFonts w:ascii="Arial" w:hAnsi="Arial" w:cs="Arial"/>
+        </w:rPr>
+        <w:t>similarity within nesting sites</w:t>
+      </w:r>
+      <w:r>
+        <w:rPr>
+          <w:rFonts w:ascii="Arial" w:hAnsi="Arial" w:cs="Arial"/>
+        </w:rPr>
+        <w:t xml:space="preserve"> </w:t>
+      </w:r>
+      <w:r>
+        <w:rPr>
+          <w:rFonts w:ascii="Arial" w:hAnsi="Arial" w:cs="Arial"/>
+        </w:rPr>
+        <w:fldChar w:fldCharType="begin"/>
+      </w:r>
+      <w:r>
+        <w:rPr>
+          <w:rFonts w:ascii="Arial" w:hAnsi="Arial" w:cs="Arial"/>
+        </w:rPr>
+        <w:instrText xml:space="preserve"> ADDIN ZOTERO_ITEM CSL_CITATION {"citationID":"sOTi377T","properties":{"formattedCitation":"(Smith-Vidaurre et al., 2020, 2023)","plainCitation":"(Smith-Vidaurre et al., 2020, 2023)","noteIndex":0},"citationItems":[{"id":536,"uris":["http://zotero.org/groups/5786507/items/ZNXJZAJT"],"itemData":{"id":536,"type":"article-journal","abstract":"Despite longstanding interest in the evolutionary origins and maintenance of vocal learning, we know relatively little about how social dynamics influence vocal learning processes in natural populations. The “signaling group membership” hypothesis proposes that socially learned calls evolved and are maintained as signals of group membership. However, in fission–fusion societies, individuals can interact in social groups across various social scales. For learned calls to signal group membership over multiple social scales, they must contain information about group membership over each of these scales, a concept termed “hierarchical mapping.” Monk parakeets (Myiopsitta monachus), small parrots native to South America, exhibit vocal mimicry in captivity and fission–fusion social dynamics in the wild. We examined patterns of contact call acoustic similarity in Uruguay to test the hierarchical mapping assumption of the signaling group membership hypothesis. We also asked whether geographic variation patterns matched regional dialects or geographic clines that have been documented in other vocal learning species. We used visual inspection, spectrographic cross-correlation and random forests, a machine learning approach, to evaluate contact call similarity. We compared acoustic similarity across social scales and geographic distance using Mantel tests and spatial autocorrelation. We found high similarity within individuals, and low, albeit significant, similarity within groups at the pair, flock and site social scales. Patterns of acoustic similarity over geographic distance did not match mosaic or graded patterns expected in dialectal or clinal variation. Our findings suggest that monk parakeet social interactions rely more heavily upon individual recognition than group membership at higher social scales.","container-title":"Behavioral Ecology","DOI":"10.1093/beheco/arz202","ISSN":"1045-2249","issue":"2","journalAbbreviation":"Behavioral Ecology","page":"448-458","source":"Silverchair","title":"Individual signatures outweigh social group identity in contact calls of a communally nesting parrot","volume":"31","author":[{"family":"Smith-Vidaurre","given":"Grace"},{"family":"Araya-Salas","given":"Marcelo"},{"family":"Wright","given":"Timothy F"}],"issued":{"date-parts":[["2020",3,20]]}}},{"id":542,"uris":["http://zotero.org/groups/5786507/items/E7IVATDZ"],"itemData":{"id":542,"type":"article-journal","abstract":"Animals can actively encode different types of identity information in learned communication signals, such as group membership or individual identity. The social environments in which animals interact may favor different types of information, but whether identity information conveyed in learned signals is robust or responsive to social disruption over short evolutionary timescales is not well understood. We inferred the type of identity information that was most salient in vocal signals by combining computational tools, including supervised machine learning, with a conceptual framework of “hierarchical mapping”, or patterns of relative acoustic convergence across social scales. We used populations of a vocal learning species as a natural experiment to test whether the type of identity information emphasized in learned vocalizations changed in populations that experienced the social disruption of introduction into new parts of the world. We compared the social scales with the most salient identity information among native and introduced range monk parakeet (Myiopsitta monachus) calls recorded in Uruguay and the United States, respectively. We also evaluated whether the identity information emphasized in introduced range calls changed over time. To place our findings in an evolutionary context, we compared our results with another parrot species that exhibits well-established and distinctive regional vocal dialects that are consistent with signaling group identity. We found that both native and introduced range monk parakeet calls displayed the strongest convergence at the individual scale and minimal convergence within sites. We did not identify changes in the strength of acoustic convergence within sites over time in the introduced range calls. These results indicate that the individual identity information in learned vocalizations did not change over short evolutionary timescales in populations that experienced the social disruption of introduction. Our findings point to exciting new research directions about the robustness or responsiveness of communication systems over different evolutionary timescales.","container-title":"PLOS Computational Biology","DOI":"10.1371/journal.pcbi.1011231","ISSN":"1553-7358","issue":"7","journalAbbreviation":"PLOS Computational Biology","language":"en","note":"publisher: Public Library of Science","page":"e1011231","source":"PLoS Journals","title":"Individual identity information persists in learned calls of introduced parrot populations","volume":"19","author":[{"family":"Smith-Vidaurre","given":"Grace"},{"family":"Pérez-Marrufo","given":"Valeria"},{"family":"Hobson","given":"Elizabeth A."},{"family":"Salinas-Melgoza","given":"Alejandro"},{"family":"Wright","given":"Timothy F."}],"issued":{"date-parts":[["2023",7,27]]}}}],"schema":"https://github.com/citation-style-language/schema/raw/master/csl-citation.json"} </w:instrText>
+      </w:r>
+      <w:r>
+        <w:rPr>
+          <w:rFonts w:ascii="Arial" w:hAnsi="Arial" w:cs="Arial"/>
+        </w:rPr>
+        <w:fldChar w:fldCharType="separate"/>
+      </w:r>
+      <w:r>
+        <w:rPr>
+          <w:rFonts w:ascii="Arial" w:hAnsi="Arial" w:cs="Arial"/>
+        </w:rPr>
+        <w:t>(Smith-Vidaurre et al., 2020, 2023)</w:t>
+      </w:r>
+      <w:r>
+        <w:rPr>
+          <w:rFonts w:ascii="Arial" w:hAnsi="Arial" w:cs="Arial"/>
+        </w:rPr>
+        <w:fldChar w:fldCharType="end"/>
+      </w:r>
+      <w:r>
+        <w:rPr>
+          <w:rFonts w:ascii="Arial" w:hAnsi="Arial" w:cs="Arial"/>
+        </w:rPr>
+        <w:t xml:space="preserve"> and even regional populations </w:t>
+      </w:r>
+      <w:r>
+        <w:rPr>
+          <w:rFonts w:ascii="Arial" w:hAnsi="Arial" w:cs="Arial"/>
+        </w:rPr>
+        <w:fldChar w:fldCharType="begin"/>
+      </w:r>
+      <w:r>
+        <w:rPr>
+          <w:rFonts w:ascii="Arial" w:hAnsi="Arial" w:cs="Arial"/>
+        </w:rPr>
+        <w:instrText xml:space="preserve"> ADDIN ZOTERO_ITEM CSL_CITATION {"citationID":"eXbjAbkv","properties":{"formattedCitation":"(Buhrman-Deever et al., 2007; Smeele et al., 2023)","plainCitation":"(Buhrman-Deever et al., 2007; Smeele et al., 2023)","noteIndex":0},"citationItems":[{"id":595,"uris":["http://zotero.org/groups/5786507/items/WW5ZK4KD"],"itemData":{"id":595,"type":"article-journal","abstract":"Introduced feral populations offer a unique opportunity to study the effects of social interaction and founder effects on the development of geographic variation in learned vocalizations. Introduced populations of Monk Parakeets (Myiopsitta monachus) have been growing in number since the 1970s, with a mixture of isolated and potentially interacting populations. We surveyed diversity in contact calls of Monk Parakeet populations in Connecticut, Texas, Florida, and Louisiana. Contact call structure differed significantly among the isolated populations in each state. Contact call structure also differed significantly among potentially interacting nest colonies in coastal Connecticut, and these differences did not follow a geographic gradient. Limited dispersal distances, founder effects, and social learning preferences may play a role in call structure differences.","container-title":"The Condor","DOI":"10.1093/condor/109.2.389","ISSN":"1938-5129","issue":"2","journalAbbreviation":"The Condor","page":"389-398","source":"Silverchair","title":"Geographic Variation in Contact Calls of Feral North American Populations of the Monk Parakeet","volume":"109","author":[{"family":"Buhrman-Deever","given":"Susannah C."},{"family":"Rappaport","given":"Amy R."},{"family":"Bradbury","given":"Jack W."}],"issued":{"date-parts":[["2007",5,1]]}}},{"id":457,"uris":["http://zotero.org/users/6722993/items/YUE44IAR"],"itemData":{"id":457,"type":"article-journal","abstract":"In humans, identity is partly encoded in a voice-print that is carried across multiple vocalizations. Other species also signal vocal identity in calls, such as shown in the contact call of parrots. However, it remains unclear to what extent other call types in parrots are individually distinct, and whether there is an analogous voice-print across calls. Here we test if an individual signature is present in other call types, how stable this signature is, and if parrots exhibit voice-prints across call types. We recorded 5599 vocalizations from 229 individually marked monk parakeets (\n              Myiopsitta monachus\n              ) over a 2-year period in Barcelona, Spain. We examined five distinct call types, finding evidence for an individual signature in three. We further show that in the contact call, while birds are individually distinct, the calls are more variable than previously assumed, changing over short time scales (seconds to minutes). Finally, we provide evidence for voice-prints across multiple call types, with a discriminant function being able to predict caller identity across call types. This suggests that monk parakeets may be able to use vocal cues to recognize conspecifics, even across vocalization types and without necessarily needing active vocal signatures of identity.","container-title":"Royal Society Open Science","DOI":"10.1098/rsos.230835","ISSN":"2054-5703","issue":"10","journalAbbreviation":"R. Soc. open sci.","language":"en","page":"230835","source":"DOI.org (Crossref)","title":"Evidence for vocal signatures and voice-prints in a wild parrot","volume":"10","author":[{"family":"Smeele","given":"Simeon Q."},{"family":"Senar","given":"Juan Carlos"},{"family":"Aplin","given":"Lucy M."},{"family":"McElreath","given":"Mary Brooke"}],"issued":{"date-parts":[["2023",10]]}}}],"schema":"https://github.com/citation-style-language/schema/raw/master/csl-citation.json"} </w:instrText>
+      </w:r>
+      <w:r>
+        <w:rPr>
+          <w:rFonts w:ascii="Arial" w:hAnsi="Arial" w:cs="Arial"/>
+        </w:rPr>
+        <w:fldChar w:fldCharType="separate"/>
+      </w:r>
+      <w:r>
+        <w:rPr>
+          <w:rFonts w:ascii="Arial" w:hAnsi="Arial" w:cs="Arial"/>
+        </w:rPr>
+        <w:t>(Buhrman-Deever et al., 2007; Smeele et al., 2023)</w:t>
+      </w:r>
+      <w:r>
+        <w:rPr>
+          <w:rFonts w:ascii="Arial" w:hAnsi="Arial" w:cs="Arial"/>
+        </w:rPr>
+        <w:fldChar w:fldCharType="end"/>
+      </w:r>
+      <w:r>
+        <w:rPr>
+          <w:rFonts w:ascii="Arial" w:hAnsi="Arial" w:cs="Arial"/>
+        </w:rPr>
+        <w:t>.</w:t>
+      </w:r>
+      <w:r>
+        <w:rPr>
+          <w:rFonts w:ascii="Arial" w:hAnsi="Arial" w:cs="Arial"/>
+        </w:rPr>
+        <w:t xml:space="preserve"> </w:t>
+      </w:r>
+    </w:p>
+    <w:p>
+      <w:pPr>
+        <w:spacing w:line="360" w:lineRule="auto"/>
+        <w:rPr>
+          <w:rFonts w:ascii="Arial" w:hAnsi="Arial" w:cs="Arial"/>
+        </w:rPr>
+      </w:pPr>
+      <w:r>
+        <w:rPr>
+          <w:rFonts w:ascii="Arial" w:hAnsi="Arial" w:cs="Arial"/>
+        </w:rPr>
+        <w:tab/>
+      </w:r>
+      <w:r>
+        <w:rPr>
+          <w:rFonts w:ascii="Arial" w:hAnsi="Arial" w:cs="Arial"/>
+        </w:rPr>
+        <w:t>Here, we</w:t>
+      </w:r>
+      <w:r>
+        <w:rPr>
+          <w:rFonts w:ascii="Arial" w:hAnsi="Arial" w:cs="Arial"/>
+        </w:rPr>
+        <w:t xml:space="preserve"> use an information theoretic approach</w:t>
+      </w:r>
+      <w:r>
+        <w:rPr>
+          <w:rFonts w:ascii="Arial" w:hAnsi="Arial" w:cs="Arial"/>
+        </w:rPr>
+        <w:t xml:space="preserve"> to encode information </w:t>
+      </w:r>
+      <w:r>
+        <w:rPr>
+          <w:rFonts w:ascii="Arial" w:hAnsi="Arial" w:cs="Arial"/>
+        </w:rPr>
+        <w:t xml:space="preserve">over two social levels in </w:t>
+      </w:r>
+      <w:r>
+        <w:rPr>
+          <w:rFonts w:ascii="Arial" w:hAnsi="Arial" w:cs="Arial"/>
+        </w:rPr>
+        <w:t xml:space="preserve">frequency modulation patterns of </w:t>
+      </w:r>
+      <w:r>
+        <w:rPr>
+          <w:rFonts w:ascii="Arial" w:hAnsi="Arial" w:cs="Arial"/>
+        </w:rPr>
+        <w:t>synthetic</w:t>
+      </w:r>
+      <w:r>
+        <w:rPr>
+          <w:rFonts w:ascii="Arial" w:hAnsi="Arial" w:cs="Arial"/>
+        </w:rPr>
+        <w:t xml:space="preserve"> discrete</w:t>
+      </w:r>
+      <w:r>
+        <w:rPr>
+          <w:rFonts w:ascii="Arial" w:hAnsi="Arial" w:cs="Arial"/>
+        </w:rPr>
+        <w:t xml:space="preserve"> vocaliza</w:t>
+      </w:r>
+      <w:r>
+        <w:rPr>
+          <w:rFonts w:ascii="Arial" w:hAnsi="Arial" w:cs="Arial"/>
+        </w:rPr>
+        <w:t xml:space="preserve">tions. </w:t>
+      </w:r>
+      <w:r>
+        <w:rPr>
+          <w:rFonts w:ascii="Arial" w:hAnsi="Arial" w:cs="Arial"/>
+        </w:rPr>
+        <w:t xml:space="preserve">We then use computational methods that have traditionally been applied to bioacoustics </w:t>
+      </w:r>
+      <w:r>
+        <w:rPr>
+          <w:rFonts w:ascii="Arial" w:hAnsi="Arial" w:cs="Arial"/>
+        </w:rPr>
+        <w:lastRenderedPageBreak/>
+        <w:t xml:space="preserve">datasets to create an “information recovery pipeline” to address the fidelity of these approaches in </w:t>
+      </w:r>
+      <w:r>
+        <w:rPr>
+          <w:rFonts w:ascii="Arial" w:hAnsi="Arial" w:cs="Arial"/>
+        </w:rPr>
+        <w:t xml:space="preserve">detecting </w:t>
+      </w:r>
+      <w:r>
+        <w:rPr>
+          <w:rFonts w:ascii="Arial" w:hAnsi="Arial" w:cs="Arial"/>
+        </w:rPr>
+        <w:t xml:space="preserve">information that was originally encoded in </w:t>
+      </w:r>
+      <w:r>
+        <w:rPr>
+          <w:rFonts w:ascii="Arial" w:hAnsi="Arial" w:cs="Arial"/>
+        </w:rPr>
+        <w:t xml:space="preserve">synthetic </w:t>
+      </w:r>
+      <w:r>
+        <w:rPr>
+          <w:rFonts w:ascii="Arial" w:hAnsi="Arial" w:cs="Arial"/>
+        </w:rPr>
+        <w:t>signal</w:t>
+      </w:r>
+      <w:r>
+        <w:rPr>
+          <w:rFonts w:ascii="Arial" w:hAnsi="Arial" w:cs="Arial"/>
+        </w:rPr>
+        <w:t>s</w:t>
+      </w:r>
+      <w:r>
+        <w:rPr>
+          <w:rFonts w:ascii="Arial" w:hAnsi="Arial" w:cs="Arial"/>
+        </w:rPr>
+        <w:t xml:space="preserve">. </w:t>
+      </w:r>
+      <w:r>
+        <w:rPr>
+          <w:rFonts w:ascii="Arial" w:hAnsi="Arial" w:cs="Arial"/>
+        </w:rPr>
+        <w:t>G</w:t>
+      </w:r>
+      <w:r>
+        <w:rPr>
+          <w:rFonts w:ascii="Arial" w:hAnsi="Arial" w:cs="Arial"/>
+        </w:rPr>
+        <w:t xml:space="preserve">enerating synthetic vocalizations with identity information encoded in frequency modulation patterns </w:t>
+      </w:r>
+      <w:r>
+        <w:rPr>
+          <w:rFonts w:ascii="Arial" w:hAnsi="Arial" w:cs="Arial"/>
+        </w:rPr>
+        <w:t xml:space="preserve">is supported by conceptual frameworks on learned vocal production (Janik &amp; Slater 2000), as well as empirical evidence consistent with information encoding </w:t>
+      </w:r>
+      <w:r>
+        <w:rPr>
+          <w:rFonts w:ascii="Arial" w:hAnsi="Arial" w:cs="Arial"/>
+        </w:rPr>
+        <w:t>in</w:t>
+      </w:r>
+      <w:r>
+        <w:rPr>
+          <w:rFonts w:ascii="Arial" w:hAnsi="Arial" w:cs="Arial"/>
+        </w:rPr>
+        <w:t xml:space="preserve"> t</w:t>
+      </w:r>
+      <w:r>
+        <w:rPr>
+          <w:rFonts w:ascii="Arial" w:hAnsi="Arial" w:cs="Arial"/>
+        </w:rPr>
+        <w:t xml:space="preserve">hese patterns of frequency modulation that </w:t>
+      </w:r>
+      <w:r>
+        <w:rPr>
+          <w:rFonts w:ascii="Arial" w:hAnsi="Arial" w:cs="Arial"/>
+        </w:rPr>
+        <w:t>manifest as the</w:t>
+      </w:r>
+      <w:r>
+        <w:rPr>
+          <w:rFonts w:ascii="Arial" w:hAnsi="Arial" w:cs="Arial"/>
+        </w:rPr>
+        <w:t xml:space="preserve"> overall “shape”</w:t>
+      </w:r>
+      <w:r>
+        <w:rPr>
+          <w:rFonts w:ascii="Arial" w:hAnsi="Arial" w:cs="Arial"/>
+        </w:rPr>
+        <w:t xml:space="preserve"> </w:t>
+      </w:r>
+      <w:r>
+        <w:rPr>
+          <w:rFonts w:ascii="Arial" w:hAnsi="Arial" w:cs="Arial"/>
+        </w:rPr>
+        <w:t>of vocalizations</w:t>
+      </w:r>
+      <w:r>
+        <w:rPr>
+          <w:rFonts w:ascii="Arial" w:hAnsi="Arial" w:cs="Arial"/>
+        </w:rPr>
+        <w:t xml:space="preserve"> </w:t>
+      </w:r>
+      <w:r>
+        <w:rPr>
+          <w:rFonts w:ascii="Arial" w:hAnsi="Arial" w:cs="Arial"/>
+        </w:rPr>
+        <w:t xml:space="preserve">that receivers may use for social recognition </w:t>
+      </w:r>
+      <w:commentRangeStart w:id="19"/>
+      <w:r>
+        <w:rPr>
+          <w:rFonts w:ascii="Arial" w:hAnsi="Arial" w:cs="Arial"/>
+        </w:rPr>
+        <w:fldChar w:fldCharType="begin"/>
+      </w:r>
+      <w:r>
+        <w:rPr>
+          <w:rFonts w:ascii="Arial" w:hAnsi="Arial" w:cs="Arial"/>
+        </w:rPr>
+        <w:instrText xml:space="preserve"> ADDIN ZOTERO_ITEM CSL_CITATION {"citationID":"7UUrcQ7x","properties":{"formattedCitation":"(Berg, Delgado, Okawa, et al., 2011; Janik et al., 2006; Janik &amp; Sayigh, 2013; Wright, 1996)","plainCitation":"(Berg, Delgado, Okawa, et al., 2011; Janik et al., 2006; Janik &amp; Sayigh, 2013; Wright, 1996)","noteIndex":0},"citationItems":[{"id":527,"uris":["http://zotero.org/groups/5786507/items/M5RQLYC2"],"itemData":{"id":527,"type":"article-journal","abstract":"Contact calls function to coordinate movements in a wide variety of social animals. Where population density is high, visibility is low and repeated interactions occur between known social companions, calls are often individually recognizable. Parrots are highly social and make substantial daily movements, which appear to be mediated through contact calling. However, there is little experimental evidence for how free-ranging parrots recognize social companions. We quantified intra- and interindividual variation of contact calls in a banded population of green-rumped parrotlets in Venezuela. Recordings of a sample of males were made on replicate days as they announced their return to incubating mates. Spectrographic structure of these contact calls showed significantly more variation between than within individuals, and calls could be correctly classified to individuals more often than was expected by chance. Males varied across multiple dimensions simultaneously, including duration, frequency and frequency modulation of contact calls. Playback experiments showed that free-ranging female parrotlets responded significantly more often to their mates’ calls than to calls of males of other nests. Mate recognition via contact calls may be selectively advantageous during incubation and brooding if this reduces the potential costs associated with confusing contact calls of mates with those of nonmates, including infanticidal conspecifics.","container-title":"Animal Behaviour","DOI":"10.1016/j.anbehav.2010.10.012","ISSN":"0003-3472","issue":"1","journalAbbreviation":"Animal Behaviour","page":"241-248","source":"ScienceDirect","title":"Contact calls are used for individual mate recognition in free-ranging green-rumped parrotlets, &lt;i&gt;Forpus passerinus&lt;/i&gt;","volume":"81","author":[{"family":"Berg","given":"Karl S."},{"family":"Delgado","given":"Soraya"},{"family":"Okawa","given":"Rae"},{"family":"Beissinger","given":"Steven R."},{"family":"Bradbury","given":"Jack W."}],"issued":{"date-parts":[["2011",1,1]]}}},{"id":569,"uris":["http://zotero.org/groups/5786507/items/JNKBUUG2"],"itemData":{"id":569,"type":"article-journal","container-title":"PNAS","issue":"21","page":"8293-8297","title":"Signature whistle shape conveys identity information to bottlenose dolphins","volume":"103","author":[{"family":"Janik","given":"Vincent M."},{"family":"Sayigh","given":"L.S."},{"family":"Wells","given":"R.S."}],"issued":{"date-parts":[["2006"]]}}},{"id":571,"uris":["http://zotero.org/groups/5786507/items/8JR8VHHB"],"itemData":{"id":571,"type":"article-journal","abstract":"Bottlenose dolphins (Tursiops truncatus) produce individually distinctive signature whistles that broadcast the identity of the caller. Unlike voice cues that affect all calls of an animal, signature whistles are distinct whistle types carrying identity information in their frequency modulation pattern. Signature whistle development is influenced by vocal production learning. Animals use a whistle from their environment as a model, but modify it, and thus invent a novel signal. Dolphins also copy signature whistles of others, effectively addressing the whistle owner. This copying occurs at low rates and the resulting copies are recognizable as such by parameter variations in the copy. Captive dolphins can learn to associate novel whistles with objects and use these whistles to report on the presence or absence of the object. If applied to signature whistles, this ability would make the signature whistle a rare example of a learned referential signal in animals. Here, we review the history of signature whistle research, covering definitions, acoustic features, information content, contextual use, developmental aspects, and species comparisons with mammals and birds. We show how these signals stand out amongst recognition calls in animals and how they contribute to our understanding of complexity in animal communication.","container-title":"Journal of Comparative Physiology A","DOI":"10.1007/s00359-013-0817-7","ISSN":"1432-1351","issue":"6","journalAbbreviation":"J Comp Physiol A","language":"en","page":"479-489","source":"Springer Link","title":"Communication in bottlenose dolphins: 50 years of signature whistle research","title-short":"Communication in bottlenose dolphins","volume":"199","author":[{"family":"Janik","given":"Vincent M."},{"family":"Sayigh","given":"Laela S."}],"issued":{"date-parts":[["2013",6,1]]}}},{"id":519,"uris":["http://zotero.org/groups/5786507/items/CYI2BRGH"],"itemData":{"id":519,"type":"article-journal","abstract":"This study describes a system of regional dialects in the contact call of a parrot, the yellow-naped amazon (Amazona auropalliata.) Spectrographic cross-correlation analyses of calls from multiple adults at 16 roosts in Costa Rica reveal two distinct patterns of geographic variation in call structure: first, variation in the basic structure of the call by which roosts can be classified into three distinct dialects, and second, fine-scale variation of call structure among roosts within a dialect. Some birds at roosts bordering two dialects use the calls of both neighbouring dialects interchangeably. These results suggest that there are two distinct processes governing the diffusion of call types among roosts, with dialect borders acting as barriers to the spread of foreign calls. Such a dialect system could be maintained through either reduced dispersal of birds across dialect boundaries or alternatively, by reduced diffusion of call types. These two possibilities have different implications for the genetic isolation of populations and thus for both speciation and learning. This pattern is broadly similar to those seen in some songbirds and may be maintained in a similar manner.","container-title":"Proceedings of the Royal Society of London. Series B: Biological Sciences","DOI":"10.1098/rspb.1996.0128","issue":"1372","note":"publisher: Royal Society","page":"867-872","source":"royalsocietypublishing.org (Atypon)","title":"Regional dialects in the contact call of a parrot","volume":"263","author":[{"family":"Wright","given":"Timothy F."}],"issued":{"date-parts":[["1996"]]}}}],"schema":"https://github.com/citation-style-language/schema/raw/master/csl-citation.json"} </w:instrText>
+      </w:r>
+      <w:r>
+        <w:rPr>
+          <w:rFonts w:ascii="Arial" w:hAnsi="Arial" w:cs="Arial"/>
+        </w:rPr>
+        <w:fldChar w:fldCharType="separate"/>
+      </w:r>
+      <w:r>
+        <w:rPr>
+          <w:rFonts w:ascii="Arial" w:hAnsi="Arial" w:cs="Arial"/>
+        </w:rPr>
+        <w:t>(Berg, Delgado, Okawa, et al., 2011; Janik et al., 2006; Janik &amp; Sayigh, 2013; Wright, 1996)</w:t>
+      </w:r>
+      <w:r>
+        <w:rPr>
+          <w:rFonts w:ascii="Arial" w:hAnsi="Arial" w:cs="Arial"/>
+        </w:rPr>
+        <w:fldChar w:fldCharType="end"/>
+      </w:r>
+      <w:commentRangeEnd w:id="19"/>
+      <w:r>
+        <w:rPr>
+          <w:rStyle w:val="CommentReference"/>
+        </w:rPr>
+        <w:commentReference w:id="19"/>
+      </w:r>
+      <w:r>
+        <w:rPr>
+          <w:rFonts w:ascii="Arial" w:hAnsi="Arial" w:cs="Arial"/>
+        </w:rPr>
+        <w:t>.</w:t>
+      </w:r>
+      <w:r>
+        <w:rPr>
+          <w:rFonts w:ascii="Arial" w:hAnsi="Arial" w:cs="Arial"/>
+        </w:rPr>
+        <w:t xml:space="preserve"> </w:t>
+      </w:r>
+      <w:r>
+        <w:rPr>
+          <w:rFonts w:ascii="Arial" w:hAnsi="Arial" w:cs="Arial"/>
+        </w:rPr>
+        <w:t xml:space="preserve">Taken together, our dual-step </w:t>
+      </w:r>
+      <w:r>
+        <w:rPr>
+          <w:rFonts w:ascii="Arial" w:hAnsi="Arial" w:cs="Arial"/>
+        </w:rPr>
+        <w:t xml:space="preserve">approach </w:t>
+      </w:r>
+      <w:r>
+        <w:rPr>
+          <w:rFonts w:ascii="Arial" w:hAnsi="Arial" w:cs="Arial"/>
+        </w:rPr>
+        <w:t xml:space="preserve">with synthetic signals and an information theory perspective </w:t>
+      </w:r>
+      <w:r>
+        <w:rPr>
+          <w:rFonts w:ascii="Arial" w:hAnsi="Arial" w:cs="Arial"/>
+        </w:rPr>
+        <w:t>allows us to</w:t>
+      </w:r>
+      <w:r>
+        <w:rPr>
+          <w:rFonts w:ascii="Arial" w:hAnsi="Arial" w:cs="Arial"/>
+        </w:rPr>
+        <w:t xml:space="preserve"> </w:t>
+      </w:r>
+      <w:r>
+        <w:rPr>
+          <w:rFonts w:ascii="Arial" w:hAnsi="Arial" w:cs="Arial"/>
+        </w:rPr>
+        <w:t xml:space="preserve">simplify and control the complex organic process </w:t>
+      </w:r>
+      <w:r>
+        <w:rPr>
+          <w:rFonts w:ascii="Arial" w:hAnsi="Arial" w:cs="Arial"/>
+        </w:rPr>
+        <w:t>of</w:t>
+      </w:r>
+      <w:r>
+        <w:rPr>
+          <w:rFonts w:ascii="Arial" w:hAnsi="Arial" w:cs="Arial"/>
+        </w:rPr>
+        <w:t xml:space="preserve"> signaler</w:t>
+      </w:r>
+      <w:r>
+        <w:rPr>
+          <w:rFonts w:ascii="Arial" w:hAnsi="Arial" w:cs="Arial"/>
+        </w:rPr>
+        <w:t xml:space="preserve"> encoding</w:t>
+      </w:r>
+      <w:r>
+        <w:rPr>
+          <w:rFonts w:ascii="Arial" w:hAnsi="Arial" w:cs="Arial"/>
+        </w:rPr>
+        <w:t xml:space="preserve"> and receiver decoding</w:t>
+      </w:r>
+      <w:r>
+        <w:rPr>
+          <w:rFonts w:ascii="Arial" w:hAnsi="Arial" w:cs="Arial"/>
+        </w:rPr>
+        <w:t xml:space="preserve"> </w:t>
+      </w:r>
+      <w:r>
+        <w:rPr>
+          <w:rFonts w:ascii="Arial" w:hAnsi="Arial" w:cs="Arial"/>
+        </w:rPr>
+        <w:t xml:space="preserve">of </w:t>
+      </w:r>
+      <w:r>
+        <w:rPr>
+          <w:rFonts w:ascii="Arial" w:hAnsi="Arial" w:cs="Arial"/>
+        </w:rPr>
+        <w:t xml:space="preserve">hierarchical </w:t>
+      </w:r>
+      <w:r>
+        <w:rPr>
+          <w:rFonts w:ascii="Arial" w:hAnsi="Arial" w:cs="Arial"/>
+        </w:rPr>
+        <w:t>information</w:t>
+      </w:r>
+      <w:r>
+        <w:rPr>
+          <w:rFonts w:ascii="Arial" w:hAnsi="Arial" w:cs="Arial"/>
+        </w:rPr>
+        <w:t xml:space="preserve">. Our approach also </w:t>
+      </w:r>
+      <w:r>
+        <w:rPr>
+          <w:rFonts w:ascii="Arial" w:hAnsi="Arial" w:cs="Arial"/>
+        </w:rPr>
+        <w:t>facilitates</w:t>
+      </w:r>
+      <w:r>
+        <w:rPr>
+          <w:rFonts w:ascii="Arial" w:hAnsi="Arial" w:cs="Arial"/>
+        </w:rPr>
+        <w:t xml:space="preserve"> </w:t>
+      </w:r>
+      <w:r>
+        <w:rPr>
+          <w:rFonts w:ascii="Arial" w:hAnsi="Arial" w:cs="Arial"/>
+        </w:rPr>
+        <w:t>validating</w:t>
+      </w:r>
+      <w:r>
+        <w:rPr>
+          <w:rFonts w:ascii="Arial" w:hAnsi="Arial" w:cs="Arial"/>
+        </w:rPr>
+        <w:t xml:space="preserve"> </w:t>
+      </w:r>
+      <w:r>
+        <w:rPr>
+          <w:rFonts w:ascii="Arial" w:hAnsi="Arial" w:cs="Arial"/>
+        </w:rPr>
+        <w:t xml:space="preserve">the rigor of </w:t>
+      </w:r>
+      <w:r>
+        <w:rPr>
+          <w:rFonts w:ascii="Arial" w:hAnsi="Arial" w:cs="Arial"/>
+        </w:rPr>
+        <w:t xml:space="preserve">computational tools traditionally used </w:t>
+      </w:r>
+      <w:r>
+        <w:rPr>
+          <w:rFonts w:ascii="Arial" w:hAnsi="Arial" w:cs="Arial"/>
+        </w:rPr>
+        <w:t>for</w:t>
+      </w:r>
+      <w:r>
+        <w:rPr>
+          <w:rFonts w:ascii="Arial" w:hAnsi="Arial" w:cs="Arial"/>
+        </w:rPr>
+        <w:t xml:space="preserve"> functional inferences about </w:t>
+      </w:r>
+      <w:r>
+        <w:rPr>
+          <w:rFonts w:ascii="Arial" w:hAnsi="Arial" w:cs="Arial"/>
+        </w:rPr>
+        <w:t xml:space="preserve">vocal </w:t>
+      </w:r>
+      <w:r>
+        <w:rPr>
+          <w:rFonts w:ascii="Arial" w:hAnsi="Arial" w:cs="Arial"/>
+        </w:rPr>
+        <w:t>information encoding</w:t>
+      </w:r>
+      <w:r>
+        <w:rPr>
+          <w:rFonts w:ascii="Arial" w:hAnsi="Arial" w:cs="Arial"/>
+        </w:rPr>
+        <w:t>.</w:t>
+      </w:r>
+    </w:p>
+    <w:p>
+      <w:pPr>
+        <w:spacing w:line="360" w:lineRule="auto"/>
+        <w:rPr>
+          <w:rFonts w:ascii="Arial" w:hAnsi="Arial" w:cs="Arial"/>
+        </w:rPr>
+      </w:pPr>
+    </w:p>
+    <w:p>
+      <w:pPr>
+        <w:spacing w:line="360" w:lineRule="auto"/>
+        <w:rPr>
+          <w:rFonts w:ascii="Arial" w:hAnsi="Arial" w:cs="Arial"/>
+        </w:rPr>
+      </w:pPr>
+      <w:r>
+        <w:rPr>
+          <w:rFonts w:ascii="Arial" w:hAnsi="Arial" w:cs="Arial"/>
+          <w:b/>
+          <w:bCs/>
+        </w:rPr>
+        <w:t>Methods</w:t>
+      </w:r>
+      <w:r>
+        <w:rPr>
+          <w:rFonts w:ascii="Arial" w:hAnsi="Arial" w:cs="Arial"/>
+        </w:rPr>
+        <w:t>:</w:t>
+      </w:r>
+    </w:p>
+    <w:p>
+      <w:pPr>
+        <w:spacing w:line="360" w:lineRule="auto"/>
         <w:rPr>
           <w:rFonts w:ascii="Arial" w:hAnsi="Arial" w:cs="Arial"/>
           <w:i/>
           <w:iCs/>
         </w:rPr>
-        <w:t xml:space="preserve"> monachus</w:t>
-      </w:r>
-      <w:r>
-        <w:rPr>
-          <w:rFonts w:ascii="Arial" w:hAnsi="Arial" w:cs="Arial"/>
-        </w:rPr>
-        <w:t>)</w:t>
-      </w:r>
-      <w:r>
-        <w:rPr>
-          <w:rFonts w:ascii="Arial" w:hAnsi="Arial" w:cs="Arial"/>
-        </w:rPr>
-        <w:t xml:space="preserve"> </w:t>
-      </w:r>
-      <w:r>
-        <w:rPr>
-          <w:rFonts w:ascii="Arial" w:hAnsi="Arial" w:cs="Arial"/>
-        </w:rPr>
-        <w:t>in</w:t>
-      </w:r>
-      <w:r>
-        <w:rPr>
-          <w:rFonts w:ascii="Arial" w:hAnsi="Arial" w:cs="Arial"/>
-        </w:rPr>
-        <w:t xml:space="preserve"> their native and introduced ranges </w:t>
-      </w:r>
-      <w:r>
-        <w:rPr>
-          <w:rFonts w:ascii="Arial" w:hAnsi="Arial" w:cs="Arial"/>
-        </w:rPr>
-        <w:t>produce</w:t>
-      </w:r>
-      <w:r>
-        <w:rPr>
-          <w:rFonts w:ascii="Arial" w:hAnsi="Arial" w:cs="Arial"/>
-        </w:rPr>
-        <w:t xml:space="preserve"> </w:t>
-      </w:r>
-      <w:r>
-        <w:rPr>
-          <w:rFonts w:ascii="Arial" w:hAnsi="Arial" w:cs="Arial"/>
-        </w:rPr>
-        <w:t>social calls</w:t>
-      </w:r>
-      <w:r>
-        <w:rPr>
-          <w:rFonts w:ascii="Arial" w:hAnsi="Arial" w:cs="Arial"/>
-        </w:rPr>
-        <w:t xml:space="preserve"> </w:t>
-      </w:r>
-      <w:r>
-        <w:rPr>
-          <w:rFonts w:ascii="Arial" w:hAnsi="Arial" w:cs="Arial"/>
-        </w:rPr>
-        <w:t xml:space="preserve">that are individually distinctive but still display statistically significant </w:t>
-      </w:r>
-      <w:r>
-        <w:rPr>
-          <w:rFonts w:ascii="Arial" w:hAnsi="Arial" w:cs="Arial"/>
-        </w:rPr>
-        <w:t>similarity within nesting sites</w:t>
-      </w:r>
-      <w:r>
-        <w:rPr>
-          <w:rFonts w:ascii="Arial" w:hAnsi="Arial" w:cs="Arial"/>
-        </w:rPr>
-        <w:t xml:space="preserve"> </w:t>
-      </w:r>
-      <w:r>
-        <w:rPr>
-          <w:rFonts w:ascii="Arial" w:hAnsi="Arial" w:cs="Arial"/>
-        </w:rPr>
-        <w:fldChar w:fldCharType="begin"/>
-      </w:r>
-      <w:r>
-        <w:rPr>
-          <w:rFonts w:ascii="Arial" w:hAnsi="Arial" w:cs="Arial"/>
-        </w:rPr>
-        <w:instrText xml:space="preserve"> ADDIN ZOTERO_ITEM CSL_CITATION {"citationID":"sOTi377T","properties":{"formattedCitation":"(Smith-Vidaurre et al., 2020, 2023)","plainCitation":"(Smith-Vidaurre et al., 2020, 2023)","noteIndex":0},"citationItems":[{"id":536,"uris":["http://zotero.org/groups/5786507/items/ZNXJZAJT"],"itemData":{"id":536,"type":"article-journal","abstract":"Despite longstanding interest in the evolutionary origins and maintenance of vocal learning, we know relatively little about how social dynamics influence vocal learning processes in natural populations. The “signaling group membership” hypothesis proposes that socially learned calls evolved and are maintained as signals of group membership. However, in fission–fusion societies, individuals can interact in social groups across various social scales. For learned calls to signal group membership over multiple social scales, they must contain information about group membership over each of these scales, a concept termed “hierarchical mapping.” Monk parakeets (Myiopsitta monachus), small parrots native to South America, exhibit vocal mimicry in captivity and fission–fusion social dynamics in the wild. We examined patterns of contact call acoustic similarity in Uruguay to test the hierarchical mapping assumption of the signaling group membership hypothesis. We also asked whether geographic variation patterns matched regional dialects or geographic clines that have been documented in other vocal learning species. We used visual inspection, spectrographic cross-correlation and random forests, a machine learning approach, to evaluate contact call similarity. We compared acoustic similarity across social scales and geographic distance using Mantel tests and spatial autocorrelation. We found high similarity within individuals, and low, albeit significant, similarity within groups at the pair, flock and site social scales. Patterns of acoustic similarity over geographic distance did not match mosaic or graded patterns expected in dialectal or clinal variation. Our findings suggest that monk parakeet social interactions rely more heavily upon individual recognition than group membership at higher social scales.","container-title":"Behavioral Ecology","DOI":"10.1093/beheco/arz202","ISSN":"1045-2249","issue":"2","journalAbbreviation":"Behavioral Ecology","page":"448-458","source":"Silverchair","title":"Individual signatures outweigh social group identity in contact calls of a communally nesting parrot","volume":"31","author":[{"family":"Smith-Vidaurre","given":"Grace"},{"family":"Araya-Salas","given":"Marcelo"},{"family":"Wright","given":"Timothy F"}],"issued":{"date-parts":[["2020",3,20]]}}},{"id":542,"uris":["http://zotero.org/groups/5786507/items/E7IVATDZ"],"itemData":{"id":542,"type":"article-journal","abstract":"Animals can actively encode different types of identity information in learned communication signals, such as group membership or individual identity. The social environments in which animals interact may favor different types of information, but whether identity information conveyed in learned signals is robust or responsive to social disruption over short evolutionary timescales is not well understood. We inferred the type of identity information that was most salient in vocal signals by combining computational tools, including supervised machine learning, with a conceptual framework of “hierarchical mapping”, or patterns of relative acoustic convergence across social scales. We used populations of a vocal learning species as a natural experiment to test whether the type of identity information emphasized in learned vocalizations changed in populations that experienced the social disruption of introduction into new parts of the world. We compared the social scales with the most salient identity information among native and introduced range monk parakeet (Myiopsitta monachus) calls recorded in Uruguay and the United States, respectively. We also evaluated whether the identity information emphasized in introduced range calls changed over time. To place our findings in an evolutionary context, we compared our results with another parrot species that exhibits well-established and distinctive regional vocal dialects that are consistent with signaling group identity. We found that both native and introduced range monk parakeet calls displayed the strongest convergence at the individual scale and minimal convergence within sites. We did not identify changes in the strength of acoustic convergence within sites over time in the introduced range calls. These results indicate that the individual identity information in learned vocalizations did not change over short evolutionary timescales in populations that experienced the social disruption of introduction. Our findings point to exciting new research directions about the robustness or responsiveness of communication systems over different evolutionary timescales.","container-title":"PLOS Computational Biology","DOI":"10.1371/journal.pcbi.1011231","ISSN":"1553-7358","issue":"7","journalAbbreviation":"PLOS Computational Biology","language":"en","note":"publisher: Public Library of Science","page":"e1011231","source":"PLoS Journals","title":"Individual identity information persists in learned calls of introduced parrot populations","volume":"19","author":[{"family":"Smith-Vidaurre","given":"Grace"},{"family":"Pérez-Marrufo","given":"Valeria"},{"family":"Hobson","given":"Elizabeth A."},{"family":"Salinas-Melgoza","given":"Alejandro"},{"family":"Wright","given":"Timothy F."}],"issued":{"date-parts":[["2023",7,27]]}}}],"schema":"https://github.com/citation-style-language/schema/raw/master/csl-citation.json"} </w:instrText>
-      </w:r>
-      <w:r>
-        <w:rPr>
-          <w:rFonts w:ascii="Arial" w:hAnsi="Arial" w:cs="Arial"/>
-        </w:rPr>
-        <w:fldChar w:fldCharType="separate"/>
-      </w:r>
-      <w:r>
-        <w:rPr>
-          <w:rFonts w:ascii="Arial" w:hAnsi="Arial" w:cs="Arial"/>
-        </w:rPr>
-        <w:t>(Smith-Vidaurre et al., 2020, 2023)</w:t>
-      </w:r>
-      <w:r>
-        <w:rPr>
-          <w:rFonts w:ascii="Arial" w:hAnsi="Arial" w:cs="Arial"/>
-        </w:rPr>
-        <w:fldChar w:fldCharType="end"/>
-      </w:r>
-      <w:r>
-        <w:rPr>
-          <w:rFonts w:ascii="Arial" w:hAnsi="Arial" w:cs="Arial"/>
-        </w:rPr>
-        <w:t xml:space="preserve"> and even regional populations </w:t>
-      </w:r>
-      <w:r>
-        <w:rPr>
-          <w:rFonts w:ascii="Arial" w:hAnsi="Arial" w:cs="Arial"/>
-        </w:rPr>
-        <w:fldChar w:fldCharType="begin"/>
-      </w:r>
-      <w:r>
-        <w:rPr>
-          <w:rFonts w:ascii="Arial" w:hAnsi="Arial" w:cs="Arial"/>
-        </w:rPr>
-        <w:instrText xml:space="preserve"> ADDIN ZOTERO_ITEM CSL_CITATION {"citationID":"eXbjAbkv","properties":{"formattedCitation":"(Buhrman-Deever et al., 2007; Smeele et al., 2023)","plainCitation":"(Buhrman-Deever et al., 2007; Smeele et al., 2023)","noteIndex":0},"citationItems":[{"id":595,"uris":["http://zotero.org/groups/5786507/items/WW5ZK4KD"],"itemData":{"id":595,"type":"article-journal","abstract":"Introduced feral populations offer a unique opportunity to study the effects of social interaction and founder effects on the development of geographic variation in learned vocalizations. Introduced populations of Monk Parakeets (Myiopsitta monachus) have been growing in number since the 1970s, with a mixture of isolated and potentially interacting populations. We surveyed diversity in contact calls of Monk Parakeet populations in Connecticut, Texas, Florida, and Louisiana. Contact call structure differed significantly among the isolated populations in each state. Contact call structure also differed significantly among potentially interacting nest colonies in coastal Connecticut, and these differences did not follow a geographic gradient. Limited dispersal distances, founder effects, and social learning preferences may play a role in call structure differences.","container-title":"The Condor","DOI":"10.1093/condor/109.2.389","ISSN":"1938-5129","issue":"2","journalAbbreviation":"The Condor","page":"389-398","source":"Silverchair","title":"Geographic Variation in Contact Calls of Feral North American Populations of the Monk Parakeet","volume":"109","author":[{"family":"Buhrman-Deever","given":"Susannah C."},{"family":"Rappaport","given":"Amy R."},{"family":"Bradbury","given":"Jack W."}],"issued":{"date-parts":[["2007",5,1]]}}},{"id":457,"uris":["http://zotero.org/users/6722993/items/YUE44IAR"],"itemData":{"id":457,"type":"article-journal","abstract":"In humans, identity is partly encoded in a voice-print that is carried across multiple vocalizations. Other species also signal vocal identity in calls, such as shown in the contact call of parrots. However, it remains unclear to what extent other call types in parrots are individually distinct, and whether there is an analogous voice-print across calls. Here we test if an individual signature is present in other call types, how stable this signature is, and if parrots exhibit voice-prints across call types. We recorded 5599 vocalizations from 229 individually marked monk parakeets (\n              Myiopsitta monachus\n              ) over a 2-year period in Barcelona, Spain. We examined five distinct call types, finding evidence for an individual signature in three. We further show that in the contact call, while birds are individually distinct, the calls are more variable than previously assumed, changing over short time scales (seconds to minutes). Finally, we provide evidence for voice-prints across multiple call types, with a discriminant function being able to predict caller identity across call types. This suggests that monk parakeets may be able to use vocal cues to recognize conspecifics, even across vocalization types and without necessarily needing active vocal signatures of identity.","container-title":"Royal Society Open Science","DOI":"10.1098/rsos.230835","ISSN":"2054-5703","issue":"10","journalAbbreviation":"R. Soc. open sci.","language":"en","page":"230835","source":"DOI.org (Crossref)","title":"Evidence for vocal signatures and voice-prints in a wild parrot","volume":"10","author":[{"family":"Smeele","given":"Simeon Q."},{"family":"Senar","given":"Juan Carlos"},{"family":"Aplin","given":"Lucy M."},{"family":"McElreath","given":"Mary Brooke"}],"issued":{"date-parts":[["2023",10]]}}}],"schema":"https://github.com/citation-style-language/schema/raw/master/csl-citation.json"} </w:instrText>
-      </w:r>
-      <w:r>
-        <w:rPr>
-          <w:rFonts w:ascii="Arial" w:hAnsi="Arial" w:cs="Arial"/>
-        </w:rPr>
-        <w:fldChar w:fldCharType="separate"/>
-      </w:r>
-      <w:r>
-        <w:rPr>
-          <w:rFonts w:ascii="Arial" w:hAnsi="Arial" w:cs="Arial"/>
-        </w:rPr>
-        <w:t>(Buhrman-Deever et al., 2007; Smeele et al., 2023)</w:t>
-      </w:r>
-      <w:r>
-        <w:rPr>
-          <w:rFonts w:ascii="Arial" w:hAnsi="Arial" w:cs="Arial"/>
-        </w:rPr>
-        <w:fldChar w:fldCharType="end"/>
-      </w:r>
-      <w:r>
-        <w:rPr>
-          <w:rFonts w:ascii="Arial" w:hAnsi="Arial" w:cs="Arial"/>
-        </w:rPr>
-        <w:t>.</w:t>
-      </w:r>
-      <w:r>
-        <w:rPr>
-          <w:rFonts w:ascii="Arial" w:hAnsi="Arial" w:cs="Arial"/>
-        </w:rPr>
-        <w:t xml:space="preserve"> </w:t>
-      </w:r>
-    </w:p>
-    <w:p>
-      <w:pPr>
-        <w:spacing w:line="360" w:lineRule="auto"/>
-        <w:rPr>
-          <w:rFonts w:ascii="Arial" w:hAnsi="Arial" w:cs="Arial"/>
-        </w:rPr>
-      </w:pPr>
-      <w:r>
-        <w:rPr>
-          <w:rFonts w:ascii="Arial" w:hAnsi="Arial" w:cs="Arial"/>
-        </w:rPr>
-        <w:tab/>
-      </w:r>
-      <w:r>
-        <w:rPr>
-          <w:rFonts w:ascii="Arial" w:hAnsi="Arial" w:cs="Arial"/>
-        </w:rPr>
-        <w:t>Here, we</w:t>
-      </w:r>
-      <w:r>
-        <w:rPr>
-          <w:rFonts w:ascii="Arial" w:hAnsi="Arial" w:cs="Arial"/>
-        </w:rPr>
-        <w:t xml:space="preserve"> use an information theoretic approach</w:t>
-      </w:r>
-      <w:r>
-        <w:rPr>
-          <w:rFonts w:ascii="Arial" w:hAnsi="Arial" w:cs="Arial"/>
-        </w:rPr>
-        <w:t xml:space="preserve"> to encode information </w:t>
-      </w:r>
-      <w:r>
-        <w:rPr>
-          <w:rFonts w:ascii="Arial" w:hAnsi="Arial" w:cs="Arial"/>
-        </w:rPr>
-        <w:t xml:space="preserve">over two social levels in </w:t>
-      </w:r>
-      <w:r>
-        <w:rPr>
-          <w:rFonts w:ascii="Arial" w:hAnsi="Arial" w:cs="Arial"/>
-        </w:rPr>
-        <w:t xml:space="preserve">frequency modulation patterns of </w:t>
-      </w:r>
-      <w:r>
-        <w:rPr>
-          <w:rFonts w:ascii="Arial" w:hAnsi="Arial" w:cs="Arial"/>
-        </w:rPr>
-        <w:t>synthetic</w:t>
-      </w:r>
-      <w:r>
-        <w:rPr>
-          <w:rFonts w:ascii="Arial" w:hAnsi="Arial" w:cs="Arial"/>
-        </w:rPr>
-        <w:t xml:space="preserve"> discrete</w:t>
-      </w:r>
-      <w:r>
-        <w:rPr>
-          <w:rFonts w:ascii="Arial" w:hAnsi="Arial" w:cs="Arial"/>
-        </w:rPr>
-        <w:t xml:space="preserve"> vocaliza</w:t>
-      </w:r>
-      <w:r>
-        <w:rPr>
-          <w:rFonts w:ascii="Arial" w:hAnsi="Arial" w:cs="Arial"/>
-        </w:rPr>
-        <w:t xml:space="preserve">tions. </w:t>
-      </w:r>
-      <w:r>
-        <w:rPr>
-          <w:rFonts w:ascii="Arial" w:hAnsi="Arial" w:cs="Arial"/>
-        </w:rPr>
-        <w:t xml:space="preserve">We then use computational methods that have traditionally been applied to bioacoustics </w:t>
-      </w:r>
-      <w:r>
-        <w:rPr>
-          <w:rFonts w:ascii="Arial" w:hAnsi="Arial" w:cs="Arial"/>
-        </w:rPr>
-        <w:lastRenderedPageBreak/>
-        <w:t xml:space="preserve">datasets to create an “information recovery pipeline” to address the fidelity of these approaches in </w:t>
-      </w:r>
-      <w:r>
-        <w:rPr>
-          <w:rFonts w:ascii="Arial" w:hAnsi="Arial" w:cs="Arial"/>
-        </w:rPr>
-        <w:t xml:space="preserve">detecting </w:t>
-      </w:r>
-      <w:r>
-        <w:rPr>
-          <w:rFonts w:ascii="Arial" w:hAnsi="Arial" w:cs="Arial"/>
-        </w:rPr>
-        <w:t xml:space="preserve">information that was originally encoded in </w:t>
-      </w:r>
-      <w:r>
-        <w:rPr>
-          <w:rFonts w:ascii="Arial" w:hAnsi="Arial" w:cs="Arial"/>
-        </w:rPr>
-        <w:t xml:space="preserve">synthetic </w:t>
-      </w:r>
-      <w:r>
-        <w:rPr>
-          <w:rFonts w:ascii="Arial" w:hAnsi="Arial" w:cs="Arial"/>
-        </w:rPr>
-        <w:t>signal</w:t>
-      </w:r>
-      <w:r>
-        <w:rPr>
-          <w:rFonts w:ascii="Arial" w:hAnsi="Arial" w:cs="Arial"/>
-        </w:rPr>
-        <w:t>s</w:t>
-      </w:r>
-      <w:r>
-        <w:rPr>
-          <w:rFonts w:ascii="Arial" w:hAnsi="Arial" w:cs="Arial"/>
-        </w:rPr>
-        <w:t xml:space="preserve">. </w:t>
-      </w:r>
-      <w:r>
-        <w:rPr>
-          <w:rFonts w:ascii="Arial" w:hAnsi="Arial" w:cs="Arial"/>
-        </w:rPr>
-        <w:t>G</w:t>
-      </w:r>
-      <w:r>
-        <w:rPr>
-          <w:rFonts w:ascii="Arial" w:hAnsi="Arial" w:cs="Arial"/>
-        </w:rPr>
-        <w:t xml:space="preserve">enerating synthetic vocalizations with identity information encoded in frequency modulation patterns </w:t>
-      </w:r>
-      <w:r>
-        <w:rPr>
-          <w:rFonts w:ascii="Arial" w:hAnsi="Arial" w:cs="Arial"/>
-        </w:rPr>
-        <w:t xml:space="preserve">is supported by conceptual frameworks on learned vocal production (Janik &amp; Slater 2000), as well as empirical evidence consistent with information encoding </w:t>
-      </w:r>
-      <w:r>
-        <w:rPr>
-          <w:rFonts w:ascii="Arial" w:hAnsi="Arial" w:cs="Arial"/>
-        </w:rPr>
-        <w:t>in</w:t>
-      </w:r>
-      <w:r>
-        <w:rPr>
-          <w:rFonts w:ascii="Arial" w:hAnsi="Arial" w:cs="Arial"/>
-        </w:rPr>
-        <w:t xml:space="preserve"> t</w:t>
-      </w:r>
-      <w:r>
-        <w:rPr>
-          <w:rFonts w:ascii="Arial" w:hAnsi="Arial" w:cs="Arial"/>
-        </w:rPr>
-        <w:t xml:space="preserve">hese patterns of frequency modulation that </w:t>
-      </w:r>
-      <w:r>
-        <w:rPr>
-          <w:rFonts w:ascii="Arial" w:hAnsi="Arial" w:cs="Arial"/>
-        </w:rPr>
-        <w:t>manifest as the</w:t>
-      </w:r>
-      <w:r>
-        <w:rPr>
-          <w:rFonts w:ascii="Arial" w:hAnsi="Arial" w:cs="Arial"/>
-        </w:rPr>
-        <w:t xml:space="preserve"> overall “shape”</w:t>
-      </w:r>
-      <w:r>
-        <w:rPr>
-          <w:rFonts w:ascii="Arial" w:hAnsi="Arial" w:cs="Arial"/>
-        </w:rPr>
-        <w:t xml:space="preserve"> </w:t>
-      </w:r>
-      <w:r>
-        <w:rPr>
-          <w:rFonts w:ascii="Arial" w:hAnsi="Arial" w:cs="Arial"/>
-        </w:rPr>
-        <w:t>of vocalizations</w:t>
-      </w:r>
-      <w:r>
-        <w:rPr>
-          <w:rFonts w:ascii="Arial" w:hAnsi="Arial" w:cs="Arial"/>
-        </w:rPr>
-        <w:t xml:space="preserve"> </w:t>
-      </w:r>
-      <w:r>
-        <w:rPr>
-          <w:rFonts w:ascii="Arial" w:hAnsi="Arial" w:cs="Arial"/>
-        </w:rPr>
-        <w:t xml:space="preserve">that receivers may use for social recognition </w:t>
-      </w:r>
-      <w:commentRangeStart w:id="19"/>
-      <w:r>
-        <w:rPr>
-          <w:rFonts w:ascii="Arial" w:hAnsi="Arial" w:cs="Arial"/>
-        </w:rPr>
-        <w:fldChar w:fldCharType="begin"/>
-      </w:r>
-      <w:r>
-        <w:rPr>
-          <w:rFonts w:ascii="Arial" w:hAnsi="Arial" w:cs="Arial"/>
-        </w:rPr>
-        <w:instrText xml:space="preserve"> ADDIN ZOTERO_ITEM CSL_CITATION {"citationID":"7UUrcQ7x","properties":{"formattedCitation":"(Berg, Delgado, Okawa, et al., 2011; Janik et al., 2006; Janik &amp; Sayigh, 2013; Wright, 1996)","plainCitation":"(Berg, Delgado, Okawa, et al., 2011; Janik et al., 2006; Janik &amp; Sayigh, 2013; Wright, 1996)","noteIndex":0},"citationItems":[{"id":527,"uris":["http://zotero.org/groups/5786507/items/M5RQLYC2"],"itemData":{"id":527,"type":"article-journal","abstract":"Contact calls function to coordinate movements in a wide variety of social animals. Where population density is high, visibility is low and repeated interactions occur between known social companions, calls are often individually recognizable. Parrots are highly social and make substantial daily movements, which appear to be mediated through contact calling. However, there is little experimental evidence for how free-ranging parrots recognize social companions. We quantified intra- and interindividual variation of contact calls in a banded population of green-rumped parrotlets in Venezuela. Recordings of a sample of males were made on replicate days as they announced their return to incubating mates. Spectrographic structure of these contact calls showed significantly more variation between than within individuals, and calls could be correctly classified to individuals more often than was expected by chance. Males varied across multiple dimensions simultaneously, including duration, frequency and frequency modulation of contact calls. Playback experiments showed that free-ranging female parrotlets responded significantly more often to their mates’ calls than to calls of males of other nests. Mate recognition via contact calls may be selectively advantageous during incubation and brooding if this reduces the potential costs associated with confusing contact calls of mates with those of nonmates, including infanticidal conspecifics.","container-title":"Animal Behaviour","DOI":"10.1016/j.anbehav.2010.10.012","ISSN":"0003-3472","issue":"1","journalAbbreviation":"Animal Behaviour","page":"241-248","source":"ScienceDirect","title":"Contact calls are used for individual mate recognition in free-ranging green-rumped parrotlets, &lt;i&gt;Forpus passerinus&lt;/i&gt;","volume":"81","author":[{"family":"Berg","given":"Karl S."},{"family":"Delgado","given":"Soraya"},{"family":"Okawa","given":"Rae"},{"family":"Beissinger","given":"Steven R."},{"family":"Bradbury","given":"Jack W."}],"issued":{"date-parts":[["2011",1,1]]}}},{"id":569,"uris":["http://zotero.org/groups/5786507/items/JNKBUUG2"],"itemData":{"id":569,"type":"article-journal","container-title":"PNAS","issue":"21","page":"8293-8297","title":"Signature whistle shape conveys identity information to bottlenose dolphins","volume":"103","author":[{"family":"Janik","given":"Vincent M."},{"family":"Sayigh","given":"L.S."},{"family":"Wells","given":"R.S."}],"issued":{"date-parts":[["2006"]]}}},{"id":571,"uris":["http://zotero.org/groups/5786507/items/8JR8VHHB"],"itemData":{"id":571,"type":"article-journal","abstract":"Bottlenose dolphins (Tursiops truncatus) produce individually distinctive signature whistles that broadcast the identity of the caller. Unlike voice cues that affect all calls of an animal, signature whistles are distinct whistle types carrying identity information in their frequency modulation pattern. Signature whistle development is influenced by vocal production learning. Animals use a whistle from their environment as a model, but modify it, and thus invent a novel signal. Dolphins also copy signature whistles of others, effectively addressing the whistle owner. This copying occurs at low rates and the resulting copies are recognizable as such by parameter variations in the copy. Captive dolphins can learn to associate novel whistles with objects and use these whistles to report on the presence or absence of the object. If applied to signature whistles, this ability would make the signature whistle a rare example of a learned referential signal in animals. Here, we review the history of signature whistle research, covering definitions, acoustic features, information content, contextual use, developmental aspects, and species comparisons with mammals and birds. We show how these signals stand out amongst recognition calls in animals and how they contribute to our understanding of complexity in animal communication.","container-title":"Journal of Comparative Physiology A","DOI":"10.1007/s00359-013-0817-7","ISSN":"1432-1351","issue":"6","journalAbbreviation":"J Comp Physiol A","language":"en","page":"479-489","source":"Springer Link","title":"Communication in bottlenose dolphins: 50 years of signature whistle research","title-short":"Communication in bottlenose dolphins","volume":"199","author":[{"family":"Janik","given":"Vincent M."},{"family":"Sayigh","given":"Laela S."}],"issued":{"date-parts":[["2013",6,1]]}}},{"id":519,"uris":["http://zotero.org/groups/5786507/items/CYI2BRGH"],"itemData":{"id":519,"type":"article-journal","abstract":"This study describes a system of regional dialects in the contact call of a parrot, the yellow-naped amazon (Amazona auropalliata.) Spectrographic cross-correlation analyses of calls from multiple adults at 16 roosts in Costa Rica reveal two distinct patterns of geographic variation in call structure: first, variation in the basic structure of the call by which roosts can be classified into three distinct dialects, and second, fine-scale variation of call structure among roosts within a dialect. Some birds at roosts bordering two dialects use the calls of both neighbouring dialects interchangeably. These results suggest that there are two distinct processes governing the diffusion of call types among roosts, with dialect borders acting as barriers to the spread of foreign calls. Such a dialect system could be maintained through either reduced dispersal of birds across dialect boundaries or alternatively, by reduced diffusion of call types. These two possibilities have different implications for the genetic isolation of populations and thus for both speciation and learning. This pattern is broadly similar to those seen in some songbirds and may be maintained in a similar manner.","container-title":"Proceedings of the Royal Society of London. Series B: Biological Sciences","DOI":"10.1098/rspb.1996.0128","issue":"1372","note":"publisher: Royal Society","page":"867-872","source":"royalsocietypublishing.org (Atypon)","title":"Regional dialects in the contact call of a parrot","volume":"263","author":[{"family":"Wright","given":"Timothy F."}],"issued":{"date-parts":[["1996"]]}}}],"schema":"https://github.com/citation-style-language/schema/raw/master/csl-citation.json"} </w:instrText>
-      </w:r>
-      <w:r>
-        <w:rPr>
-          <w:rFonts w:ascii="Arial" w:hAnsi="Arial" w:cs="Arial"/>
-        </w:rPr>
-        <w:fldChar w:fldCharType="separate"/>
-      </w:r>
-      <w:r>
-        <w:rPr>
-          <w:rFonts w:ascii="Arial" w:hAnsi="Arial" w:cs="Arial"/>
-        </w:rPr>
-        <w:t>(Berg, Delgado, Okawa, et al., 2011; Janik et al., 2006; Janik &amp; Sayigh, 2013; Wright, 1996)</w:t>
-      </w:r>
-      <w:r>
-        <w:rPr>
-          <w:rFonts w:ascii="Arial" w:hAnsi="Arial" w:cs="Arial"/>
-        </w:rPr>
-        <w:fldChar w:fldCharType="end"/>
-      </w:r>
-      <w:commentRangeEnd w:id="19"/>
-      <w:r>
-        <w:rPr>
-          <w:rStyle w:val="CommentReference"/>
-        </w:rPr>
-        <w:commentReference w:id="19"/>
-      </w:r>
-      <w:r>
-        <w:rPr>
-          <w:rFonts w:ascii="Arial" w:hAnsi="Arial" w:cs="Arial"/>
-        </w:rPr>
-        <w:t>.</w:t>
-      </w:r>
-      <w:r>
-        <w:rPr>
-          <w:rFonts w:ascii="Arial" w:hAnsi="Arial" w:cs="Arial"/>
-        </w:rPr>
-        <w:t xml:space="preserve"> </w:t>
-      </w:r>
-      <w:r>
-        <w:rPr>
-          <w:rFonts w:ascii="Arial" w:hAnsi="Arial" w:cs="Arial"/>
-        </w:rPr>
-        <w:t xml:space="preserve">Taken together, our dual-step </w:t>
-      </w:r>
-      <w:r>
-        <w:rPr>
-          <w:rFonts w:ascii="Arial" w:hAnsi="Arial" w:cs="Arial"/>
-        </w:rPr>
-        <w:t xml:space="preserve">approach </w:t>
-      </w:r>
-      <w:r>
-        <w:rPr>
-          <w:rFonts w:ascii="Arial" w:hAnsi="Arial" w:cs="Arial"/>
-        </w:rPr>
-        <w:t xml:space="preserve">with synthetic signals and an information theory perspective </w:t>
-      </w:r>
-      <w:r>
-        <w:rPr>
-          <w:rFonts w:ascii="Arial" w:hAnsi="Arial" w:cs="Arial"/>
-        </w:rPr>
-        <w:t>allows us to</w:t>
-      </w:r>
-      <w:r>
-        <w:rPr>
-          <w:rFonts w:ascii="Arial" w:hAnsi="Arial" w:cs="Arial"/>
-        </w:rPr>
-        <w:t xml:space="preserve"> </w:t>
-      </w:r>
-      <w:r>
-        <w:rPr>
-          <w:rFonts w:ascii="Arial" w:hAnsi="Arial" w:cs="Arial"/>
-        </w:rPr>
-        <w:t xml:space="preserve">simplify and control the complex organic process </w:t>
-      </w:r>
-      <w:r>
-        <w:rPr>
-          <w:rFonts w:ascii="Arial" w:hAnsi="Arial" w:cs="Arial"/>
-        </w:rPr>
-        <w:t>of</w:t>
-      </w:r>
-      <w:r>
-        <w:rPr>
-          <w:rFonts w:ascii="Arial" w:hAnsi="Arial" w:cs="Arial"/>
-        </w:rPr>
-        <w:t xml:space="preserve"> signaler</w:t>
-      </w:r>
-      <w:r>
-        <w:rPr>
-          <w:rFonts w:ascii="Arial" w:hAnsi="Arial" w:cs="Arial"/>
-        </w:rPr>
-        <w:t xml:space="preserve"> encoding</w:t>
-      </w:r>
-      <w:r>
-        <w:rPr>
-          <w:rFonts w:ascii="Arial" w:hAnsi="Arial" w:cs="Arial"/>
-        </w:rPr>
-        <w:t xml:space="preserve"> and receiver decoding</w:t>
-      </w:r>
-      <w:r>
-        <w:rPr>
-          <w:rFonts w:ascii="Arial" w:hAnsi="Arial" w:cs="Arial"/>
-        </w:rPr>
-        <w:t xml:space="preserve"> </w:t>
-      </w:r>
-      <w:r>
-        <w:rPr>
-          <w:rFonts w:ascii="Arial" w:hAnsi="Arial" w:cs="Arial"/>
-        </w:rPr>
-        <w:t xml:space="preserve">of </w:t>
-      </w:r>
-      <w:r>
-        <w:rPr>
-          <w:rFonts w:ascii="Arial" w:hAnsi="Arial" w:cs="Arial"/>
-        </w:rPr>
-        <w:t xml:space="preserve">hierarchical </w:t>
-      </w:r>
-      <w:r>
-        <w:rPr>
-          <w:rFonts w:ascii="Arial" w:hAnsi="Arial" w:cs="Arial"/>
-        </w:rPr>
-        <w:t>information</w:t>
-      </w:r>
-      <w:r>
-        <w:rPr>
-          <w:rFonts w:ascii="Arial" w:hAnsi="Arial" w:cs="Arial"/>
-        </w:rPr>
-        <w:t xml:space="preserve">. Our approach also </w:t>
-      </w:r>
-      <w:r>
-        <w:rPr>
-          <w:rFonts w:ascii="Arial" w:hAnsi="Arial" w:cs="Arial"/>
-        </w:rPr>
-        <w:t>facilitates</w:t>
-      </w:r>
-      <w:r>
-        <w:rPr>
-          <w:rFonts w:ascii="Arial" w:hAnsi="Arial" w:cs="Arial"/>
-        </w:rPr>
-        <w:t xml:space="preserve"> </w:t>
-      </w:r>
-      <w:r>
-        <w:rPr>
-          <w:rFonts w:ascii="Arial" w:hAnsi="Arial" w:cs="Arial"/>
-        </w:rPr>
-        <w:t>validating</w:t>
-      </w:r>
-      <w:r>
-        <w:rPr>
-          <w:rFonts w:ascii="Arial" w:hAnsi="Arial" w:cs="Arial"/>
-        </w:rPr>
-        <w:t xml:space="preserve"> </w:t>
-      </w:r>
-      <w:r>
-        <w:rPr>
-          <w:rFonts w:ascii="Arial" w:hAnsi="Arial" w:cs="Arial"/>
-        </w:rPr>
-        <w:t xml:space="preserve">the rigor of </w:t>
-      </w:r>
-      <w:r>
-        <w:rPr>
-          <w:rFonts w:ascii="Arial" w:hAnsi="Arial" w:cs="Arial"/>
-        </w:rPr>
-        <w:t xml:space="preserve">computational tools traditionally used </w:t>
-      </w:r>
-      <w:r>
-        <w:rPr>
-          <w:rFonts w:ascii="Arial" w:hAnsi="Arial" w:cs="Arial"/>
-        </w:rPr>
-        <w:t>for</w:t>
-      </w:r>
-      <w:r>
-        <w:rPr>
-          <w:rFonts w:ascii="Arial" w:hAnsi="Arial" w:cs="Arial"/>
-        </w:rPr>
-        <w:t xml:space="preserve"> functional inferences about </w:t>
-      </w:r>
-      <w:r>
-        <w:rPr>
-          <w:rFonts w:ascii="Arial" w:hAnsi="Arial" w:cs="Arial"/>
-        </w:rPr>
-        <w:t xml:space="preserve">vocal </w:t>
-      </w:r>
-      <w:r>
-        <w:rPr>
-          <w:rFonts w:ascii="Arial" w:hAnsi="Arial" w:cs="Arial"/>
-        </w:rPr>
-        <w:t>information encoding</w:t>
-      </w:r>
-      <w:r>
-        <w:rPr>
-          <w:rFonts w:ascii="Arial" w:hAnsi="Arial" w:cs="Arial"/>
-        </w:rPr>
-        <w:t>.</w:t>
-      </w:r>
-    </w:p>
-    <w:p>
-      <w:pPr>
-        <w:spacing w:line="360" w:lineRule="auto"/>
-        <w:rPr>
-          <w:rFonts w:ascii="Arial" w:hAnsi="Arial" w:cs="Arial"/>
-        </w:rPr>
-      </w:pPr>
-    </w:p>
-    <w:p>
-      <w:pPr>
-        <w:spacing w:line="360" w:lineRule="auto"/>
-        <w:rPr>
-          <w:rFonts w:ascii="Arial" w:hAnsi="Arial" w:cs="Arial"/>
-        </w:rPr>
-      </w:pPr>
-      <w:r>
-        <w:rPr>
-          <w:rFonts w:ascii="Arial" w:hAnsi="Arial" w:cs="Arial"/>
-          <w:b/>
-          <w:bCs/>
-        </w:rPr>
-        <w:t>Methods</w:t>
-      </w:r>
-      <w:r>
-        <w:rPr>
-          <w:rFonts w:ascii="Arial" w:hAnsi="Arial" w:cs="Arial"/>
-        </w:rPr>
-        <w:t>:</w:t>
-      </w:r>
-    </w:p>
-    <w:p>
-      <w:pPr>
-        <w:spacing w:line="360" w:lineRule="auto"/>
+      </w:pPr>
+      <w:r>
         <w:rPr>
           <w:rFonts w:ascii="Arial" w:hAnsi="Arial" w:cs="Arial"/>
           <w:i/>
           <w:iCs/>
         </w:rPr>
-      </w:pPr>
-      <w:r>
-        <w:rPr>
-          <w:rFonts w:ascii="Arial" w:hAnsi="Arial" w:cs="Arial"/>
-          <w:i/>
-          <w:iCs/>
-        </w:rPr>
         <w:t>Encoding Group and Individual Identity Information in Signals</w:t>
       </w:r>
     </w:p>
@@ -3775,19 +3733,11 @@
         </w:rPr>
         <w:t xml:space="preserve">Once character strings were generated, we </w:t>
       </w:r>
-      <w:proofErr w:type="gramStart"/>
-      <w:r>
-        <w:rPr>
-          <w:rFonts w:ascii="Arial" w:hAnsi="Arial" w:cs="Arial"/>
-        </w:rPr>
-        <w:t>added</w:t>
-      </w:r>
-      <w:proofErr w:type="gramEnd"/>
-      <w:r>
-        <w:rPr>
-          <w:rFonts w:ascii="Arial" w:hAnsi="Arial" w:cs="Arial"/>
-        </w:rPr>
-        <w:t xml:space="preserve"> random variation</w:t>
+      <w:r>
+        <w:rPr>
+          <w:rFonts w:ascii="Arial" w:hAnsi="Arial" w:cs="Arial"/>
+        </w:rPr>
+        <w:t>added random variation</w:t>
       </w:r>
       <w:r>
         <w:rPr>
@@ -3861,14 +3811,12 @@
         </w:rPr>
         <w:t xml:space="preserve">we </w:t>
       </w:r>
-      <w:proofErr w:type="spellStart"/>
       <w:r>
         <w:rPr>
           <w:rFonts w:ascii="Arial" w:hAnsi="Arial" w:cs="Arial"/>
         </w:rPr>
         <w:t>sonified</w:t>
       </w:r>
-      <w:proofErr w:type="spellEnd"/>
       <w:r>
         <w:rPr>
           <w:rFonts w:ascii="Arial" w:hAnsi="Arial" w:cs="Arial"/>
@@ -3940,35 +3888,7 @@
         <w:rPr>
           <w:rFonts w:ascii="Arial" w:hAnsi="Arial" w:cs="Arial"/>
         </w:rPr>
-        <w:t>. We used 1-</w:t>
-      </w:r>
-      <w:proofErr w:type="gramStart"/>
-      <w:r>
-        <w:rPr>
-          <w:rFonts w:ascii="Arial" w:hAnsi="Arial" w:cs="Arial"/>
-        </w:rPr>
-        <w:t>Parsons</w:t>
-      </w:r>
-      <w:proofErr w:type="gramEnd"/>
-      <w:r>
-        <w:rPr>
-          <w:rFonts w:ascii="Arial" w:hAnsi="Arial" w:cs="Arial"/>
-        </w:rPr>
-        <w:t xml:space="preserve"> encoding, which reduces the frequences profile of a signal to a “</w:t>
-      </w:r>
-      <w:proofErr w:type="spellStart"/>
-      <w:r>
-        <w:rPr>
-          <w:rFonts w:ascii="Arial" w:hAnsi="Arial" w:cs="Arial"/>
-        </w:rPr>
-        <w:t>trit</w:t>
-      </w:r>
-      <w:proofErr w:type="spellEnd"/>
-      <w:r>
-        <w:rPr>
-          <w:rFonts w:ascii="Arial" w:hAnsi="Arial" w:cs="Arial"/>
-        </w:rPr>
-        <w:t xml:space="preserve">” of information by noting the direction of frequency change (up, down, or constant) in a series of subsamples from the original signal, known as Parsons segments. Parsons code is often used in the retrieval and study of music </w:t>
+        <w:t xml:space="preserve">. We used 1-Parsons encoding, which reduces the frequences profile of a signal to a “trit” of information by noting the direction of frequency change (up, down, or constant) in a series of subsamples from the original signal, known as Parsons segments. Parsons code is often used in the retrieval and study of music </w:t>
       </w:r>
       <w:r>
         <w:rPr>
@@ -4257,21 +4177,7 @@
         <w:rPr>
           <w:rFonts w:ascii="Arial" w:hAnsi="Arial" w:cs="Arial"/>
         </w:rPr>
-        <w:t xml:space="preserve"> synthetic audio signals using the </w:t>
-      </w:r>
-      <w:proofErr w:type="spellStart"/>
-      <w:r>
-        <w:rPr>
-          <w:rFonts w:ascii="Arial" w:hAnsi="Arial" w:cs="Arial"/>
-        </w:rPr>
-        <w:t>Soundgen</w:t>
-      </w:r>
-      <w:proofErr w:type="spellEnd"/>
-      <w:r>
-        <w:rPr>
-          <w:rFonts w:ascii="Arial" w:hAnsi="Arial" w:cs="Arial"/>
-        </w:rPr>
-        <w:t xml:space="preserve"> </w:t>
+        <w:t xml:space="preserve"> synthetic audio signals using the Soundgen </w:t>
       </w:r>
       <w:r>
         <w:rPr>
@@ -4334,21 +4240,7 @@
         <w:rPr>
           <w:rFonts w:ascii="Arial" w:hAnsi="Arial" w:cs="Arial"/>
         </w:rPr>
-        <w:t xml:space="preserve">We used R to generate strings and synthetic audio signals, using the </w:t>
-      </w:r>
-      <w:proofErr w:type="spellStart"/>
-      <w:r>
-        <w:rPr>
-          <w:rFonts w:ascii="Arial" w:hAnsi="Arial" w:cs="Arial"/>
-        </w:rPr>
-        <w:t>paRsynth</w:t>
-      </w:r>
-      <w:proofErr w:type="spellEnd"/>
-      <w:r>
-        <w:rPr>
-          <w:rFonts w:ascii="Arial" w:hAnsi="Arial" w:cs="Arial"/>
-        </w:rPr>
-        <w:t xml:space="preserve"> package (code found TKTK here)</w:t>
+        <w:t>We used R to generate strings and synthetic audio signals, using the paRsynth package (code found TKTK here)</w:t>
       </w:r>
       <w:r>
         <w:rPr>
@@ -4554,21 +4446,7 @@
         <w:rPr>
           <w:rFonts w:ascii="Arial" w:hAnsi="Arial" w:cs="Arial"/>
         </w:rPr>
-        <w:t xml:space="preserve">, and group information was set to a character length of 4 characters. For both datasets, there were 5 groups with 10 individuals per group. </w:t>
-      </w:r>
-      <w:proofErr w:type="gramStart"/>
-      <w:r>
-        <w:rPr>
-          <w:rFonts w:ascii="Arial" w:hAnsi="Arial" w:cs="Arial"/>
-        </w:rPr>
-        <w:t>Each individual</w:t>
-      </w:r>
-      <w:proofErr w:type="gramEnd"/>
-      <w:r>
-        <w:rPr>
-          <w:rFonts w:ascii="Arial" w:hAnsi="Arial" w:cs="Arial"/>
-        </w:rPr>
-        <w:t xml:space="preserve"> “</w:t>
+        <w:t>, and group information was set to a character length of 4 characters. For both datasets, there were 5 groups with 10 individuals per group. Each individual “</w:t>
       </w:r>
       <w:commentRangeStart w:id="39"/>
       <w:commentRangeStart w:id="40"/>
@@ -4619,21 +4497,7 @@
         <w:rPr>
           <w:rFonts w:ascii="Arial" w:hAnsi="Arial" w:cs="Arial"/>
         </w:rPr>
-        <w:t xml:space="preserve">After generating synthetic signals for these datasets, we used the </w:t>
-      </w:r>
-      <w:proofErr w:type="spellStart"/>
-      <w:r>
-        <w:rPr>
-          <w:rFonts w:ascii="Arial" w:hAnsi="Arial" w:cs="Arial"/>
-        </w:rPr>
-        <w:t>warbleR</w:t>
-      </w:r>
-      <w:proofErr w:type="spellEnd"/>
-      <w:r>
-        <w:rPr>
-          <w:rFonts w:ascii="Arial" w:hAnsi="Arial" w:cs="Arial"/>
-        </w:rPr>
-        <w:t xml:space="preserve"> package to convert the .wav files to spectrograms. </w:t>
+        <w:t xml:space="preserve">After generating synthetic signals for these datasets, we used the warbleR package to convert the .wav files to spectrograms. </w:t>
       </w:r>
       <w:r>
         <w:rPr>
@@ -4740,21 +4604,7 @@
         <w:rPr>
           <w:rFonts w:ascii="Arial" w:hAnsi="Arial" w:cs="Arial"/>
         </w:rPr>
-        <w:t xml:space="preserve"> using the </w:t>
-      </w:r>
-      <w:proofErr w:type="spellStart"/>
-      <w:r>
-        <w:rPr>
-          <w:rFonts w:ascii="Arial" w:hAnsi="Arial" w:cs="Arial"/>
-        </w:rPr>
-        <w:t>warbleR</w:t>
-      </w:r>
-      <w:proofErr w:type="spellEnd"/>
-      <w:r>
-        <w:rPr>
-          <w:rFonts w:ascii="Arial" w:hAnsi="Arial" w:cs="Arial"/>
-        </w:rPr>
-        <w:t xml:space="preserve"> package. </w:t>
+        <w:t xml:space="preserve"> using the warbleR package. </w:t>
       </w:r>
       <w:r>
         <w:rPr>
@@ -4935,21 +4785,7 @@
         <w:rPr>
           <w:rFonts w:ascii="Arial" w:hAnsi="Arial" w:cs="Arial"/>
         </w:rPr>
-        <w:t xml:space="preserve"> we created 5 different </w:t>
-      </w:r>
-      <w:proofErr w:type="gramStart"/>
-      <w:r>
-        <w:rPr>
-          <w:rFonts w:ascii="Arial" w:hAnsi="Arial" w:cs="Arial"/>
-        </w:rPr>
-        <w:t>datasets</w:t>
-      </w:r>
-      <w:proofErr w:type="gramEnd"/>
-      <w:r>
-        <w:rPr>
-          <w:rFonts w:ascii="Arial" w:hAnsi="Arial" w:cs="Arial"/>
-        </w:rPr>
-        <w:t xml:space="preserve"> that varied the proportion of group to individual information encoded in calls</w:t>
+        <w:t xml:space="preserve"> we created 5 different datasets that varied the proportion of group to individual information encoded in calls</w:t>
       </w:r>
       <w:r>
         <w:rPr>
@@ -4995,21 +4831,7 @@
           <w:rFonts w:ascii="Arial" w:hAnsi="Arial" w:cs="Arial"/>
         </w:rPr>
         <w:tab/>
-        <w:t xml:space="preserve">After generating the synthetic audio files, we used the </w:t>
-      </w:r>
-      <w:proofErr w:type="spellStart"/>
-      <w:r>
-        <w:rPr>
-          <w:rFonts w:ascii="Arial" w:hAnsi="Arial" w:cs="Arial"/>
-        </w:rPr>
-        <w:t>warbleR</w:t>
-      </w:r>
-      <w:proofErr w:type="spellEnd"/>
-      <w:r>
-        <w:rPr>
-          <w:rFonts w:ascii="Arial" w:hAnsi="Arial" w:cs="Arial"/>
-        </w:rPr>
-        <w:t xml:space="preserve"> package to perform SPCC. </w:t>
+        <w:t xml:space="preserve">After generating the synthetic audio files, we used the warbleR package to perform SPCC. </w:t>
       </w:r>
       <w:r>
         <w:rPr>
@@ -5240,7 +5062,55 @@
           <w:sz w:val="20"/>
           <w:szCs w:val="20"/>
         </w:rPr>
-        <w:t>(A)</w:t>
+        <w:t xml:space="preserve">(A) </w:t>
+      </w:r>
+      <w:r>
+        <w:rPr>
+          <w:rFonts w:ascii="Arial" w:hAnsi="Arial" w:cs="Arial"/>
+          <w:sz w:val="20"/>
+          <w:szCs w:val="20"/>
+        </w:rPr>
+        <w:t>more group membership information encoded in the calls</w:t>
+      </w:r>
+      <w:r>
+        <w:rPr>
+          <w:rFonts w:ascii="Arial" w:hAnsi="Arial" w:cs="Arial"/>
+          <w:sz w:val="20"/>
+          <w:szCs w:val="20"/>
+        </w:rPr>
+        <w:t xml:space="preserve"> with polygons </w:t>
+      </w:r>
+      <w:r>
+        <w:rPr>
+          <w:rFonts w:ascii="Arial" w:hAnsi="Arial" w:cs="Arial"/>
+          <w:sz w:val="20"/>
+          <w:szCs w:val="20"/>
+        </w:rPr>
+        <w:t>drawn</w:t>
+      </w:r>
+      <w:r>
+        <w:rPr>
+          <w:rFonts w:ascii="Arial" w:hAnsi="Arial" w:cs="Arial"/>
+          <w:sz w:val="20"/>
+          <w:szCs w:val="20"/>
+        </w:rPr>
+        <w:t xml:space="preserve"> by group </w:t>
+      </w:r>
+      <w:r>
+        <w:rPr>
+          <w:rFonts w:ascii="Arial" w:hAnsi="Arial" w:cs="Arial"/>
+          <w:sz w:val="20"/>
+          <w:szCs w:val="20"/>
+        </w:rPr>
+        <w:t>identity</w:t>
+      </w:r>
+      <w:r>
+        <w:rPr>
+          <w:rFonts w:ascii="Arial" w:hAnsi="Arial" w:cs="Arial"/>
+          <w:sz w:val="20"/>
+          <w:szCs w:val="20"/>
+        </w:rPr>
+        <w:t xml:space="preserve">, </w:t>
       </w:r>
       <w:r>
         <w:rPr>
@@ -5250,7 +5120,7 @@
           <w:sz w:val="20"/>
           <w:szCs w:val="20"/>
         </w:rPr>
-        <w:t xml:space="preserve"> </w:t>
+        <w:t xml:space="preserve">(B) </w:t>
       </w:r>
       <w:r>
         <w:rPr>
@@ -5258,7 +5128,7 @@
           <w:sz w:val="20"/>
           <w:szCs w:val="20"/>
         </w:rPr>
-        <w:t>more group membership information encoded in the calls</w:t>
+        <w:t xml:space="preserve">more group membership information </w:t>
       </w:r>
       <w:r>
         <w:rPr>
@@ -5266,7 +5136,7 @@
           <w:sz w:val="20"/>
           <w:szCs w:val="20"/>
         </w:rPr>
-        <w:t xml:space="preserve"> with polygons </w:t>
+        <w:t xml:space="preserve">encoded in the calls </w:t>
       </w:r>
       <w:r>
         <w:rPr>
@@ -5274,7 +5144,7 @@
           <w:sz w:val="20"/>
           <w:szCs w:val="20"/>
         </w:rPr>
-        <w:t>drawn</w:t>
+        <w:t xml:space="preserve">with polygons </w:t>
       </w:r>
       <w:r>
         <w:rPr>
@@ -5282,7 +5152,7 @@
           <w:sz w:val="20"/>
           <w:szCs w:val="20"/>
         </w:rPr>
-        <w:t xml:space="preserve"> by group </w:t>
+        <w:t>drawn</w:t>
       </w:r>
       <w:r>
         <w:rPr>
@@ -5290,7 +5160,7 @@
           <w:sz w:val="20"/>
           <w:szCs w:val="20"/>
         </w:rPr>
-        <w:t>identity</w:t>
+        <w:t xml:space="preserve"> by individual</w:t>
       </w:r>
       <w:r>
         <w:rPr>
@@ -5298,7 +5168,23 @@
           <w:sz w:val="20"/>
           <w:szCs w:val="20"/>
         </w:rPr>
-        <w:t xml:space="preserve">, </w:t>
+        <w:t xml:space="preserve"> identity</w:t>
+      </w:r>
+      <w:r>
+        <w:rPr>
+          <w:rFonts w:ascii="Arial" w:hAnsi="Arial" w:cs="Arial"/>
+          <w:sz w:val="20"/>
+          <w:szCs w:val="20"/>
+        </w:rPr>
+        <w:t>,</w:t>
+      </w:r>
+      <w:r>
+        <w:rPr>
+          <w:rFonts w:ascii="Arial" w:hAnsi="Arial" w:cs="Arial"/>
+          <w:sz w:val="20"/>
+          <w:szCs w:val="20"/>
+        </w:rPr>
+        <w:t xml:space="preserve"> </w:t>
       </w:r>
       <w:r>
         <w:rPr>
@@ -5308,7 +5194,39 @@
           <w:sz w:val="20"/>
           <w:szCs w:val="20"/>
         </w:rPr>
-        <w:t>(B)</w:t>
+        <w:t xml:space="preserve">(C) </w:t>
+      </w:r>
+      <w:r>
+        <w:rPr>
+          <w:rFonts w:ascii="Arial" w:hAnsi="Arial" w:cs="Arial"/>
+          <w:sz w:val="20"/>
+          <w:szCs w:val="20"/>
+        </w:rPr>
+        <w:t xml:space="preserve">more individual information encoded in the calls with polygons </w:t>
+      </w:r>
+      <w:r>
+        <w:rPr>
+          <w:rFonts w:ascii="Arial" w:hAnsi="Arial" w:cs="Arial"/>
+          <w:sz w:val="20"/>
+          <w:szCs w:val="20"/>
+        </w:rPr>
+        <w:t>drawn</w:t>
+      </w:r>
+      <w:r>
+        <w:rPr>
+          <w:rFonts w:ascii="Arial" w:hAnsi="Arial" w:cs="Arial"/>
+          <w:sz w:val="20"/>
+          <w:szCs w:val="20"/>
+        </w:rPr>
+        <w:t xml:space="preserve"> by group</w:t>
+      </w:r>
+      <w:r>
+        <w:rPr>
+          <w:rFonts w:ascii="Arial" w:hAnsi="Arial" w:cs="Arial"/>
+          <w:sz w:val="20"/>
+          <w:szCs w:val="20"/>
+        </w:rPr>
+        <w:t xml:space="preserve"> identity, and </w:t>
       </w:r>
       <w:r>
         <w:rPr>
@@ -5318,7 +5236,8 @@
           <w:sz w:val="20"/>
           <w:szCs w:val="20"/>
         </w:rPr>
-        <w:t xml:space="preserve"> </w:t>
+        <w:lastRenderedPageBreak/>
+        <w:t xml:space="preserve">(D) </w:t>
       </w:r>
       <w:r>
         <w:rPr>
@@ -5326,7 +5245,7 @@
           <w:sz w:val="20"/>
           <w:szCs w:val="20"/>
         </w:rPr>
-        <w:t xml:space="preserve">more group membership information </w:t>
+        <w:t xml:space="preserve">more individual information encoded in the calls with polygons </w:t>
       </w:r>
       <w:r>
         <w:rPr>
@@ -5334,7 +5253,7 @@
           <w:sz w:val="20"/>
           <w:szCs w:val="20"/>
         </w:rPr>
-        <w:t xml:space="preserve">encoded in the calls </w:t>
+        <w:t>drawn</w:t>
       </w:r>
       <w:r>
         <w:rPr>
@@ -5342,7 +5261,7 @@
           <w:sz w:val="20"/>
           <w:szCs w:val="20"/>
         </w:rPr>
-        <w:t xml:space="preserve">with polygons </w:t>
+        <w:t xml:space="preserve"> by individual identity.</w:t>
       </w:r>
       <w:r>
         <w:rPr>
@@ -5350,162 +5269,7 @@
           <w:sz w:val="20"/>
           <w:szCs w:val="20"/>
         </w:rPr>
-        <w:t>drawn</w:t>
-      </w:r>
-      <w:r>
-        <w:rPr>
-          <w:rFonts w:ascii="Arial" w:hAnsi="Arial" w:cs="Arial"/>
-          <w:sz w:val="20"/>
-          <w:szCs w:val="20"/>
-        </w:rPr>
-        <w:t xml:space="preserve"> by individual</w:t>
-      </w:r>
-      <w:r>
-        <w:rPr>
-          <w:rFonts w:ascii="Arial" w:hAnsi="Arial" w:cs="Arial"/>
-          <w:sz w:val="20"/>
-          <w:szCs w:val="20"/>
-        </w:rPr>
-        <w:t xml:space="preserve"> identity</w:t>
-      </w:r>
-      <w:r>
-        <w:rPr>
-          <w:rFonts w:ascii="Arial" w:hAnsi="Arial" w:cs="Arial"/>
-          <w:sz w:val="20"/>
-          <w:szCs w:val="20"/>
-        </w:rPr>
-        <w:t>,</w:t>
-      </w:r>
-      <w:r>
-        <w:rPr>
-          <w:rFonts w:ascii="Arial" w:hAnsi="Arial" w:cs="Arial"/>
-          <w:sz w:val="20"/>
-          <w:szCs w:val="20"/>
-        </w:rPr>
-        <w:t xml:space="preserve"> </w:t>
-      </w:r>
-      <w:r>
-        <w:rPr>
-          <w:rFonts w:ascii="Arial" w:hAnsi="Arial" w:cs="Arial"/>
-          <w:b/>
-          <w:bCs/>
-          <w:sz w:val="20"/>
-          <w:szCs w:val="20"/>
-        </w:rPr>
-        <w:t>(C)</w:t>
-      </w:r>
-      <w:r>
-        <w:rPr>
-          <w:rFonts w:ascii="Arial" w:hAnsi="Arial" w:cs="Arial"/>
-          <w:b/>
-          <w:bCs/>
-          <w:sz w:val="20"/>
-          <w:szCs w:val="20"/>
-        </w:rPr>
-        <w:t xml:space="preserve"> </w:t>
-      </w:r>
-      <w:r>
-        <w:rPr>
-          <w:rFonts w:ascii="Arial" w:hAnsi="Arial" w:cs="Arial"/>
-          <w:sz w:val="20"/>
-          <w:szCs w:val="20"/>
-        </w:rPr>
-        <w:t xml:space="preserve">more individual information encoded in the calls with polygons </w:t>
-      </w:r>
-      <w:r>
-        <w:rPr>
-          <w:rFonts w:ascii="Arial" w:hAnsi="Arial" w:cs="Arial"/>
-          <w:sz w:val="20"/>
-          <w:szCs w:val="20"/>
-        </w:rPr>
-        <w:t>drawn</w:t>
-      </w:r>
-      <w:r>
-        <w:rPr>
-          <w:rFonts w:ascii="Arial" w:hAnsi="Arial" w:cs="Arial"/>
-          <w:sz w:val="20"/>
-          <w:szCs w:val="20"/>
-        </w:rPr>
-        <w:t xml:space="preserve"> by group</w:t>
-      </w:r>
-      <w:r>
-        <w:rPr>
-          <w:rFonts w:ascii="Arial" w:hAnsi="Arial" w:cs="Arial"/>
-          <w:sz w:val="20"/>
-          <w:szCs w:val="20"/>
-        </w:rPr>
-        <w:t xml:space="preserve"> identity, and </w:t>
-      </w:r>
-      <w:r>
-        <w:rPr>
-          <w:rFonts w:ascii="Arial" w:hAnsi="Arial" w:cs="Arial"/>
-          <w:b/>
-          <w:bCs/>
-          <w:sz w:val="20"/>
-          <w:szCs w:val="20"/>
-        </w:rPr>
-        <w:lastRenderedPageBreak/>
-        <w:t>(D)</w:t>
-      </w:r>
-      <w:r>
-        <w:rPr>
-          <w:rFonts w:ascii="Arial" w:hAnsi="Arial" w:cs="Arial"/>
-          <w:b/>
-          <w:bCs/>
-          <w:sz w:val="20"/>
-          <w:szCs w:val="20"/>
-        </w:rPr>
-        <w:t xml:space="preserve"> </w:t>
-      </w:r>
-      <w:r>
-        <w:rPr>
-          <w:rFonts w:ascii="Arial" w:hAnsi="Arial" w:cs="Arial"/>
-          <w:sz w:val="20"/>
-          <w:szCs w:val="20"/>
-        </w:rPr>
-        <w:t xml:space="preserve">more individual information encoded in the calls with polygons </w:t>
-      </w:r>
-      <w:r>
-        <w:rPr>
-          <w:rFonts w:ascii="Arial" w:hAnsi="Arial" w:cs="Arial"/>
-          <w:sz w:val="20"/>
-          <w:szCs w:val="20"/>
-        </w:rPr>
-        <w:t>drawn</w:t>
-      </w:r>
-      <w:r>
-        <w:rPr>
-          <w:rFonts w:ascii="Arial" w:hAnsi="Arial" w:cs="Arial"/>
-          <w:sz w:val="20"/>
-          <w:szCs w:val="20"/>
-        </w:rPr>
-        <w:t xml:space="preserve"> by individual identity.</w:t>
-      </w:r>
-      <w:r>
-        <w:rPr>
-          <w:rFonts w:ascii="Arial" w:hAnsi="Arial" w:cs="Arial"/>
-          <w:sz w:val="20"/>
-          <w:szCs w:val="20"/>
-        </w:rPr>
-        <w:t xml:space="preserve"> Colors represent original group </w:t>
-      </w:r>
-      <w:proofErr w:type="gramStart"/>
-      <w:r>
-        <w:rPr>
-          <w:rFonts w:ascii="Arial" w:hAnsi="Arial" w:cs="Arial"/>
-          <w:sz w:val="20"/>
-          <w:szCs w:val="20"/>
-        </w:rPr>
-        <w:t>identity,</w:t>
-      </w:r>
-      <w:proofErr w:type="gramEnd"/>
-      <w:r>
-        <w:rPr>
-          <w:rFonts w:ascii="Arial" w:hAnsi="Arial" w:cs="Arial"/>
-          <w:sz w:val="20"/>
-          <w:szCs w:val="20"/>
-        </w:rPr>
-        <w:t xml:space="preserve"> shapes represent </w:t>
+        <w:t xml:space="preserve"> Colors represent original group identity, shapes represent </w:t>
       </w:r>
       <w:r>
         <w:rPr>
@@ -5923,16 +5687,6 @@
         </w:rPr>
         <w:t>this means</w:t>
       </w:r>
-    </w:p>
-    <w:p>
-      <w:pPr>
-        <w:spacing w:line="360" w:lineRule="auto"/>
-        <w:rPr>
-          <w:rFonts w:ascii="Arial" w:hAnsi="Arial" w:cs="Arial"/>
-          <w:sz w:val="18"/>
-          <w:szCs w:val="18"/>
-        </w:rPr>
-      </w:pPr>
       <w:r>
         <w:rPr>
           <w:rFonts w:ascii="Arial" w:hAnsi="Arial" w:cs="Arial"/>
@@ -5941,111 +5695,7 @@
           <w:sz w:val="18"/>
           <w:szCs w:val="18"/>
         </w:rPr>
-        <w:t>2B</w:t>
-      </w:r>
-      <w:r>
-        <w:rPr>
-          <w:rFonts w:ascii="Arial" w:hAnsi="Arial" w:cs="Arial"/>
-          <w:sz w:val="18"/>
-          <w:szCs w:val="18"/>
-        </w:rPr>
-        <w:t>: here we</w:t>
-      </w:r>
-      <w:r>
-        <w:rPr>
-          <w:rFonts w:ascii="Arial" w:hAnsi="Arial" w:cs="Arial"/>
-          <w:sz w:val="18"/>
-          <w:szCs w:val="18"/>
-        </w:rPr>
-        <w:t xml:space="preserve"> still</w:t>
-      </w:r>
-      <w:r>
-        <w:rPr>
-          <w:rFonts w:ascii="Arial" w:hAnsi="Arial" w:cs="Arial"/>
-          <w:sz w:val="18"/>
-          <w:szCs w:val="18"/>
-        </w:rPr>
-        <w:t xml:space="preserve"> have individuals with more group information encoded within the call, but </w:t>
-      </w:r>
-      <w:r>
-        <w:rPr>
-          <w:rFonts w:ascii="Arial" w:hAnsi="Arial" w:cs="Arial"/>
-          <w:sz w:val="18"/>
-          <w:szCs w:val="18"/>
-        </w:rPr>
-        <w:t xml:space="preserve">we try to </w:t>
-      </w:r>
-      <w:r>
-        <w:rPr>
-          <w:rFonts w:ascii="Arial" w:hAnsi="Arial" w:cs="Arial"/>
-          <w:sz w:val="18"/>
-          <w:szCs w:val="18"/>
-        </w:rPr>
-        <w:t>cluster/group</w:t>
-      </w:r>
-      <w:r>
-        <w:rPr>
-          <w:rFonts w:ascii="Arial" w:hAnsi="Arial" w:cs="Arial"/>
-          <w:sz w:val="18"/>
-          <w:szCs w:val="18"/>
-        </w:rPr>
-        <w:t xml:space="preserve"> them by individual identity</w:t>
-      </w:r>
-      <w:r>
-        <w:rPr>
-          <w:rFonts w:ascii="Arial" w:hAnsi="Arial" w:cs="Arial"/>
-          <w:sz w:val="18"/>
-          <w:szCs w:val="18"/>
-        </w:rPr>
-        <w:t>.</w:t>
-      </w:r>
-      <w:r>
-        <w:rPr>
-          <w:rFonts w:ascii="Arial" w:hAnsi="Arial" w:cs="Arial"/>
-          <w:sz w:val="18"/>
-          <w:szCs w:val="18"/>
-        </w:rPr>
-        <w:t xml:space="preserve"> Even when trying to </w:t>
-      </w:r>
-      <w:r>
-        <w:rPr>
-          <w:rFonts w:ascii="Arial" w:hAnsi="Arial" w:cs="Arial"/>
-          <w:sz w:val="18"/>
-          <w:szCs w:val="18"/>
-        </w:rPr>
-        <w:t>group</w:t>
-      </w:r>
-      <w:r>
-        <w:rPr>
-          <w:rFonts w:ascii="Arial" w:hAnsi="Arial" w:cs="Arial"/>
-          <w:sz w:val="18"/>
-          <w:szCs w:val="18"/>
-        </w:rPr>
-        <w:t xml:space="preserve"> polygons by individual, we </w:t>
-      </w:r>
-      <w:r>
-        <w:rPr>
-          <w:rFonts w:ascii="Arial" w:hAnsi="Arial" w:cs="Arial"/>
-          <w:sz w:val="18"/>
-          <w:szCs w:val="18"/>
-        </w:rPr>
-        <w:t>can still</w:t>
-      </w:r>
-      <w:r>
-        <w:rPr>
-          <w:rFonts w:ascii="Arial" w:hAnsi="Arial" w:cs="Arial"/>
-          <w:sz w:val="18"/>
-          <w:szCs w:val="18"/>
-        </w:rPr>
-        <w:t xml:space="preserve"> see clear group delineations in </w:t>
-      </w:r>
-      <w:r>
-        <w:rPr>
-          <w:rFonts w:ascii="Arial" w:hAnsi="Arial" w:cs="Arial"/>
-          <w:sz w:val="18"/>
-          <w:szCs w:val="18"/>
-        </w:rPr>
-        <w:t>how individuals are taking up their acoustic space</w:t>
+        <w:t xml:space="preserve"> that</w:t>
       </w:r>
     </w:p>
     <w:p>
@@ -6065,7 +5715,7 @@
           <w:sz w:val="18"/>
           <w:szCs w:val="18"/>
         </w:rPr>
-        <w:t>2C</w:t>
+        <w:t>2B</w:t>
       </w:r>
       <w:r>
         <w:rPr>
@@ -6073,7 +5723,7 @@
           <w:sz w:val="18"/>
           <w:szCs w:val="18"/>
         </w:rPr>
-        <w:t xml:space="preserve">: here we have individuals with more individual identity </w:t>
+        <w:t>: here we</w:t>
       </w:r>
       <w:r>
         <w:rPr>
@@ -6081,25 +5731,23 @@
           <w:sz w:val="18"/>
           <w:szCs w:val="18"/>
         </w:rPr>
-        <w:t xml:space="preserve">encoded within </w:t>
-      </w:r>
-      <w:proofErr w:type="gramStart"/>
+        <w:t xml:space="preserve"> still</w:t>
+      </w:r>
       <w:r>
         <w:rPr>
           <w:rFonts w:ascii="Arial" w:hAnsi="Arial" w:cs="Arial"/>
           <w:sz w:val="18"/>
           <w:szCs w:val="18"/>
         </w:rPr>
-        <w:t>call, but</w:t>
-      </w:r>
-      <w:proofErr w:type="gramEnd"/>
+        <w:t xml:space="preserve"> have individuals with more group information encoded within the call, but </w:t>
+      </w:r>
       <w:r>
         <w:rPr>
           <w:rFonts w:ascii="Arial" w:hAnsi="Arial" w:cs="Arial"/>
           <w:sz w:val="18"/>
           <w:szCs w:val="18"/>
         </w:rPr>
-        <w:t xml:space="preserve"> try to cluster/group them by </w:t>
+        <w:t xml:space="preserve">we try to </w:t>
       </w:r>
       <w:r>
         <w:rPr>
@@ -6107,7 +5755,7 @@
           <w:sz w:val="18"/>
           <w:szCs w:val="18"/>
         </w:rPr>
-        <w:t>group membership. W</w:t>
+        <w:t>cluster/group</w:t>
       </w:r>
       <w:r>
         <w:rPr>
@@ -6115,7 +5763,7 @@
           <w:sz w:val="18"/>
           <w:szCs w:val="18"/>
         </w:rPr>
-        <w:t xml:space="preserve">ith more </w:t>
+        <w:t xml:space="preserve"> them by individual identity</w:t>
       </w:r>
       <w:r>
         <w:rPr>
@@ -6123,7 +5771,7 @@
           <w:sz w:val="18"/>
           <w:szCs w:val="18"/>
         </w:rPr>
-        <w:t xml:space="preserve">identity information encoded within a call than group membership, </w:t>
+        <w:t>.</w:t>
       </w:r>
       <w:r>
         <w:rPr>
@@ -6131,7 +5779,7 @@
           <w:sz w:val="18"/>
           <w:szCs w:val="18"/>
         </w:rPr>
-        <w:t xml:space="preserve">individuals in the same group </w:t>
+        <w:t xml:space="preserve"> Even when trying to </w:t>
       </w:r>
       <w:r>
         <w:rPr>
@@ -6139,7 +5787,7 @@
           <w:sz w:val="18"/>
           <w:szCs w:val="18"/>
         </w:rPr>
-        <w:t xml:space="preserve">“actively work” / </w:t>
+        <w:t>group</w:t>
       </w:r>
       <w:r>
         <w:rPr>
@@ -6147,7 +5795,7 @@
           <w:sz w:val="18"/>
           <w:szCs w:val="18"/>
         </w:rPr>
-        <w:t xml:space="preserve">“try” to be as different as they can from each other, so </w:t>
+        <w:t xml:space="preserve"> polygons by individual, we </w:t>
       </w:r>
       <w:r>
         <w:rPr>
@@ -6155,7 +5803,7 @@
           <w:sz w:val="18"/>
           <w:szCs w:val="18"/>
         </w:rPr>
-        <w:t>they all take up very different parts of the acoustic space. This results in a lot of overlap between these group polygon</w:t>
+        <w:t>can still</w:t>
       </w:r>
       <w:r>
         <w:rPr>
@@ -6163,34 +5811,26 @@
           <w:sz w:val="18"/>
           <w:szCs w:val="18"/>
         </w:rPr>
-        <w:t xml:space="preserve">s – by trying to remain very different from individuals within their group, they may be quite </w:t>
-      </w:r>
-      <w:proofErr w:type="gramStart"/>
+        <w:t xml:space="preserve"> see clear group delineations in </w:t>
+      </w:r>
       <w:r>
         <w:rPr>
           <w:rFonts w:ascii="Arial" w:hAnsi="Arial" w:cs="Arial"/>
           <w:sz w:val="18"/>
           <w:szCs w:val="18"/>
         </w:rPr>
-        <w:t>similar to</w:t>
-      </w:r>
-      <w:proofErr w:type="gramEnd"/>
-      <w:r>
+        <w:t>how individuals are taking up their acoustic space</w:t>
+      </w:r>
+    </w:p>
+    <w:p>
+      <w:pPr>
+        <w:spacing w:line="360" w:lineRule="auto"/>
         <w:rPr>
           <w:rFonts w:ascii="Arial" w:hAnsi="Arial" w:cs="Arial"/>
           <w:sz w:val="18"/>
           <w:szCs w:val="18"/>
         </w:rPr>
-        <w:t xml:space="preserve"> other individuals from other groups by random chance</w:t>
-      </w:r>
-      <w:r>
-        <w:rPr>
-          <w:rFonts w:ascii="Arial" w:hAnsi="Arial" w:cs="Arial"/>
-          <w:sz w:val="18"/>
-          <w:szCs w:val="18"/>
-        </w:rPr>
-        <w:t xml:space="preserve">. </w:t>
-      </w:r>
+      </w:pPr>
       <w:r>
         <w:rPr>
           <w:rFonts w:ascii="Arial" w:hAnsi="Arial" w:cs="Arial"/>
@@ -6199,7 +5839,7 @@
           <w:sz w:val="18"/>
           <w:szCs w:val="18"/>
         </w:rPr>
-        <w:t>This means</w:t>
+        <w:t>2C</w:t>
       </w:r>
       <w:r>
         <w:rPr>
@@ -6207,18 +5847,88 @@
           <w:sz w:val="18"/>
           <w:szCs w:val="18"/>
         </w:rPr>
-        <w:t xml:space="preserve"> </w:t>
-      </w:r>
-    </w:p>
-    <w:p>
-      <w:pPr>
-        <w:spacing w:line="360" w:lineRule="auto"/>
+        <w:t xml:space="preserve">: here we have individuals with more individual identity </w:t>
+      </w:r>
+      <w:r>
         <w:rPr>
           <w:rFonts w:ascii="Arial" w:hAnsi="Arial" w:cs="Arial"/>
           <w:sz w:val="18"/>
           <w:szCs w:val="18"/>
         </w:rPr>
-      </w:pPr>
+        <w:t xml:space="preserve">encoded within call, but try to cluster/group them by </w:t>
+      </w:r>
+      <w:r>
+        <w:rPr>
+          <w:rFonts w:ascii="Arial" w:hAnsi="Arial" w:cs="Arial"/>
+          <w:sz w:val="18"/>
+          <w:szCs w:val="18"/>
+        </w:rPr>
+        <w:t>group membership. W</w:t>
+      </w:r>
+      <w:r>
+        <w:rPr>
+          <w:rFonts w:ascii="Arial" w:hAnsi="Arial" w:cs="Arial"/>
+          <w:sz w:val="18"/>
+          <w:szCs w:val="18"/>
+        </w:rPr>
+        <w:t xml:space="preserve">ith more </w:t>
+      </w:r>
+      <w:r>
+        <w:rPr>
+          <w:rFonts w:ascii="Arial" w:hAnsi="Arial" w:cs="Arial"/>
+          <w:sz w:val="18"/>
+          <w:szCs w:val="18"/>
+        </w:rPr>
+        <w:t xml:space="preserve">identity information encoded within a call than group membership, </w:t>
+      </w:r>
+      <w:r>
+        <w:rPr>
+          <w:rFonts w:ascii="Arial" w:hAnsi="Arial" w:cs="Arial"/>
+          <w:sz w:val="18"/>
+          <w:szCs w:val="18"/>
+        </w:rPr>
+        <w:t xml:space="preserve">individuals in the same group </w:t>
+      </w:r>
+      <w:r>
+        <w:rPr>
+          <w:rFonts w:ascii="Arial" w:hAnsi="Arial" w:cs="Arial"/>
+          <w:sz w:val="18"/>
+          <w:szCs w:val="18"/>
+        </w:rPr>
+        <w:t xml:space="preserve">“actively work” / </w:t>
+      </w:r>
+      <w:r>
+        <w:rPr>
+          <w:rFonts w:ascii="Arial" w:hAnsi="Arial" w:cs="Arial"/>
+          <w:sz w:val="18"/>
+          <w:szCs w:val="18"/>
+        </w:rPr>
+        <w:t xml:space="preserve">“try” to be as different as they can from each other, so </w:t>
+      </w:r>
+      <w:r>
+        <w:rPr>
+          <w:rFonts w:ascii="Arial" w:hAnsi="Arial" w:cs="Arial"/>
+          <w:sz w:val="18"/>
+          <w:szCs w:val="18"/>
+        </w:rPr>
+        <w:t>they all take up very different parts of the acoustic space. This results in a lot of overlap between these group polygon</w:t>
+      </w:r>
+      <w:r>
+        <w:rPr>
+          <w:rFonts w:ascii="Arial" w:hAnsi="Arial" w:cs="Arial"/>
+          <w:sz w:val="18"/>
+          <w:szCs w:val="18"/>
+        </w:rPr>
+        <w:t>s – by trying to remain very different from individuals within their group, they may be quite similar to other individuals from other groups by random chance</w:t>
+      </w:r>
+      <w:r>
+        <w:rPr>
+          <w:rFonts w:ascii="Arial" w:hAnsi="Arial" w:cs="Arial"/>
+          <w:sz w:val="18"/>
+          <w:szCs w:val="18"/>
+        </w:rPr>
+        <w:t xml:space="preserve">. </w:t>
+      </w:r>
       <w:r>
         <w:rPr>
           <w:rFonts w:ascii="Arial" w:hAnsi="Arial" w:cs="Arial"/>
@@ -6227,8 +5937,26 @@
           <w:sz w:val="18"/>
           <w:szCs w:val="18"/>
         </w:rPr>
-        <w:t>2D:</w:t>
-      </w:r>
+        <w:t>This means</w:t>
+      </w:r>
+      <w:r>
+        <w:rPr>
+          <w:rFonts w:ascii="Arial" w:hAnsi="Arial" w:cs="Arial"/>
+          <w:sz w:val="18"/>
+          <w:szCs w:val="18"/>
+        </w:rPr>
+        <w:t xml:space="preserve"> </w:t>
+      </w:r>
+    </w:p>
+    <w:p>
+      <w:pPr>
+        <w:spacing w:line="360" w:lineRule="auto"/>
+        <w:rPr>
+          <w:rFonts w:ascii="Arial" w:hAnsi="Arial" w:cs="Arial"/>
+          <w:sz w:val="18"/>
+          <w:szCs w:val="18"/>
+        </w:rPr>
+      </w:pPr>
       <w:r>
         <w:rPr>
           <w:rFonts w:ascii="Arial" w:hAnsi="Arial" w:cs="Arial"/>
@@ -6237,15 +5965,17 @@
           <w:sz w:val="18"/>
           <w:szCs w:val="18"/>
         </w:rPr>
-        <w:t xml:space="preserve"> </w:t>
-      </w:r>
-      <w:r>
-        <w:rPr>
-          <w:rFonts w:ascii="Arial" w:hAnsi="Arial" w:cs="Arial"/>
+        <w:t>2D:</w:t>
+      </w:r>
+      <w:r>
+        <w:rPr>
+          <w:rFonts w:ascii="Arial" w:hAnsi="Arial" w:cs="Arial"/>
+          <w:b/>
+          <w:bCs/>
           <w:sz w:val="18"/>
           <w:szCs w:val="18"/>
         </w:rPr>
-        <w:t>more individual i</w:t>
+        <w:t xml:space="preserve"> </w:t>
       </w:r>
       <w:r>
         <w:rPr>
@@ -6253,7 +5983,7 @@
           <w:sz w:val="18"/>
           <w:szCs w:val="18"/>
         </w:rPr>
-        <w:t xml:space="preserve">dentity information encoded than group membership information. </w:t>
+        <w:t>more individual i</w:t>
       </w:r>
       <w:r>
         <w:rPr>
@@ -6261,7 +5991,7 @@
           <w:sz w:val="18"/>
           <w:szCs w:val="18"/>
         </w:rPr>
-        <w:t>Individuals within the same group will have low convergence (maintaining individuality) with</w:t>
+        <w:t xml:space="preserve">dentity information encoded than group membership information. </w:t>
       </w:r>
       <w:r>
         <w:rPr>
@@ -6269,7 +5999,7 @@
           <w:sz w:val="18"/>
           <w:szCs w:val="18"/>
         </w:rPr>
-        <w:t xml:space="preserve"> others in</w:t>
+        <w:t>Individuals within the same group will have low convergence (maintaining individuality) with</w:t>
       </w:r>
       <w:r>
         <w:rPr>
@@ -6277,16 +6007,15 @@
           <w:sz w:val="18"/>
           <w:szCs w:val="18"/>
         </w:rPr>
-        <w:t xml:space="preserve"> the </w:t>
-      </w:r>
-      <w:proofErr w:type="gramStart"/>
+        <w:t xml:space="preserve"> others in</w:t>
+      </w:r>
       <w:r>
         <w:rPr>
           <w:rFonts w:ascii="Arial" w:hAnsi="Arial" w:cs="Arial"/>
           <w:sz w:val="18"/>
           <w:szCs w:val="18"/>
         </w:rPr>
-        <w:t xml:space="preserve">group, </w:t>
+        <w:t xml:space="preserve"> the group, </w:t>
       </w:r>
       <w:r>
         <w:rPr>
@@ -6294,16 +6023,7 @@
           <w:sz w:val="18"/>
           <w:szCs w:val="18"/>
         </w:rPr>
-        <w:t>and</w:t>
-      </w:r>
-      <w:proofErr w:type="gramEnd"/>
-      <w:r>
-        <w:rPr>
-          <w:rFonts w:ascii="Arial" w:hAnsi="Arial" w:cs="Arial"/>
-          <w:sz w:val="18"/>
-          <w:szCs w:val="18"/>
-        </w:rPr>
-        <w:t xml:space="preserve"> </w:t>
+        <w:t xml:space="preserve">and </w:t>
       </w:r>
       <w:r>
         <w:rPr>
@@ -6467,85 +6187,7 @@
         <w:rPr>
           <w:rFonts w:ascii="Arial" w:hAnsi="Arial" w:cs="Arial"/>
         </w:rPr>
-        <w:t>large-scale quantification methods that are often used in animal movement research (</w:t>
-      </w:r>
-      <w:proofErr w:type="spellStart"/>
-      <w:r>
-        <w:rPr>
-          <w:rFonts w:ascii="Arial" w:hAnsi="Arial" w:cs="Arial"/>
-        </w:rPr>
-        <w:t>Sainburg</w:t>
-      </w:r>
-      <w:proofErr w:type="spellEnd"/>
-      <w:r>
-        <w:rPr>
-          <w:rFonts w:ascii="Arial" w:hAnsi="Arial" w:cs="Arial"/>
-        </w:rPr>
-        <w:t xml:space="preserve"> &amp; Gentner, 2021). Researchers are already using these datasets in combination with natural ones to determine which analytic tools perform best to assess complexity and animal vocal sequences (</w:t>
-      </w:r>
-      <w:proofErr w:type="spellStart"/>
-      <w:r>
-        <w:rPr>
-          <w:rFonts w:ascii="Arial" w:hAnsi="Arial" w:cs="Arial"/>
-        </w:rPr>
-        <w:t>Kershenbaum</w:t>
-      </w:r>
-      <w:proofErr w:type="spellEnd"/>
-      <w:r>
-        <w:rPr>
-          <w:rFonts w:ascii="Arial" w:hAnsi="Arial" w:cs="Arial"/>
-        </w:rPr>
-        <w:t xml:space="preserve"> &amp; Garland, 2015) or to validate new methods for </w:t>
-      </w:r>
-      <w:proofErr w:type="gramStart"/>
-      <w:r>
-        <w:rPr>
-          <w:rFonts w:ascii="Arial" w:hAnsi="Arial" w:cs="Arial"/>
-        </w:rPr>
-        <w:t>calculate</w:t>
-      </w:r>
-      <w:proofErr w:type="gramEnd"/>
-      <w:r>
-        <w:rPr>
-          <w:rFonts w:ascii="Arial" w:hAnsi="Arial" w:cs="Arial"/>
-        </w:rPr>
-        <w:t xml:space="preserve"> and quantify acoustic structure (Keen et al., 2021; Sawant et al., 2022). There are several packages in R that allow researchers to create synthetic vocal signal datasets with biological relevance. [sentences about </w:t>
-      </w:r>
-      <w:proofErr w:type="spellStart"/>
-      <w:r>
-        <w:rPr>
-          <w:rFonts w:ascii="Arial" w:hAnsi="Arial" w:cs="Arial"/>
-        </w:rPr>
-        <w:t>wableR</w:t>
-      </w:r>
-      <w:proofErr w:type="spellEnd"/>
-      <w:r>
-        <w:rPr>
-          <w:rFonts w:ascii="Arial" w:hAnsi="Arial" w:cs="Arial"/>
-        </w:rPr>
-        <w:t xml:space="preserve"> and </w:t>
-      </w:r>
-      <w:proofErr w:type="spellStart"/>
-      <w:proofErr w:type="gramStart"/>
-      <w:r>
-        <w:rPr>
-          <w:rFonts w:ascii="Arial" w:hAnsi="Arial" w:cs="Arial"/>
-        </w:rPr>
-        <w:t>soundgen</w:t>
-      </w:r>
-      <w:proofErr w:type="spellEnd"/>
-      <w:r>
-        <w:rPr>
-          <w:rFonts w:ascii="Arial" w:hAnsi="Arial" w:cs="Arial"/>
-        </w:rPr>
-        <w:t>]  .</w:t>
-      </w:r>
-      <w:proofErr w:type="gramEnd"/>
-      <w:r>
-        <w:rPr>
-          <w:rFonts w:ascii="Arial" w:hAnsi="Arial" w:cs="Arial"/>
-        </w:rPr>
-        <w:t xml:space="preserve"> An underused function of these packages in animal communication is that they provide researchers with the ability to manipulate information in synthetic signals to specifically study the types of information encoded in a signal, how much information is encoded, and where the information is encoded in a signal.  </w:t>
+        <w:t xml:space="preserve">large-scale quantification methods that are often used in animal movement research (Sainburg &amp; Gentner, 2021). Researchers are already using these datasets in combination with natural ones to determine which analytic tools perform best to assess complexity and animal vocal sequences (Kershenbaum &amp; Garland, 2015) or to validate new methods for calculate and quantify acoustic structure (Keen et al., 2021; Sawant et al., 2022). There are several packages in R that allow researchers to create synthetic vocal signal datasets with biological relevance. [sentences about wableR and soundgen]  . An underused function of these packages in animal communication is that they provide researchers with the ability to manipulate information in synthetic signals to specifically study the types of information encoded in a signal, how much information is encoded, and where the information is encoded in a signal.  </w:t>
       </w:r>
     </w:p>
     <w:p>
@@ -8364,51 +8006,7 @@
         <w:rPr>
           <w:rFonts w:ascii="Arial" w:hAnsi="Arial" w:cs="Arial"/>
         </w:rPr>
-        <w:t xml:space="preserve">Second, </w:t>
-      </w:r>
-      <w:proofErr w:type="spellStart"/>
-      <w:proofErr w:type="gramStart"/>
-      <w:r>
-        <w:rPr>
-          <w:rFonts w:ascii="Arial" w:hAnsi="Arial" w:cs="Arial"/>
-        </w:rPr>
-        <w:t>out</w:t>
-      </w:r>
-      <w:proofErr w:type="spellEnd"/>
-      <w:proofErr w:type="gramEnd"/>
-      <w:r>
-        <w:rPr>
-          <w:rFonts w:ascii="Arial" w:hAnsi="Arial" w:cs="Arial"/>
-        </w:rPr>
-        <w:t xml:space="preserve"> ability to detect the dynamics of information encoding during real time social interactions is limited by our ability to capture the totality of an individual’s or groups signal produced during these interactions. We may </w:t>
-      </w:r>
-      <w:proofErr w:type="gramStart"/>
-      <w:r>
-        <w:rPr>
-          <w:rFonts w:ascii="Arial" w:hAnsi="Arial" w:cs="Arial"/>
-        </w:rPr>
-        <w:t>be over sampling</w:t>
-      </w:r>
-      <w:proofErr w:type="gramEnd"/>
-      <w:r>
-        <w:rPr>
-          <w:rFonts w:ascii="Arial" w:hAnsi="Arial" w:cs="Arial"/>
-        </w:rPr>
-        <w:t xml:space="preserve"> from vocal learning species whose social interaction and signal production are easy to observe and </w:t>
-      </w:r>
-      <w:proofErr w:type="gramStart"/>
-      <w:r>
-        <w:rPr>
-          <w:rFonts w:ascii="Arial" w:hAnsi="Arial" w:cs="Arial"/>
-        </w:rPr>
-        <w:t>measure, and</w:t>
-      </w:r>
-      <w:proofErr w:type="gramEnd"/>
-      <w:r>
-        <w:rPr>
-          <w:rFonts w:ascii="Arial" w:hAnsi="Arial" w:cs="Arial"/>
-        </w:rPr>
-        <w:t xml:space="preserve"> therefore may not be assessing the full scope of how information can be encoded across a range of species.</w:t>
+        <w:t>Second, out ability to detect the dynamics of information encoding during real time social interactions is limited by our ability to capture the totality of an individual’s or groups signal produced during these interactions. We may be over sampling from vocal learning species whose social interaction and signal production are easy to observe and measure, and therefore may not be assessing the full scope of how information can be encoded across a range of species.</w:t>
       </w:r>
       <w:commentRangeEnd w:id="54"/>
       <w:r>
@@ -8800,19 +8398,11 @@
           <w:rFonts w:ascii="Arial" w:hAnsi="Arial" w:cs="Arial"/>
         </w:rPr>
       </w:pPr>
-      <w:proofErr w:type="spellStart"/>
-      <w:r>
-        <w:rPr>
-          <w:rFonts w:ascii="Arial" w:hAnsi="Arial" w:cs="Arial"/>
-        </w:rPr>
-        <w:t>paRsynth</w:t>
-      </w:r>
-      <w:proofErr w:type="spellEnd"/>
-      <w:r>
-        <w:rPr>
-          <w:rFonts w:ascii="Arial" w:hAnsi="Arial" w:cs="Arial"/>
-        </w:rPr>
-        <w:t xml:space="preserve"> Part 2: validating types of analysis </w:t>
+      <w:r>
+        <w:rPr>
+          <w:rFonts w:ascii="Arial" w:hAnsi="Arial" w:cs="Arial"/>
+        </w:rPr>
+        <w:t xml:space="preserve">paRsynth Part 2: validating types of analysis </w:t>
       </w:r>
     </w:p>
     <w:p>
@@ -8924,21 +8514,7 @@
         <w:rPr>
           <w:rFonts w:ascii="Arial" w:hAnsi="Arial" w:cs="Arial"/>
         </w:rPr>
-        <w:t xml:space="preserve">These models allow us to address the statistical significance of the degree or magnitude of convergence (which we originally encoded using </w:t>
-      </w:r>
-      <w:proofErr w:type="spellStart"/>
-      <w:r>
-        <w:rPr>
-          <w:rFonts w:ascii="Arial" w:hAnsi="Arial" w:cs="Arial"/>
-        </w:rPr>
-        <w:t>paRsynth</w:t>
-      </w:r>
-      <w:proofErr w:type="spellEnd"/>
-      <w:r>
-        <w:rPr>
-          <w:rFonts w:ascii="Arial" w:hAnsi="Arial" w:cs="Arial"/>
-        </w:rPr>
-        <w:t>). The inferential statistics layer to validate that the information we originally encoded can be recovered</w:t>
+        <w:t>These models allow us to address the statistical significance of the degree or magnitude of convergence (which we originally encoded using paRsynth). The inferential statistics layer to validate that the information we originally encoded can be recovered</w:t>
       </w:r>
     </w:p>
     <w:p>
@@ -8959,21 +8535,7 @@
         <w:rPr>
           <w:rFonts w:ascii="Arial" w:hAnsi="Arial" w:cs="Arial"/>
         </w:rPr>
-        <w:t xml:space="preserve">A receiver standpoint on information recovery, in which we simulated signaler information encoding. Does the variation that we encoded </w:t>
-      </w:r>
-      <w:proofErr w:type="gramStart"/>
-      <w:r>
-        <w:rPr>
-          <w:rFonts w:ascii="Arial" w:hAnsi="Arial" w:cs="Arial"/>
-        </w:rPr>
-        <w:t>actually matter</w:t>
-      </w:r>
-      <w:proofErr w:type="gramEnd"/>
-      <w:r>
-        <w:rPr>
-          <w:rFonts w:ascii="Arial" w:hAnsi="Arial" w:cs="Arial"/>
-        </w:rPr>
-        <w:t>???</w:t>
+        <w:t>A receiver standpoint on information recovery, in which we simulated signaler information encoding. Does the variation that we encoded actually matter???</w:t>
       </w:r>
     </w:p>
     <w:p>
@@ -8994,21 +8556,7 @@
         <w:rPr>
           <w:rFonts w:ascii="Arial" w:hAnsi="Arial" w:cs="Arial"/>
         </w:rPr>
-        <w:t xml:space="preserve">Because we have repeated sampling at both social levels with known individuals, we can </w:t>
-      </w:r>
-      <w:proofErr w:type="gramStart"/>
-      <w:r>
-        <w:rPr>
-          <w:rFonts w:ascii="Arial" w:hAnsi="Arial" w:cs="Arial"/>
-        </w:rPr>
-        <w:t>actually model</w:t>
-      </w:r>
-      <w:proofErr w:type="gramEnd"/>
-      <w:r>
-        <w:rPr>
-          <w:rFonts w:ascii="Arial" w:hAnsi="Arial" w:cs="Arial"/>
-        </w:rPr>
-        <w:t xml:space="preserve"> variation in convergence within and between categories (individuals, groups) at each social level</w:t>
+        <w:t>Because we have repeated sampling at both social levels with known individuals, we can actually model variation in convergence within and between categories (individuals, groups) at each social level</w:t>
       </w:r>
     </w:p>
     <w:p>

</xml_diff>

<commit_message>
Updated legend as well as my version of manuscript
</commit_message>
<xml_diff>
--- a/paRsynth_methods_draft_BAC_SGE.docx
+++ b/paRsynth_methods_draft_BAC_SGE.docx
@@ -458,11 +458,19 @@
           <w:rFonts w:ascii="Arial" w:hAnsi="Arial" w:cs="Arial"/>
         </w:rPr>
       </w:pPr>
-      <w:r>
-        <w:rPr>
-          <w:rFonts w:ascii="Arial" w:hAnsi="Arial" w:cs="Arial"/>
-        </w:rPr>
-        <w:t>Tktk need name address and email address for Methods in Ecology and Evolution</w:t>
+      <w:proofErr w:type="spellStart"/>
+      <w:r>
+        <w:rPr>
+          <w:rFonts w:ascii="Arial" w:hAnsi="Arial" w:cs="Arial"/>
+        </w:rPr>
+        <w:t>Tktk</w:t>
+      </w:r>
+      <w:proofErr w:type="spellEnd"/>
+      <w:r>
+        <w:rPr>
+          <w:rFonts w:ascii="Arial" w:hAnsi="Arial" w:cs="Arial"/>
+        </w:rPr>
+        <w:t xml:space="preserve"> need name address and email address for Methods in Ecology and Evolution</w:t>
       </w:r>
     </w:p>
     <w:p>
@@ -898,6 +906,7 @@
         </w:rPr>
         <w:t xml:space="preserve">: </w:t>
       </w:r>
+      <w:proofErr w:type="gramStart"/>
       <w:r>
         <w:rPr>
           <w:rFonts w:ascii="Arial" w:hAnsi="Arial" w:cs="Arial"/>
@@ -914,7 +923,14 @@
         <w:rPr>
           <w:rFonts w:ascii="Arial" w:hAnsi="Arial" w:cs="Arial"/>
         </w:rPr>
-        <w:t xml:space="preserve">word </w:t>
+        <w:t>word</w:t>
+      </w:r>
+      <w:proofErr w:type="gramEnd"/>
+      <w:r>
+        <w:rPr>
+          <w:rFonts w:ascii="Arial" w:hAnsi="Arial" w:cs="Arial"/>
+        </w:rPr>
+        <w:t xml:space="preserve"> </w:t>
       </w:r>
       <w:r>
         <w:rPr>
@@ -2036,7 +2052,23 @@
           <w:rFonts w:ascii="Arial" w:hAnsi="Arial" w:cs="Arial"/>
           <w:highlight w:val="yellow"/>
         </w:rPr>
-        <w:t>MacDougall-Shackletons?</w:t>
+        <w:t>MacDougall-</w:t>
+      </w:r>
+      <w:proofErr w:type="spellStart"/>
+      <w:r>
+        <w:rPr>
+          <w:rFonts w:ascii="Arial" w:hAnsi="Arial" w:cs="Arial"/>
+          <w:highlight w:val="yellow"/>
+        </w:rPr>
+        <w:t>Shackletons</w:t>
+      </w:r>
+      <w:proofErr w:type="spellEnd"/>
+      <w:r>
+        <w:rPr>
+          <w:rFonts w:ascii="Arial" w:hAnsi="Arial" w:cs="Arial"/>
+          <w:highlight w:val="yellow"/>
+        </w:rPr>
+        <w:t>?</w:t>
       </w:r>
       <w:r>
         <w:rPr>
@@ -2921,13 +2953,23 @@
         </w:rPr>
         <w:t>onk parakeets (</w:t>
       </w:r>
+      <w:proofErr w:type="spellStart"/>
       <w:r>
         <w:rPr>
           <w:rFonts w:ascii="Arial" w:hAnsi="Arial" w:cs="Arial"/>
           <w:i/>
           <w:iCs/>
         </w:rPr>
-        <w:t>Myiopsitta monachus</w:t>
+        <w:t>Myiopsitta</w:t>
+      </w:r>
+      <w:proofErr w:type="spellEnd"/>
+      <w:r>
+        <w:rPr>
+          <w:rFonts w:ascii="Arial" w:hAnsi="Arial" w:cs="Arial"/>
+          <w:i/>
+          <w:iCs/>
+        </w:rPr>
+        <w:t xml:space="preserve"> monachus</w:t>
       </w:r>
       <w:r>
         <w:rPr>
@@ -3733,11 +3775,19 @@
         </w:rPr>
         <w:t xml:space="preserve">Once character strings were generated, we </w:t>
       </w:r>
-      <w:r>
-        <w:rPr>
-          <w:rFonts w:ascii="Arial" w:hAnsi="Arial" w:cs="Arial"/>
-        </w:rPr>
-        <w:t>added random variation</w:t>
+      <w:proofErr w:type="gramStart"/>
+      <w:r>
+        <w:rPr>
+          <w:rFonts w:ascii="Arial" w:hAnsi="Arial" w:cs="Arial"/>
+        </w:rPr>
+        <w:t>added</w:t>
+      </w:r>
+      <w:proofErr w:type="gramEnd"/>
+      <w:r>
+        <w:rPr>
+          <w:rFonts w:ascii="Arial" w:hAnsi="Arial" w:cs="Arial"/>
+        </w:rPr>
+        <w:t xml:space="preserve"> random variation</w:t>
       </w:r>
       <w:r>
         <w:rPr>
@@ -3811,12 +3861,14 @@
         </w:rPr>
         <w:t xml:space="preserve">we </w:t>
       </w:r>
+      <w:proofErr w:type="spellStart"/>
       <w:r>
         <w:rPr>
           <w:rFonts w:ascii="Arial" w:hAnsi="Arial" w:cs="Arial"/>
         </w:rPr>
         <w:t>sonified</w:t>
       </w:r>
+      <w:proofErr w:type="spellEnd"/>
       <w:r>
         <w:rPr>
           <w:rFonts w:ascii="Arial" w:hAnsi="Arial" w:cs="Arial"/>
@@ -3888,7 +3940,35 @@
         <w:rPr>
           <w:rFonts w:ascii="Arial" w:hAnsi="Arial" w:cs="Arial"/>
         </w:rPr>
-        <w:t xml:space="preserve">. We used 1-Parsons encoding, which reduces the frequences profile of a signal to a “trit” of information by noting the direction of frequency change (up, down, or constant) in a series of subsamples from the original signal, known as Parsons segments. Parsons code is often used in the retrieval and study of music </w:t>
+        <w:t>. We used 1-</w:t>
+      </w:r>
+      <w:proofErr w:type="gramStart"/>
+      <w:r>
+        <w:rPr>
+          <w:rFonts w:ascii="Arial" w:hAnsi="Arial" w:cs="Arial"/>
+        </w:rPr>
+        <w:t>Parsons</w:t>
+      </w:r>
+      <w:proofErr w:type="gramEnd"/>
+      <w:r>
+        <w:rPr>
+          <w:rFonts w:ascii="Arial" w:hAnsi="Arial" w:cs="Arial"/>
+        </w:rPr>
+        <w:t xml:space="preserve"> encoding, which reduces the frequences profile of a signal to a “</w:t>
+      </w:r>
+      <w:proofErr w:type="spellStart"/>
+      <w:r>
+        <w:rPr>
+          <w:rFonts w:ascii="Arial" w:hAnsi="Arial" w:cs="Arial"/>
+        </w:rPr>
+        <w:t>trit</w:t>
+      </w:r>
+      <w:proofErr w:type="spellEnd"/>
+      <w:r>
+        <w:rPr>
+          <w:rFonts w:ascii="Arial" w:hAnsi="Arial" w:cs="Arial"/>
+        </w:rPr>
+        <w:t xml:space="preserve">” of information by noting the direction of frequency change (up, down, or constant) in a series of subsamples from the original signal, known as Parsons segments. Parsons code is often used in the retrieval and study of music </w:t>
       </w:r>
       <w:r>
         <w:rPr>
@@ -4177,7 +4257,21 @@
         <w:rPr>
           <w:rFonts w:ascii="Arial" w:hAnsi="Arial" w:cs="Arial"/>
         </w:rPr>
-        <w:t xml:space="preserve"> synthetic audio signals using the Soundgen </w:t>
+        <w:t xml:space="preserve"> synthetic audio signals using the </w:t>
+      </w:r>
+      <w:proofErr w:type="spellStart"/>
+      <w:r>
+        <w:rPr>
+          <w:rFonts w:ascii="Arial" w:hAnsi="Arial" w:cs="Arial"/>
+        </w:rPr>
+        <w:t>Soundgen</w:t>
+      </w:r>
+      <w:proofErr w:type="spellEnd"/>
+      <w:r>
+        <w:rPr>
+          <w:rFonts w:ascii="Arial" w:hAnsi="Arial" w:cs="Arial"/>
+        </w:rPr>
+        <w:t xml:space="preserve"> </w:t>
       </w:r>
       <w:r>
         <w:rPr>
@@ -4240,7 +4334,21 @@
         <w:rPr>
           <w:rFonts w:ascii="Arial" w:hAnsi="Arial" w:cs="Arial"/>
         </w:rPr>
-        <w:t>We used R to generate strings and synthetic audio signals, using the paRsynth package (code found TKTK here)</w:t>
+        <w:t xml:space="preserve">We used R to generate strings and synthetic audio signals, using the </w:t>
+      </w:r>
+      <w:proofErr w:type="spellStart"/>
+      <w:r>
+        <w:rPr>
+          <w:rFonts w:ascii="Arial" w:hAnsi="Arial" w:cs="Arial"/>
+        </w:rPr>
+        <w:t>paRsynth</w:t>
+      </w:r>
+      <w:proofErr w:type="spellEnd"/>
+      <w:r>
+        <w:rPr>
+          <w:rFonts w:ascii="Arial" w:hAnsi="Arial" w:cs="Arial"/>
+        </w:rPr>
+        <w:t xml:space="preserve"> package (code found TKTK here)</w:t>
       </w:r>
       <w:r>
         <w:rPr>
@@ -4446,7 +4554,21 @@
         <w:rPr>
           <w:rFonts w:ascii="Arial" w:hAnsi="Arial" w:cs="Arial"/>
         </w:rPr>
-        <w:t>, and group information was set to a character length of 4 characters. For both datasets, there were 5 groups with 10 individuals per group. Each individual “</w:t>
+        <w:t xml:space="preserve">, and group information was set to a character length of 4 characters. For both datasets, there were 5 groups with 10 individuals per group. </w:t>
+      </w:r>
+      <w:proofErr w:type="gramStart"/>
+      <w:r>
+        <w:rPr>
+          <w:rFonts w:ascii="Arial" w:hAnsi="Arial" w:cs="Arial"/>
+        </w:rPr>
+        <w:t>Each individual</w:t>
+      </w:r>
+      <w:proofErr w:type="gramEnd"/>
+      <w:r>
+        <w:rPr>
+          <w:rFonts w:ascii="Arial" w:hAnsi="Arial" w:cs="Arial"/>
+        </w:rPr>
+        <w:t xml:space="preserve"> “</w:t>
       </w:r>
       <w:commentRangeStart w:id="39"/>
       <w:commentRangeStart w:id="40"/>
@@ -4497,7 +4619,21 @@
         <w:rPr>
           <w:rFonts w:ascii="Arial" w:hAnsi="Arial" w:cs="Arial"/>
         </w:rPr>
-        <w:t xml:space="preserve">After generating synthetic signals for these datasets, we used the warbleR package to convert the .wav files to spectrograms. </w:t>
+        <w:t xml:space="preserve">After generating synthetic signals for these datasets, we used the </w:t>
+      </w:r>
+      <w:proofErr w:type="spellStart"/>
+      <w:r>
+        <w:rPr>
+          <w:rFonts w:ascii="Arial" w:hAnsi="Arial" w:cs="Arial"/>
+        </w:rPr>
+        <w:t>warbleR</w:t>
+      </w:r>
+      <w:proofErr w:type="spellEnd"/>
+      <w:r>
+        <w:rPr>
+          <w:rFonts w:ascii="Arial" w:hAnsi="Arial" w:cs="Arial"/>
+        </w:rPr>
+        <w:t xml:space="preserve"> package to convert the .wav files to spectrograms. </w:t>
       </w:r>
       <w:r>
         <w:rPr>
@@ -4604,7 +4740,21 @@
         <w:rPr>
           <w:rFonts w:ascii="Arial" w:hAnsi="Arial" w:cs="Arial"/>
         </w:rPr>
-        <w:t xml:space="preserve"> using the warbleR package. </w:t>
+        <w:t xml:space="preserve"> using the </w:t>
+      </w:r>
+      <w:proofErr w:type="spellStart"/>
+      <w:r>
+        <w:rPr>
+          <w:rFonts w:ascii="Arial" w:hAnsi="Arial" w:cs="Arial"/>
+        </w:rPr>
+        <w:t>warbleR</w:t>
+      </w:r>
+      <w:proofErr w:type="spellEnd"/>
+      <w:r>
+        <w:rPr>
+          <w:rFonts w:ascii="Arial" w:hAnsi="Arial" w:cs="Arial"/>
+        </w:rPr>
+        <w:t xml:space="preserve"> package. </w:t>
       </w:r>
       <w:r>
         <w:rPr>
@@ -4785,7 +4935,21 @@
         <w:rPr>
           <w:rFonts w:ascii="Arial" w:hAnsi="Arial" w:cs="Arial"/>
         </w:rPr>
-        <w:t xml:space="preserve"> we created 5 different datasets that varied the proportion of group to individual information encoded in calls</w:t>
+        <w:t xml:space="preserve"> we created 5 different </w:t>
+      </w:r>
+      <w:proofErr w:type="gramStart"/>
+      <w:r>
+        <w:rPr>
+          <w:rFonts w:ascii="Arial" w:hAnsi="Arial" w:cs="Arial"/>
+        </w:rPr>
+        <w:t>datasets</w:t>
+      </w:r>
+      <w:proofErr w:type="gramEnd"/>
+      <w:r>
+        <w:rPr>
+          <w:rFonts w:ascii="Arial" w:hAnsi="Arial" w:cs="Arial"/>
+        </w:rPr>
+        <w:t xml:space="preserve"> that varied the proportion of group to individual information encoded in calls</w:t>
       </w:r>
       <w:r>
         <w:rPr>
@@ -4831,7 +4995,21 @@
           <w:rFonts w:ascii="Arial" w:hAnsi="Arial" w:cs="Arial"/>
         </w:rPr>
         <w:tab/>
-        <w:t xml:space="preserve">After generating the synthetic audio files, we used the warbleR package to perform SPCC. </w:t>
+        <w:t xml:space="preserve">After generating the synthetic audio files, we used the </w:t>
+      </w:r>
+      <w:proofErr w:type="spellStart"/>
+      <w:r>
+        <w:rPr>
+          <w:rFonts w:ascii="Arial" w:hAnsi="Arial" w:cs="Arial"/>
+        </w:rPr>
+        <w:t>warbleR</w:t>
+      </w:r>
+      <w:proofErr w:type="spellEnd"/>
+      <w:r>
+        <w:rPr>
+          <w:rFonts w:ascii="Arial" w:hAnsi="Arial" w:cs="Arial"/>
+        </w:rPr>
+        <w:t xml:space="preserve"> package to perform SPCC. </w:t>
       </w:r>
       <w:r>
         <w:rPr>
@@ -4920,21 +5098,30 @@
     </w:p>
     <w:p>
       <w:pPr>
+        <w:pStyle w:val="ListParagraph"/>
         <w:spacing w:line="360" w:lineRule="auto"/>
-        <w:rPr>
-          <w:rFonts w:ascii="Arial" w:hAnsi="Arial" w:cs="Arial"/>
-        </w:rPr>
-      </w:pPr>
-      <w:commentRangeStart w:id="45"/>
+        <w:ind w:left="1440"/>
+        <w:rPr>
+          <w:rFonts w:ascii="Arial" w:hAnsi="Arial" w:cs="Arial"/>
+        </w:rPr>
+      </w:pPr>
       <w:r>
         <w:rPr>
           <w:noProof/>
         </w:rPr>
         <w:drawing>
-          <wp:inline distT="0" distB="0" distL="0" distR="0" wp14:anchorId="5A2BE49C" wp14:editId="4E07313E">
-            <wp:extent cx="5943600" cy="3343275"/>
-            <wp:effectExtent l="0" t="0" r="0" b="9525"/>
-            <wp:docPr id="156697742" name="Picture 1" descr="A collage of multiple images of data&#10;&#10;Description automatically generated"/>
+          <wp:anchor distT="0" distB="0" distL="114300" distR="114300" simplePos="0" relativeHeight="251658240" behindDoc="0" locked="0" layoutInCell="1" allowOverlap="1" wp14:anchorId="4D52800F" wp14:editId="1DBB2A4F">
+            <wp:simplePos x="0" y="0"/>
+            <wp:positionH relativeFrom="column">
+              <wp:posOffset>-577850</wp:posOffset>
+            </wp:positionH>
+            <wp:positionV relativeFrom="paragraph">
+              <wp:posOffset>260985</wp:posOffset>
+            </wp:positionV>
+            <wp:extent cx="7146290" cy="4019550"/>
+            <wp:effectExtent l="0" t="0" r="0" b="0"/>
+            <wp:wrapTopAndBottom/>
+            <wp:docPr id="1915005499" name="Picture 1" descr="A screenshot of a graph&#10;&#10;AI-generated content may be incorrect."/>
             <wp:cNvGraphicFramePr>
               <a:graphicFrameLocks xmlns:a="http://schemas.openxmlformats.org/drawingml/2006/main" noChangeAspect="1"/>
             </wp:cNvGraphicFramePr>
@@ -4942,7 +5129,7 @@
               <a:graphicData uri="http://schemas.openxmlformats.org/drawingml/2006/picture">
                 <pic:pic xmlns:pic="http://schemas.openxmlformats.org/drawingml/2006/picture">
                   <pic:nvPicPr>
-                    <pic:cNvPr id="156697742" name="Picture 1" descr="A collage of multiple images of data&#10;&#10;Description automatically generated"/>
+                    <pic:cNvPr id="1915005499" name="Picture 1" descr="A screenshot of a graph&#10;&#10;AI-generated content may be incorrect."/>
                     <pic:cNvPicPr>
                       <a:picLocks noChangeAspect="1" noChangeArrowheads="1"/>
                     </pic:cNvPicPr>
@@ -4963,7 +5150,7 @@
                   <pic:spPr bwMode="auto">
                     <a:xfrm>
                       <a:off x="0" y="0"/>
-                      <a:ext cx="5943600" cy="3343275"/>
+                      <a:ext cx="7146290" cy="4019550"/>
                     </a:xfrm>
                     <a:prstGeom prst="rect">
                       <a:avLst/>
@@ -4976,9 +5163,32 @@
                 </pic:pic>
               </a:graphicData>
             </a:graphic>
-          </wp:inline>
+            <wp14:sizeRelH relativeFrom="margin">
+              <wp14:pctWidth>0</wp14:pctWidth>
+            </wp14:sizeRelH>
+            <wp14:sizeRelV relativeFrom="margin">
+              <wp14:pctHeight>0</wp14:pctHeight>
+            </wp14:sizeRelV>
+          </wp:anchor>
         </w:drawing>
       </w:r>
+    </w:p>
+    <w:p>
+      <w:pPr>
+        <w:spacing w:line="360" w:lineRule="auto"/>
+        <w:rPr>
+          <w:noProof/>
+        </w:rPr>
+      </w:pPr>
+    </w:p>
+    <w:p>
+      <w:pPr>
+        <w:spacing w:line="360" w:lineRule="auto"/>
+        <w:rPr>
+          <w:rFonts w:ascii="Arial" w:hAnsi="Arial" w:cs="Arial"/>
+        </w:rPr>
+      </w:pPr>
+      <w:commentRangeStart w:id="45"/>
       <w:commentRangeEnd w:id="45"/>
       <w:r>
         <w:rPr>
@@ -4986,17 +5196,6 @@
         </w:rPr>
         <w:commentReference w:id="45"/>
       </w:r>
-    </w:p>
-    <w:p>
-      <w:pPr>
-        <w:spacing w:line="360" w:lineRule="auto"/>
-        <w:rPr>
-          <w:rFonts w:ascii="Arial" w:hAnsi="Arial" w:cs="Arial"/>
-          <w:sz w:val="20"/>
-          <w:szCs w:val="20"/>
-        </w:rPr>
-      </w:pPr>
-      <w:commentRangeStart w:id="46"/>
       <w:r>
         <w:rPr>
           <w:rFonts w:ascii="Arial" w:hAnsi="Arial" w:cs="Arial"/>
@@ -5013,22 +5212,7 @@
           <w:sz w:val="20"/>
           <w:szCs w:val="20"/>
         </w:rPr>
-        <w:t xml:space="preserve"> </w:t>
-      </w:r>
-      <w:commentRangeEnd w:id="46"/>
-      <w:r>
-        <w:rPr>
-          <w:rStyle w:val="CommentReference"/>
-        </w:rPr>
-        <w:commentReference w:id="46"/>
-      </w:r>
-      <w:r>
-        <w:rPr>
-          <w:rFonts w:ascii="Arial" w:hAnsi="Arial" w:cs="Arial"/>
-          <w:sz w:val="20"/>
-          <w:szCs w:val="20"/>
-        </w:rPr>
-        <w:t xml:space="preserve">Acoustic space plots representing </w:t>
+        <w:t xml:space="preserve"> Acoustic space plots representing </w:t>
       </w:r>
       <w:r>
         <w:rPr>
@@ -5236,7 +5420,6 @@
           <w:sz w:val="20"/>
           <w:szCs w:val="20"/>
         </w:rPr>
-        <w:lastRenderedPageBreak/>
         <w:t xml:space="preserve">(D) </w:t>
       </w:r>
       <w:r>
@@ -5269,25 +5452,43 @@
           <w:sz w:val="20"/>
           <w:szCs w:val="20"/>
         </w:rPr>
-        <w:t xml:space="preserve"> Colors represent original group identity, shapes represent </w:t>
-      </w:r>
+        <w:t xml:space="preserve"> Colors represent group </w:t>
+      </w:r>
+      <w:proofErr w:type="gramStart"/>
       <w:r>
         <w:rPr>
           <w:rFonts w:ascii="Arial" w:hAnsi="Arial" w:cs="Arial"/>
           <w:sz w:val="20"/>
           <w:szCs w:val="20"/>
         </w:rPr>
-        <w:t>different individuals.</w:t>
-      </w:r>
-    </w:p>
-    <w:p>
-      <w:pPr>
-        <w:spacing w:line="360" w:lineRule="auto"/>
+        <w:t>identity,</w:t>
+      </w:r>
+      <w:proofErr w:type="gramEnd"/>
+      <w:r>
         <w:rPr>
           <w:rFonts w:ascii="Arial" w:hAnsi="Arial" w:cs="Arial"/>
           <w:sz w:val="20"/>
           <w:szCs w:val="20"/>
         </w:rPr>
+        <w:t xml:space="preserve"> shapes represent </w:t>
+      </w:r>
+      <w:r>
+        <w:rPr>
+          <w:rFonts w:ascii="Arial" w:hAnsi="Arial" w:cs="Arial"/>
+          <w:sz w:val="20"/>
+          <w:szCs w:val="20"/>
+        </w:rPr>
+        <w:t>different individuals.</w:t>
+      </w:r>
+    </w:p>
+    <w:p>
+      <w:pPr>
+        <w:spacing w:line="360" w:lineRule="auto"/>
+        <w:rPr>
+          <w:rFonts w:ascii="Arial" w:hAnsi="Arial" w:cs="Arial"/>
+          <w:sz w:val="20"/>
+          <w:szCs w:val="20"/>
+        </w:rPr>
       </w:pPr>
     </w:p>
     <w:p>
@@ -5491,7 +5692,21 @@
         <w:rPr>
           <w:rFonts w:ascii="Arial" w:hAnsi="Arial" w:cs="Arial"/>
         </w:rPr>
-        <w:t xml:space="preserve">with the synthetic signals where more individual identity information was encoded, there </w:t>
+        <w:t xml:space="preserve">with the synthetic signals where </w:t>
+      </w:r>
+      <w:proofErr w:type="gramStart"/>
+      <w:r>
+        <w:rPr>
+          <w:rFonts w:ascii="Arial" w:hAnsi="Arial" w:cs="Arial"/>
+        </w:rPr>
+        <w:t>more</w:t>
+      </w:r>
+      <w:proofErr w:type="gramEnd"/>
+      <w:r>
+        <w:rPr>
+          <w:rFonts w:ascii="Arial" w:hAnsi="Arial" w:cs="Arial"/>
+        </w:rPr>
+        <w:t xml:space="preserve"> individual identity information was encoded, there </w:t>
       </w:r>
       <w:r>
         <w:rPr>
@@ -5539,7 +5754,7 @@
         </w:rPr>
         <w:t xml:space="preserve">. </w:t>
       </w:r>
-      <w:commentRangeStart w:id="47"/>
+      <w:commentRangeStart w:id="46"/>
       <w:r>
         <w:rPr>
           <w:rFonts w:ascii="Arial" w:hAnsi="Arial" w:cs="Arial"/>
@@ -5570,12 +5785,12 @@
         </w:rPr>
         <w:t xml:space="preserve"> when running traditional bioacoustics analyses on our synthetically generated calls.</w:t>
       </w:r>
-      <w:commentRangeEnd w:id="47"/>
+      <w:commentRangeEnd w:id="46"/>
       <w:r>
         <w:rPr>
           <w:rStyle w:val="CommentReference"/>
         </w:rPr>
-        <w:commentReference w:id="47"/>
+        <w:commentReference w:id="46"/>
       </w:r>
     </w:p>
     <w:p>
@@ -5597,7 +5812,7 @@
           <w:szCs w:val="18"/>
         </w:rPr>
       </w:pPr>
-      <w:commentRangeStart w:id="48"/>
+      <w:commentRangeStart w:id="47"/>
       <w:r>
         <w:rPr>
           <w:rFonts w:ascii="Arial" w:hAnsi="Arial" w:cs="Arial"/>
@@ -5608,12 +5823,12 @@
         </w:rPr>
         <w:t>Discussion points:</w:t>
       </w:r>
-      <w:commentRangeEnd w:id="48"/>
+      <w:commentRangeEnd w:id="47"/>
       <w:r>
         <w:rPr>
           <w:rStyle w:val="CommentReference"/>
         </w:rPr>
-        <w:commentReference w:id="48"/>
+        <w:commentReference w:id="47"/>
       </w:r>
     </w:p>
     <w:p>
@@ -5855,23 +6070,25 @@
           <w:sz w:val="18"/>
           <w:szCs w:val="18"/>
         </w:rPr>
-        <w:t xml:space="preserve">encoded within call, but try to cluster/group them by </w:t>
-      </w:r>
+        <w:t xml:space="preserve">encoded within </w:t>
+      </w:r>
+      <w:proofErr w:type="gramStart"/>
       <w:r>
         <w:rPr>
           <w:rFonts w:ascii="Arial" w:hAnsi="Arial" w:cs="Arial"/>
           <w:sz w:val="18"/>
           <w:szCs w:val="18"/>
         </w:rPr>
-        <w:t>group membership. W</w:t>
-      </w:r>
+        <w:t>call, but</w:t>
+      </w:r>
+      <w:proofErr w:type="gramEnd"/>
       <w:r>
         <w:rPr>
           <w:rFonts w:ascii="Arial" w:hAnsi="Arial" w:cs="Arial"/>
           <w:sz w:val="18"/>
           <w:szCs w:val="18"/>
         </w:rPr>
-        <w:t xml:space="preserve">ith more </w:t>
+        <w:t xml:space="preserve"> try to cluster/group them by </w:t>
       </w:r>
       <w:r>
         <w:rPr>
@@ -5879,7 +6096,7 @@
           <w:sz w:val="18"/>
           <w:szCs w:val="18"/>
         </w:rPr>
-        <w:t xml:space="preserve">identity information encoded within a call than group membership, </w:t>
+        <w:t>group membership. W</w:t>
       </w:r>
       <w:r>
         <w:rPr>
@@ -5887,7 +6104,7 @@
           <w:sz w:val="18"/>
           <w:szCs w:val="18"/>
         </w:rPr>
-        <w:t xml:space="preserve">individuals in the same group </w:t>
+        <w:t xml:space="preserve">ith more </w:t>
       </w:r>
       <w:r>
         <w:rPr>
@@ -5895,7 +6112,7 @@
           <w:sz w:val="18"/>
           <w:szCs w:val="18"/>
         </w:rPr>
-        <w:t xml:space="preserve">“actively work” / </w:t>
+        <w:t xml:space="preserve">identity information encoded within a call than group membership, </w:t>
       </w:r>
       <w:r>
         <w:rPr>
@@ -5903,7 +6120,7 @@
           <w:sz w:val="18"/>
           <w:szCs w:val="18"/>
         </w:rPr>
-        <w:t xml:space="preserve">“try” to be as different as they can from each other, so </w:t>
+        <w:t xml:space="preserve">individuals in the same group </w:t>
       </w:r>
       <w:r>
         <w:rPr>
@@ -5911,7 +6128,7 @@
           <w:sz w:val="18"/>
           <w:szCs w:val="18"/>
         </w:rPr>
-        <w:t>they all take up very different parts of the acoustic space. This results in a lot of overlap between these group polygon</w:t>
+        <w:t xml:space="preserve">“actively work” / </w:t>
       </w:r>
       <w:r>
         <w:rPr>
@@ -5919,7 +6136,41 @@
           <w:sz w:val="18"/>
           <w:szCs w:val="18"/>
         </w:rPr>
-        <w:t>s – by trying to remain very different from individuals within their group, they may be quite similar to other individuals from other groups by random chance</w:t>
+        <w:t xml:space="preserve">“try” to be as different as they can from each other, so </w:t>
+      </w:r>
+      <w:r>
+        <w:rPr>
+          <w:rFonts w:ascii="Arial" w:hAnsi="Arial" w:cs="Arial"/>
+          <w:sz w:val="18"/>
+          <w:szCs w:val="18"/>
+        </w:rPr>
+        <w:t>they all take up very different parts of the acoustic space. This results in a lot of overlap between these group polygon</w:t>
+      </w:r>
+      <w:r>
+        <w:rPr>
+          <w:rFonts w:ascii="Arial" w:hAnsi="Arial" w:cs="Arial"/>
+          <w:sz w:val="18"/>
+          <w:szCs w:val="18"/>
+        </w:rPr>
+        <w:t xml:space="preserve">s – by trying to remain very different from individuals within their group, they may be quite </w:t>
+      </w:r>
+      <w:proofErr w:type="gramStart"/>
+      <w:r>
+        <w:rPr>
+          <w:rFonts w:ascii="Arial" w:hAnsi="Arial" w:cs="Arial"/>
+          <w:sz w:val="18"/>
+          <w:szCs w:val="18"/>
+        </w:rPr>
+        <w:t>similar to</w:t>
+      </w:r>
+      <w:proofErr w:type="gramEnd"/>
+      <w:r>
+        <w:rPr>
+          <w:rFonts w:ascii="Arial" w:hAnsi="Arial" w:cs="Arial"/>
+          <w:sz w:val="18"/>
+          <w:szCs w:val="18"/>
+        </w:rPr>
+        <w:t xml:space="preserve"> other individuals from other groups by random chance</w:t>
       </w:r>
       <w:r>
         <w:rPr>
@@ -6015,15 +6266,16 @@
           <w:sz w:val="18"/>
           <w:szCs w:val="18"/>
         </w:rPr>
-        <w:t xml:space="preserve"> the group, </w:t>
-      </w:r>
+        <w:t xml:space="preserve"> the </w:t>
+      </w:r>
+      <w:proofErr w:type="gramStart"/>
       <w:r>
         <w:rPr>
           <w:rFonts w:ascii="Arial" w:hAnsi="Arial" w:cs="Arial"/>
           <w:sz w:val="18"/>
           <w:szCs w:val="18"/>
         </w:rPr>
-        <w:t xml:space="preserve">and </w:t>
+        <w:t xml:space="preserve">group, </w:t>
       </w:r>
       <w:r>
         <w:rPr>
@@ -6031,15 +6283,16 @@
           <w:sz w:val="18"/>
           <w:szCs w:val="18"/>
         </w:rPr>
-        <w:t>will all take up separate acoustic space and therefore cluster individually rather than in group clusters.</w:t>
-      </w:r>
+        <w:t>and</w:t>
+      </w:r>
+      <w:proofErr w:type="gramEnd"/>
       <w:r>
         <w:rPr>
           <w:rFonts w:ascii="Arial" w:hAnsi="Arial" w:cs="Arial"/>
           <w:sz w:val="18"/>
           <w:szCs w:val="18"/>
         </w:rPr>
-        <w:t xml:space="preserve"> More convergence within the individual than the group.</w:t>
+        <w:t xml:space="preserve"> </w:t>
       </w:r>
       <w:r>
         <w:rPr>
@@ -6047,6 +6300,31 @@
           <w:sz w:val="18"/>
           <w:szCs w:val="18"/>
         </w:rPr>
+        <w:t>will all take up separate acoustic space and therefore cluster individually rather than in group clusters.</w:t>
+      </w:r>
+      <w:r>
+        <w:rPr>
+          <w:rFonts w:ascii="Arial" w:hAnsi="Arial" w:cs="Arial"/>
+          <w:sz w:val="18"/>
+          <w:szCs w:val="18"/>
+        </w:rPr>
+        <w:t xml:space="preserve"> More convergence within the individual </w:t>
+      </w:r>
+      <w:r>
+        <w:rPr>
+          <w:rFonts w:ascii="Arial" w:hAnsi="Arial" w:cs="Arial"/>
+          <w:sz w:val="18"/>
+          <w:szCs w:val="18"/>
+        </w:rPr>
+        <w:lastRenderedPageBreak/>
+        <w:t>than the group.</w:t>
+      </w:r>
+      <w:r>
+        <w:rPr>
+          <w:rFonts w:ascii="Arial" w:hAnsi="Arial" w:cs="Arial"/>
+          <w:sz w:val="18"/>
+          <w:szCs w:val="18"/>
+        </w:rPr>
         <w:t xml:space="preserve"> Individuals in the same group “actively work” / “try” to be as different as they can from each other, so they all take up very different parts of the acoustic space.</w:t>
       </w:r>
     </w:p>
@@ -6079,7 +6357,7 @@
           <w:bCs/>
         </w:rPr>
       </w:pPr>
-      <w:commentRangeStart w:id="49"/>
+      <w:commentRangeStart w:id="48"/>
       <w:r>
         <w:rPr>
           <w:rFonts w:ascii="Arial" w:hAnsi="Arial" w:cs="Arial"/>
@@ -6088,12 +6366,12 @@
         </w:rPr>
         <w:t>Discussion</w:t>
       </w:r>
-      <w:commentRangeEnd w:id="49"/>
+      <w:commentRangeEnd w:id="48"/>
       <w:r>
         <w:rPr>
           <w:rStyle w:val="CommentReference"/>
         </w:rPr>
-        <w:commentReference w:id="49"/>
+        <w:commentReference w:id="48"/>
       </w:r>
       <w:r>
         <w:rPr>
@@ -6127,19 +6405,19 @@
         </w:rPr>
         <w:t xml:space="preserve">Synthetic tools offer a practical solution, by allowing us to control </w:t>
       </w:r>
-      <w:commentRangeStart w:id="50"/>
+      <w:commentRangeStart w:id="49"/>
       <w:r>
         <w:rPr>
           <w:rFonts w:ascii="Arial" w:hAnsi="Arial" w:cs="Arial"/>
         </w:rPr>
         <w:t>these</w:t>
       </w:r>
-      <w:commentRangeEnd w:id="50"/>
+      <w:commentRangeEnd w:id="49"/>
       <w:r>
         <w:rPr>
           <w:rStyle w:val="CommentReference"/>
         </w:rPr>
-        <w:commentReference w:id="50"/>
+        <w:commentReference w:id="49"/>
       </w:r>
       <w:r>
         <w:rPr>
@@ -6147,7 +6425,7 @@
         </w:rPr>
         <w:t xml:space="preserve"> variables, while still providing datasets that mimic biologic</w:t>
       </w:r>
-      <w:ins w:id="51" w:author="Summer Eckhardt" w:date="2025-01-24T10:16:00Z" w16du:dateUtc="2025-01-24T15:16:00Z">
+      <w:ins w:id="50" w:author="Summer Eckhardt" w:date="2025-01-24T10:16:00Z" w16du:dateUtc="2025-01-24T15:16:00Z">
         <w:r>
           <w:rPr>
             <w:rFonts w:ascii="Arial" w:hAnsi="Arial" w:cs="Arial"/>
@@ -6161,7 +6439,7 @@
         </w:rPr>
         <w:t xml:space="preserve"> ones. Currently</w:t>
       </w:r>
-      <w:ins w:id="52" w:author="Summer Eckhardt" w:date="2025-01-24T10:16:00Z" w16du:dateUtc="2025-01-24T15:16:00Z">
+      <w:ins w:id="51" w:author="Summer Eckhardt" w:date="2025-01-24T10:16:00Z" w16du:dateUtc="2025-01-24T15:16:00Z">
         <w:r>
           <w:rPr>
             <w:rFonts w:ascii="Arial" w:hAnsi="Arial" w:cs="Arial"/>
@@ -6175,7 +6453,7 @@
         </w:rPr>
         <w:t xml:space="preserve"> there are calls for vocal communication research to take advantage </w:t>
       </w:r>
-      <w:ins w:id="53" w:author="Summer Eckhardt" w:date="2025-01-24T10:16:00Z" w16du:dateUtc="2025-01-24T15:16:00Z">
+      <w:ins w:id="52" w:author="Summer Eckhardt" w:date="2025-01-24T10:16:00Z" w16du:dateUtc="2025-01-24T15:16:00Z">
         <w:r>
           <w:rPr>
             <w:rFonts w:ascii="Arial" w:hAnsi="Arial" w:cs="Arial"/>
@@ -6187,7 +6465,85 @@
         <w:rPr>
           <w:rFonts w:ascii="Arial" w:hAnsi="Arial" w:cs="Arial"/>
         </w:rPr>
-        <w:t xml:space="preserve">large-scale quantification methods that are often used in animal movement research (Sainburg &amp; Gentner, 2021). Researchers are already using these datasets in combination with natural ones to determine which analytic tools perform best to assess complexity and animal vocal sequences (Kershenbaum &amp; Garland, 2015) or to validate new methods for calculate and quantify acoustic structure (Keen et al., 2021; Sawant et al., 2022). There are several packages in R that allow researchers to create synthetic vocal signal datasets with biological relevance. [sentences about wableR and soundgen]  . An underused function of these packages in animal communication is that they provide researchers with the ability to manipulate information in synthetic signals to specifically study the types of information encoded in a signal, how much information is encoded, and where the information is encoded in a signal.  </w:t>
+        <w:t>large-scale quantification methods that are often used in animal movement research (</w:t>
+      </w:r>
+      <w:proofErr w:type="spellStart"/>
+      <w:r>
+        <w:rPr>
+          <w:rFonts w:ascii="Arial" w:hAnsi="Arial" w:cs="Arial"/>
+        </w:rPr>
+        <w:t>Sainburg</w:t>
+      </w:r>
+      <w:proofErr w:type="spellEnd"/>
+      <w:r>
+        <w:rPr>
+          <w:rFonts w:ascii="Arial" w:hAnsi="Arial" w:cs="Arial"/>
+        </w:rPr>
+        <w:t xml:space="preserve"> &amp; Gentner, 2021). Researchers are already using these datasets in combination with natural ones to determine which analytic tools perform best to assess complexity and animal vocal sequences (</w:t>
+      </w:r>
+      <w:proofErr w:type="spellStart"/>
+      <w:r>
+        <w:rPr>
+          <w:rFonts w:ascii="Arial" w:hAnsi="Arial" w:cs="Arial"/>
+        </w:rPr>
+        <w:t>Kershenbaum</w:t>
+      </w:r>
+      <w:proofErr w:type="spellEnd"/>
+      <w:r>
+        <w:rPr>
+          <w:rFonts w:ascii="Arial" w:hAnsi="Arial" w:cs="Arial"/>
+        </w:rPr>
+        <w:t xml:space="preserve"> &amp; Garland, 2015) or to validate new methods for </w:t>
+      </w:r>
+      <w:proofErr w:type="gramStart"/>
+      <w:r>
+        <w:rPr>
+          <w:rFonts w:ascii="Arial" w:hAnsi="Arial" w:cs="Arial"/>
+        </w:rPr>
+        <w:t>calculate</w:t>
+      </w:r>
+      <w:proofErr w:type="gramEnd"/>
+      <w:r>
+        <w:rPr>
+          <w:rFonts w:ascii="Arial" w:hAnsi="Arial" w:cs="Arial"/>
+        </w:rPr>
+        <w:t xml:space="preserve"> and quantify acoustic structure (Keen et al., 2021; Sawant et al., 2022). There are several packages in R that allow researchers to create synthetic vocal signal datasets with biological relevance. [sentences about </w:t>
+      </w:r>
+      <w:proofErr w:type="spellStart"/>
+      <w:r>
+        <w:rPr>
+          <w:rFonts w:ascii="Arial" w:hAnsi="Arial" w:cs="Arial"/>
+        </w:rPr>
+        <w:t>wableR</w:t>
+      </w:r>
+      <w:proofErr w:type="spellEnd"/>
+      <w:r>
+        <w:rPr>
+          <w:rFonts w:ascii="Arial" w:hAnsi="Arial" w:cs="Arial"/>
+        </w:rPr>
+        <w:t xml:space="preserve"> and </w:t>
+      </w:r>
+      <w:proofErr w:type="spellStart"/>
+      <w:proofErr w:type="gramStart"/>
+      <w:r>
+        <w:rPr>
+          <w:rFonts w:ascii="Arial" w:hAnsi="Arial" w:cs="Arial"/>
+        </w:rPr>
+        <w:t>soundgen</w:t>
+      </w:r>
+      <w:proofErr w:type="spellEnd"/>
+      <w:r>
+        <w:rPr>
+          <w:rFonts w:ascii="Arial" w:hAnsi="Arial" w:cs="Arial"/>
+        </w:rPr>
+        <w:t>]  .</w:t>
+      </w:r>
+      <w:proofErr w:type="gramEnd"/>
+      <w:r>
+        <w:rPr>
+          <w:rFonts w:ascii="Arial" w:hAnsi="Arial" w:cs="Arial"/>
+        </w:rPr>
+        <w:t xml:space="preserve"> An underused function of these packages in animal communication is that they provide researchers with the ability to manipulate information in synthetic signals to specifically study the types of information encoded in a signal, how much information is encoded, and where the information is encoded in a signal.  </w:t>
       </w:r>
     </w:p>
     <w:p>
@@ -8001,19 +8357,63 @@
           <w:bCs/>
         </w:rPr>
       </w:pPr>
-      <w:commentRangeStart w:id="54"/>
-      <w:r>
-        <w:rPr>
-          <w:rFonts w:ascii="Arial" w:hAnsi="Arial" w:cs="Arial"/>
-        </w:rPr>
-        <w:t>Second, out ability to detect the dynamics of information encoding during real time social interactions is limited by our ability to capture the totality of an individual’s or groups signal produced during these interactions. We may be over sampling from vocal learning species whose social interaction and signal production are easy to observe and measure, and therefore may not be assessing the full scope of how information can be encoded across a range of species.</w:t>
-      </w:r>
-      <w:commentRangeEnd w:id="54"/>
+      <w:commentRangeStart w:id="53"/>
+      <w:r>
+        <w:rPr>
+          <w:rFonts w:ascii="Arial" w:hAnsi="Arial" w:cs="Arial"/>
+        </w:rPr>
+        <w:t xml:space="preserve">Second, </w:t>
+      </w:r>
+      <w:proofErr w:type="spellStart"/>
+      <w:proofErr w:type="gramStart"/>
+      <w:r>
+        <w:rPr>
+          <w:rFonts w:ascii="Arial" w:hAnsi="Arial" w:cs="Arial"/>
+        </w:rPr>
+        <w:t>out</w:t>
+      </w:r>
+      <w:proofErr w:type="spellEnd"/>
+      <w:proofErr w:type="gramEnd"/>
+      <w:r>
+        <w:rPr>
+          <w:rFonts w:ascii="Arial" w:hAnsi="Arial" w:cs="Arial"/>
+        </w:rPr>
+        <w:t xml:space="preserve"> ability to detect the dynamics of information encoding during real time social interactions is limited by our ability to capture the totality of an individual’s or groups signal produced during these interactions. We may </w:t>
+      </w:r>
+      <w:proofErr w:type="gramStart"/>
+      <w:r>
+        <w:rPr>
+          <w:rFonts w:ascii="Arial" w:hAnsi="Arial" w:cs="Arial"/>
+        </w:rPr>
+        <w:t>be over sampling</w:t>
+      </w:r>
+      <w:proofErr w:type="gramEnd"/>
+      <w:r>
+        <w:rPr>
+          <w:rFonts w:ascii="Arial" w:hAnsi="Arial" w:cs="Arial"/>
+        </w:rPr>
+        <w:t xml:space="preserve"> from vocal learning species whose social interaction and signal production are easy to observe and </w:t>
+      </w:r>
+      <w:proofErr w:type="gramStart"/>
+      <w:r>
+        <w:rPr>
+          <w:rFonts w:ascii="Arial" w:hAnsi="Arial" w:cs="Arial"/>
+        </w:rPr>
+        <w:t>measure, and</w:t>
+      </w:r>
+      <w:proofErr w:type="gramEnd"/>
+      <w:r>
+        <w:rPr>
+          <w:rFonts w:ascii="Arial" w:hAnsi="Arial" w:cs="Arial"/>
+        </w:rPr>
+        <w:t xml:space="preserve"> therefore may not be assessing the full scope of how information can be encoded across a range of species.</w:t>
+      </w:r>
+      <w:commentRangeEnd w:id="53"/>
       <w:r>
         <w:rPr>
           <w:rStyle w:val="CommentReference"/>
         </w:rPr>
-        <w:commentReference w:id="54"/>
+        <w:commentReference w:id="53"/>
       </w:r>
     </w:p>
     <w:p>
@@ -8038,15 +8438,22 @@
         </w:rPr>
         <w:t xml:space="preserve">Several computationally intensive tools have emerged to assess the degree or types of information encoded in </w:t>
       </w:r>
+      <w:commentRangeStart w:id="54"/>
       <w:commentRangeStart w:id="55"/>
       <w:commentRangeStart w:id="56"/>
-      <w:commentRangeStart w:id="57"/>
       <w:r>
         <w:rPr>
           <w:rFonts w:ascii="Arial" w:hAnsi="Arial" w:cs="Arial"/>
         </w:rPr>
         <w:t>signals</w:t>
       </w:r>
+      <w:commentRangeEnd w:id="54"/>
+      <w:r>
+        <w:rPr>
+          <w:rStyle w:val="CommentReference"/>
+        </w:rPr>
+        <w:commentReference w:id="54"/>
+      </w:r>
       <w:commentRangeEnd w:id="55"/>
       <w:r>
         <w:rPr>
@@ -8060,13 +8467,6 @@
           <w:rStyle w:val="CommentReference"/>
         </w:rPr>
         <w:commentReference w:id="56"/>
-      </w:r>
-      <w:commentRangeEnd w:id="57"/>
-      <w:r>
-        <w:rPr>
-          <w:rStyle w:val="CommentReference"/>
-        </w:rPr>
-        <w:commentReference w:id="57"/>
       </w:r>
       <w:r>
         <w:rPr>
@@ -8398,11 +8798,19 @@
           <w:rFonts w:ascii="Arial" w:hAnsi="Arial" w:cs="Arial"/>
         </w:rPr>
       </w:pPr>
-      <w:r>
-        <w:rPr>
-          <w:rFonts w:ascii="Arial" w:hAnsi="Arial" w:cs="Arial"/>
-        </w:rPr>
-        <w:t xml:space="preserve">paRsynth Part 2: validating types of analysis </w:t>
+      <w:proofErr w:type="spellStart"/>
+      <w:r>
+        <w:rPr>
+          <w:rFonts w:ascii="Arial" w:hAnsi="Arial" w:cs="Arial"/>
+        </w:rPr>
+        <w:t>paRsynth</w:t>
+      </w:r>
+      <w:proofErr w:type="spellEnd"/>
+      <w:r>
+        <w:rPr>
+          <w:rFonts w:ascii="Arial" w:hAnsi="Arial" w:cs="Arial"/>
+        </w:rPr>
+        <w:t xml:space="preserve"> Part 2: validating types of analysis </w:t>
       </w:r>
     </w:p>
     <w:p>
@@ -8514,7 +8922,21 @@
         <w:rPr>
           <w:rFonts w:ascii="Arial" w:hAnsi="Arial" w:cs="Arial"/>
         </w:rPr>
-        <w:t>These models allow us to address the statistical significance of the degree or magnitude of convergence (which we originally encoded using paRsynth). The inferential statistics layer to validate that the information we originally encoded can be recovered</w:t>
+        <w:t xml:space="preserve">These models allow us to address the statistical significance of the degree or magnitude of convergence (which we originally encoded using </w:t>
+      </w:r>
+      <w:proofErr w:type="spellStart"/>
+      <w:r>
+        <w:rPr>
+          <w:rFonts w:ascii="Arial" w:hAnsi="Arial" w:cs="Arial"/>
+        </w:rPr>
+        <w:t>paRsynth</w:t>
+      </w:r>
+      <w:proofErr w:type="spellEnd"/>
+      <w:r>
+        <w:rPr>
+          <w:rFonts w:ascii="Arial" w:hAnsi="Arial" w:cs="Arial"/>
+        </w:rPr>
+        <w:t>). The inferential statistics layer to validate that the information we originally encoded can be recovered</w:t>
       </w:r>
     </w:p>
     <w:p>
@@ -8535,7 +8957,21 @@
         <w:rPr>
           <w:rFonts w:ascii="Arial" w:hAnsi="Arial" w:cs="Arial"/>
         </w:rPr>
-        <w:t>A receiver standpoint on information recovery, in which we simulated signaler information encoding. Does the variation that we encoded actually matter???</w:t>
+        <w:t xml:space="preserve">A receiver standpoint on information recovery, in which we simulated signaler information encoding. Does the variation that we encoded </w:t>
+      </w:r>
+      <w:proofErr w:type="gramStart"/>
+      <w:r>
+        <w:rPr>
+          <w:rFonts w:ascii="Arial" w:hAnsi="Arial" w:cs="Arial"/>
+        </w:rPr>
+        <w:t>actually matter</w:t>
+      </w:r>
+      <w:proofErr w:type="gramEnd"/>
+      <w:r>
+        <w:rPr>
+          <w:rFonts w:ascii="Arial" w:hAnsi="Arial" w:cs="Arial"/>
+        </w:rPr>
+        <w:t>???</w:t>
       </w:r>
     </w:p>
     <w:p>
@@ -8556,7 +8992,21 @@
         <w:rPr>
           <w:rFonts w:ascii="Arial" w:hAnsi="Arial" w:cs="Arial"/>
         </w:rPr>
-        <w:t>Because we have repeated sampling at both social levels with known individuals, we can actually model variation in convergence within and between categories (individuals, groups) at each social level</w:t>
+        <w:t xml:space="preserve">Because we have repeated sampling at both social levels with known individuals, we can </w:t>
+      </w:r>
+      <w:proofErr w:type="gramStart"/>
+      <w:r>
+        <w:rPr>
+          <w:rFonts w:ascii="Arial" w:hAnsi="Arial" w:cs="Arial"/>
+        </w:rPr>
+        <w:t>actually model</w:t>
+      </w:r>
+      <w:proofErr w:type="gramEnd"/>
+      <w:r>
+        <w:rPr>
+          <w:rFonts w:ascii="Arial" w:hAnsi="Arial" w:cs="Arial"/>
+        </w:rPr>
+        <w:t xml:space="preserve"> variation in convergence within and between categories (individuals, groups) at each social level</w:t>
       </w:r>
     </w:p>
     <w:p>
@@ -9285,7 +9735,7 @@
       </w:r>
     </w:p>
   </w:comment>
-  <w:comment w:id="46" w:author="Summer Eckhardt" w:date="2025-01-28T15:32:00Z" w:initials="SE">
+  <w:comment w:id="46" w:author="Summer Eckhardt" w:date="2025-02-04T19:02:00Z" w:initials="SE">
     <w:p>
       <w:pPr>
         <w:pStyle w:val="CommentText"/>
@@ -9297,11 +9747,11 @@
         <w:annotationRef/>
       </w:r>
       <w:r>
-        <w:t>Made this figure 2 to follow paragraph above</w:t>
+        <w:t>Are these last few sentences repetitive?</w:t>
       </w:r>
     </w:p>
   </w:comment>
-  <w:comment w:id="47" w:author="Summer Eckhardt" w:date="2025-02-04T19:02:00Z" w:initials="SE">
+  <w:comment w:id="47" w:author="Summer Eckhardt" w:date="2025-01-29T09:35:00Z" w:initials="SE">
     <w:p>
       <w:pPr>
         <w:pStyle w:val="CommentText"/>
@@ -9313,11 +9763,11 @@
         <w:annotationRef/>
       </w:r>
       <w:r>
-        <w:t>Are these last few sentences repetitive?</w:t>
+        <w:t>These are some potential points for discussion - should any of these be included in results section?</w:t>
       </w:r>
     </w:p>
   </w:comment>
-  <w:comment w:id="48" w:author="Summer Eckhardt" w:date="2025-01-29T09:35:00Z" w:initials="SE">
+  <w:comment w:id="48" w:author="Coppinger, Brittany" w:date="2025-01-09T10:23:00Z" w:initials="BC">
     <w:p>
       <w:pPr>
         <w:pStyle w:val="CommentText"/>
@@ -9329,11 +9779,63 @@
         <w:annotationRef/>
       </w:r>
       <w:r>
-        <w:t>These are some potential points for discussion - should any of these be included in results section?</w:t>
-      </w:r>
+        <w:t xml:space="preserve">Make reference to the fact that we are using a very simple generative model to encode diversity of information in signals. </w:t>
+      </w:r>
+    </w:p>
+    <w:p>
+      <w:pPr>
+        <w:pStyle w:val="CommentText"/>
+      </w:pPr>
+    </w:p>
+    <w:p>
+      <w:pPr>
+        <w:pStyle w:val="CommentText"/>
+      </w:pPr>
+      <w:r>
+        <w:t xml:space="preserve">Currently, model has no link to the receiver side, so we are looking at information encoding, and information recovery pipeline simulates process of decoding information by receivers. </w:t>
+      </w:r>
+    </w:p>
+    <w:p>
+      <w:pPr>
+        <w:pStyle w:val="CommentText"/>
+      </w:pPr>
+    </w:p>
+    <w:p>
+      <w:pPr>
+        <w:pStyle w:val="CommentText"/>
+      </w:pPr>
+      <w:r>
+        <w:t>End:</w:t>
+      </w:r>
+    </w:p>
+    <w:p>
+      <w:pPr>
+        <w:pStyle w:val="CommentText"/>
+      </w:pPr>
+      <w:r>
+        <w:t>“Given the way we have constructed the pipeline, out methods are set up nicely to integrate with computation efficient simulations (ABM) of social interactions and/or communication exchanges between signalers and receivers. “</w:t>
+      </w:r>
+    </w:p>
+    <w:p>
+      <w:pPr>
+        <w:pStyle w:val="CommentText"/>
+      </w:pPr>
+    </w:p>
+    <w:p>
+      <w:pPr>
+        <w:pStyle w:val="CommentText"/>
+      </w:pPr>
+      <w:r>
+        <w:t>“Future research in this area would link pipelines to generative models capable of synthetic evolutionary change of the system. This pipeline makes it possible to create synthetic vocal represented as character strings (2) makes it possible to sonify those strings, such that they can be used in traditional bioacoustics pipelines. “</w:t>
+      </w:r>
+    </w:p>
+    <w:p>
+      <w:pPr>
+        <w:pStyle w:val="CommentText"/>
+      </w:pPr>
     </w:p>
   </w:comment>
-  <w:comment w:id="49" w:author="Coppinger, Brittany" w:date="2025-01-09T10:23:00Z" w:initials="BC">
+  <w:comment w:id="49" w:author="Summer Eckhardt" w:date="2025-01-24T10:16:00Z" w:initials="SE">
     <w:p>
       <w:pPr>
         <w:pStyle w:val="CommentText"/>
@@ -9345,79 +9847,11 @@
         <w:annotationRef/>
       </w:r>
       <w:r>
-        <w:t xml:space="preserve">Make reference to the fact that we are using a very simple generative model to encode diversity of information in signals. </w:t>
-      </w:r>
-    </w:p>
-    <w:p>
-      <w:pPr>
-        <w:pStyle w:val="CommentText"/>
-      </w:pPr>
-    </w:p>
-    <w:p>
-      <w:pPr>
-        <w:pStyle w:val="CommentText"/>
-      </w:pPr>
-      <w:r>
-        <w:t xml:space="preserve">Currently, model has no link to the receiver side, so we are looking at information encoding, and information recovery pipeline simulates process of decoding information by receivers. </w:t>
-      </w:r>
-    </w:p>
-    <w:p>
-      <w:pPr>
-        <w:pStyle w:val="CommentText"/>
-      </w:pPr>
-    </w:p>
-    <w:p>
-      <w:pPr>
-        <w:pStyle w:val="CommentText"/>
-      </w:pPr>
-      <w:r>
-        <w:t>End:</w:t>
-      </w:r>
-    </w:p>
-    <w:p>
-      <w:pPr>
-        <w:pStyle w:val="CommentText"/>
-      </w:pPr>
-      <w:r>
-        <w:t>“Given the way we have constructed the pipeline, out methods are set up nicely to integrate with computation efficient simulations (ABM) of social interactions and/or communication exchanges between signalers and receivers. “</w:t>
-      </w:r>
-    </w:p>
-    <w:p>
-      <w:pPr>
-        <w:pStyle w:val="CommentText"/>
-      </w:pPr>
-    </w:p>
-    <w:p>
-      <w:pPr>
-        <w:pStyle w:val="CommentText"/>
-      </w:pPr>
-      <w:r>
-        <w:t>“Future research in this area would link pipelines to generative models capable of synthetic evolutionary change of the system. This pipeline makes it possible to create synthetic vocal represented as character strings (2) makes it possible to sonify those strings, such that they can be used in traditional bioacoustics pipelines. “</w:t>
-      </w:r>
-    </w:p>
-    <w:p>
-      <w:pPr>
-        <w:pStyle w:val="CommentText"/>
-      </w:pPr>
+        <w:t>explain</w:t>
+      </w:r>
     </w:p>
   </w:comment>
-  <w:comment w:id="50" w:author="Summer Eckhardt" w:date="2025-01-24T10:16:00Z" w:initials="SE">
-    <w:p>
-      <w:pPr>
-        <w:pStyle w:val="CommentText"/>
-      </w:pPr>
-      <w:r>
-        <w:rPr>
-          <w:rStyle w:val="CommentReference"/>
-        </w:rPr>
-        <w:annotationRef/>
-      </w:r>
-      <w:r>
-        <w:t>explain</w:t>
-      </w:r>
-    </w:p>
-  </w:comment>
-  <w:comment w:id="54" w:author="Smith Vidaurre, Grace" w:date="2024-12-18T15:30:00Z" w:initials="GSV">
+  <w:comment w:id="53" w:author="Smith Vidaurre, Grace" w:date="2024-12-18T15:30:00Z" w:initials="GSV">
     <w:p>
       <w:r>
         <w:rPr>
@@ -9434,7 +9868,7 @@
       </w:r>
     </w:p>
   </w:comment>
-  <w:comment w:id="55" w:author="Smith Vidaurre, Grace" w:date="2024-12-16T09:35:00Z" w:initials="GSV">
+  <w:comment w:id="54" w:author="Smith Vidaurre, Grace" w:date="2024-12-16T09:35:00Z" w:initials="GSV">
     <w:p>
       <w:r>
         <w:rPr>
@@ -9451,7 +9885,7 @@
       </w:r>
     </w:p>
   </w:comment>
-  <w:comment w:id="56" w:author="Smith Vidaurre, Grace" w:date="2024-12-16T09:41:00Z" w:initials="GSV">
+  <w:comment w:id="55" w:author="Smith Vidaurre, Grace" w:date="2024-12-16T09:41:00Z" w:initials="GSV">
     <w:p>
       <w:r>
         <w:rPr>
@@ -9468,7 +9902,7 @@
       </w:r>
     </w:p>
   </w:comment>
-  <w:comment w:id="57" w:author="Coppinger, Brittany" w:date="2024-12-16T14:51:00Z" w:initials="BC">
+  <w:comment w:id="56" w:author="Coppinger, Brittany" w:date="2024-12-16T14:51:00Z" w:initials="BC">
     <w:p>
       <w:pPr>
         <w:pStyle w:val="CommentText"/>
@@ -9567,8 +10001,7 @@
   <w15:commentEx w15:paraId="11E16C30" w15:done="0"/>
   <w15:commentEx w15:paraId="27843223" w15:done="0"/>
   <w15:commentEx w15:paraId="68CB36A9" w15:done="0"/>
-  <w15:commentEx w15:paraId="50120D7C" w15:done="0"/>
-  <w15:commentEx w15:paraId="5EEC8C99" w15:done="0"/>
+  <w15:commentEx w15:paraId="50120D7C" w15:done="1"/>
   <w15:commentEx w15:paraId="19892EE0" w15:done="0"/>
   <w15:commentEx w15:paraId="5501CF3B" w15:done="0"/>
   <w15:commentEx w15:paraId="5D37FF45" w15:done="0"/>
@@ -9619,7 +10052,6 @@
   <w16cex:commentExtensible w16cex:durableId="6DF04BDB" w16cex:dateUtc="2025-01-13T16:51:00Z"/>
   <w16cex:commentExtensible w16cex:durableId="787E58E8" w16cex:dateUtc="2024-12-09T17:03:00Z"/>
   <w16cex:commentExtensible w16cex:durableId="0AEE83D3" w16cex:dateUtc="2025-02-04T23:49:00Z"/>
-  <w16cex:commentExtensible w16cex:durableId="6A338624" w16cex:dateUtc="2025-01-28T20:32:00Z"/>
   <w16cex:commentExtensible w16cex:durableId="76A36B67" w16cex:dateUtc="2025-02-05T00:02:00Z"/>
   <w16cex:commentExtensible w16cex:durableId="1DA9A76F" w16cex:dateUtc="2025-01-29T14:35:00Z"/>
   <w16cex:commentExtensible w16cex:durableId="73EE58F5" w16cex:dateUtc="2025-01-09T15:23:00Z"/>
@@ -9670,7 +10102,6 @@
   <w16cid:commentId w16cid:paraId="27843223" w16cid:durableId="6DF04BDB"/>
   <w16cid:commentId w16cid:paraId="68CB36A9" w16cid:durableId="787E58E8"/>
   <w16cid:commentId w16cid:paraId="50120D7C" w16cid:durableId="0AEE83D3"/>
-  <w16cid:commentId w16cid:paraId="5EEC8C99" w16cid:durableId="6A338624"/>
   <w16cid:commentId w16cid:paraId="19892EE0" w16cid:durableId="76A36B67"/>
   <w16cid:commentId w16cid:paraId="5501CF3B" w16cid:durableId="1DA9A76F"/>
   <w16cid:commentId w16cid:paraId="5D37FF45" w16cid:durableId="73EE58F5"/>

</xml_diff>